<commit_message>
Replace EML prototype with basis-operator AI4R submission
</commit_message>
<xml_diff>
--- a/GOAI_四页提交稿_Math_Structurer.docx
+++ b/GOAI_四页提交稿_Math_Structurer.docx
@@ -9,25 +9,27 @@
       </w:pPr>
       <w:r>
         <w:rPr>
+          <w:rFonts w:ascii="Microsoft YaHei" w:hAnsi="Microsoft YaHei" w:eastAsia="Microsoft YaHei"/>
           <w:b/>
+          <w:color w:val="0D2538"/>
+          <w:sz w:val="33"/>
         </w:rPr>
         <w:t>Math Structurer</w:t>
       </w:r>
     </w:p>
     <w:p>
       <w:pPr>
+        <w:spacing w:after="40"/>
         <w:jc w:val="center"/>
       </w:pPr>
       <w:r>
         <w:rPr>
           <w:rFonts w:ascii="Microsoft YaHei" w:hAnsi="Microsoft YaHei" w:eastAsia="Microsoft YaHei"/>
-          <w:b w:val="0"/>
-          <w:color w:val="2E6F95"/>
-          <w:sz w:val="18"/>
+          <w:b/>
+          <w:color w:val="245F83"/>
+          <w:sz w:val="16"/>
         </w:rPr>
         <w:t>Convincing, reusable target-matching skills for AI research agents.</w:t>
-        <w:br/>
-        <w:t>数学滤镜 + 多空间插件路由；EML 域/分支为最小科学切片</w:t>
       </w:r>
     </w:p>
     <w:tbl>
@@ -39,24 +41,81 @@
         <w:tblLook w:firstColumn="1" w:firstRow="1" w:lastColumn="0" w:lastRow="0" w:noHBand="0" w:noVBand="1" w:val="04A0"/>
       </w:tblPr>
       <w:tblGrid>
-        <w:gridCol w:w="5188"/>
-        <w:gridCol w:w="5188"/>
+        <w:gridCol w:w="5244"/>
+        <w:gridCol w:w="5244"/>
       </w:tblGrid>
       <w:tr>
         <w:trPr>
-          <w:tblHeader w:val="true"/>
           <w:cantSplit/>
         </w:trPr>
         <w:tc>
           <w:tcPr>
-            <w:tcW w:type="dxa" w:w="1474"/>
-            <w:shd w:fill="17324D"/>
+            <w:tcW w:type="dxa" w:w="1531"/>
             <w:vAlign w:val="center"/>
             <w:tcMar>
-              <w:top w:w="45" w:type="dxa"/>
-              <w:start w:w="65" w:type="dxa"/>
-              <w:bottom w:w="45" w:type="dxa"/>
-              <w:end w:w="65" w:type="dxa"/>
+              <w:top w:w="32" w:type="dxa"/>
+              <w:start w:w="55" w:type="dxa"/>
+              <w:bottom w:w="32" w:type="dxa"/>
+              <w:end w:w="55" w:type="dxa"/>
+            </w:tcMar>
+            <w:shd w:fill="0D2538"/>
+          </w:tcPr>
+          <w:p>
+            <w:pPr>
+              <w:spacing w:after="0"/>
+            </w:pPr>
+            <w:r>
+              <w:rPr>
+                <w:rFonts w:ascii="Microsoft YaHei" w:hAnsi="Microsoft YaHei" w:eastAsia="Microsoft YaHei"/>
+                <w:b/>
+                <w:color w:val="FFFFFF"/>
+                <w:sz w:val="13"/>
+              </w:rPr>
+              <w:t>四页共用信息</w:t>
+            </w:r>
+          </w:p>
+        </w:tc>
+        <w:tc>
+          <w:tcPr>
+            <w:tcW w:type="dxa" w:w="8844"/>
+            <w:vAlign w:val="center"/>
+            <w:tcMar>
+              <w:top w:w="32" w:type="dxa"/>
+              <w:start w:w="55" w:type="dxa"/>
+              <w:bottom w:w="32" w:type="dxa"/>
+              <w:end w:w="55" w:type="dxa"/>
+            </w:tcMar>
+            <w:shd w:fill="0D2538"/>
+          </w:tcPr>
+          <w:p>
+            <w:pPr>
+              <w:spacing w:after="0"/>
+            </w:pPr>
+            <w:r>
+              <w:rPr>
+                <w:rFonts w:ascii="Microsoft YaHei" w:hAnsi="Microsoft YaHei" w:eastAsia="Microsoft YaHei"/>
+                <w:b/>
+                <w:color w:val="FFFFFF"/>
+                <w:sz w:val="13"/>
+              </w:rPr>
+              <w:t>冻结表述</w:t>
+            </w:r>
+          </w:p>
+        </w:tc>
+      </w:tr>
+      <w:tr>
+        <w:trPr>
+          <w:cantSplit/>
+        </w:trPr>
+        <w:tc>
+          <w:tcPr>
+            <w:tcW w:type="dxa" w:w="1531"/>
+            <w:vAlign w:val="center"/>
+            <w:tcMar>
+              <w:top w:w="32" w:type="dxa"/>
+              <w:start w:w="55" w:type="dxa"/>
+              <w:bottom w:w="32" w:type="dxa"/>
+              <w:end w:w="55" w:type="dxa"/>
             </w:tcMar>
           </w:tcPr>
           <w:p>
@@ -67,23 +126,108 @@
               <w:rPr>
                 <w:rFonts w:ascii="Microsoft YaHei" w:hAnsi="Microsoft YaHei" w:eastAsia="Microsoft YaHei"/>
                 <w:b/>
-                <w:color w:val="FFFFFF"/>
-                <w:sz w:val="14"/>
+                <w:sz w:val="13"/>
               </w:rPr>
-              <w:t>共用信息</w:t>
+              <w:t>一句话问题</w:t>
             </w:r>
           </w:p>
         </w:tc>
         <w:tc>
           <w:tcPr>
-            <w:tcW w:type="dxa" w:w="8447"/>
-            <w:shd w:fill="17324D"/>
+            <w:tcW w:type="dxa" w:w="8844"/>
             <w:vAlign w:val="center"/>
             <w:tcMar>
-              <w:top w:w="45" w:type="dxa"/>
-              <w:start w:w="65" w:type="dxa"/>
-              <w:bottom w:w="45" w:type="dxa"/>
-              <w:end w:w="65" w:type="dxa"/>
+              <w:top w:w="32" w:type="dxa"/>
+              <w:start w:w="55" w:type="dxa"/>
+              <w:bottom w:w="32" w:type="dxa"/>
+              <w:end w:w="55" w:type="dxa"/>
+            </w:tcMar>
+          </w:tcPr>
+          <w:p>
+            <w:pPr>
+              <w:spacing w:after="0"/>
+            </w:pPr>
+            <w:r>
+              <w:rPr>
+                <w:rFonts w:ascii="Microsoft YaHei" w:hAnsi="Microsoft YaHei" w:eastAsia="Microsoft YaHei"/>
+                <w:b w:val="0"/>
+                <w:sz w:val="13"/>
+              </w:rPr>
+              <w:t>科研代理能否把自然语言科研目标转换为带定义域、状态空间、约束、特定基算子和验证义务的机器问题，并依据失败反馈改变下一轮行动？</w:t>
+            </w:r>
+          </w:p>
+        </w:tc>
+      </w:tr>
+      <w:tr>
+        <w:trPr>
+          <w:cantSplit/>
+        </w:trPr>
+        <w:tc>
+          <w:tcPr>
+            <w:tcW w:type="dxa" w:w="1531"/>
+            <w:vAlign w:val="center"/>
+            <w:tcMar>
+              <w:top w:w="32" w:type="dxa"/>
+              <w:start w:w="55" w:type="dxa"/>
+              <w:bottom w:w="32" w:type="dxa"/>
+              <w:end w:w="55" w:type="dxa"/>
+            </w:tcMar>
+            <w:shd w:fill="F7F8F7"/>
+          </w:tcPr>
+          <w:p>
+            <w:pPr>
+              <w:spacing w:after="0"/>
+            </w:pPr>
+            <w:r>
+              <w:rPr>
+                <w:rFonts w:ascii="Microsoft YaHei" w:hAnsi="Microsoft YaHei" w:eastAsia="Microsoft YaHei"/>
+                <w:b/>
+                <w:sz w:val="13"/>
+              </w:rPr>
+              <w:t>研究边界</w:t>
+            </w:r>
+          </w:p>
+        </w:tc>
+        <w:tc>
+          <w:tcPr>
+            <w:tcW w:type="dxa" w:w="8844"/>
+            <w:vAlign w:val="center"/>
+            <w:tcMar>
+              <w:top w:w="32" w:type="dxa"/>
+              <w:start w:w="55" w:type="dxa"/>
+              <w:bottom w:w="32" w:type="dxa"/>
+              <w:end w:w="55" w:type="dxa"/>
+            </w:tcMar>
+            <w:shd w:fill="F7F8F7"/>
+          </w:tcPr>
+          <w:p>
+            <w:pPr>
+              <w:spacing w:after="0"/>
+            </w:pPr>
+            <w:r>
+              <w:rPr>
+                <w:rFonts w:ascii="Microsoft YaHei" w:hAnsi="Microsoft YaHei" w:eastAsia="Microsoft YaHei"/>
+                <w:b w:val="0"/>
+                <w:sz w:val="13"/>
+              </w:rPr>
+              <w:t>首版只运行 CO2gas+H2gas -- CH3CH2OHgas @best 与 B(u,v)=eᵘ−Log(v) 调试；不声称发现新催化剂、统一代数、自动 PDE 约化或任意半迭代证明。</w:t>
+            </w:r>
+          </w:p>
+        </w:tc>
+      </w:tr>
+      <w:tr>
+        <w:trPr>
+          <w:cantSplit/>
+        </w:trPr>
+        <w:tc>
+          <w:tcPr>
+            <w:tcW w:type="dxa" w:w="1531"/>
+            <w:vAlign w:val="center"/>
+            <w:tcMar>
+              <w:top w:w="32" w:type="dxa"/>
+              <w:start w:w="55" w:type="dxa"/>
+              <w:bottom w:w="32" w:type="dxa"/>
+              <w:end w:w="55" w:type="dxa"/>
             </w:tcMar>
           </w:tcPr>
           <w:p>
@@ -94,52 +238,21 @@
               <w:rPr>
                 <w:rFonts w:ascii="Microsoft YaHei" w:hAnsi="Microsoft YaHei" w:eastAsia="Microsoft YaHei"/>
                 <w:b/>
-                <w:color w:val="FFFFFF"/>
-                <w:sz w:val="14"/>
+                <w:sz w:val="13"/>
               </w:rPr>
-              <w:t>冻结内容</w:t>
-            </w:r>
-          </w:p>
-        </w:tc>
-      </w:tr>
-      <w:tr>
-        <w:trPr>
-          <w:cantSplit/>
-        </w:trPr>
-        <w:tc>
-          <w:tcPr>
-            <w:tcW w:type="dxa" w:w="1474"/>
-            <w:vAlign w:val="center"/>
-            <w:tcMar>
-              <w:top w:w="45" w:type="dxa"/>
-              <w:start w:w="65" w:type="dxa"/>
-              <w:bottom w:w="45" w:type="dxa"/>
-              <w:end w:w="65" w:type="dxa"/>
-            </w:tcMar>
-          </w:tcPr>
-          <w:p>
-            <w:pPr>
-              <w:spacing w:after="0"/>
-            </w:pPr>
-            <w:r>
-              <w:rPr>
-                <w:rFonts w:ascii="Microsoft YaHei" w:hAnsi="Microsoft YaHei" w:eastAsia="Microsoft YaHei"/>
-                <w:b/>
-                <w:sz w:val="14"/>
-              </w:rPr>
-              <w:t>一句话问题</w:t>
+              <w:t>当前成熟度</w:t>
             </w:r>
           </w:p>
         </w:tc>
         <w:tc>
           <w:tcPr>
-            <w:tcW w:type="dxa" w:w="8447"/>
+            <w:tcW w:type="dxa" w:w="8844"/>
             <w:vAlign w:val="center"/>
             <w:tcMar>
-              <w:top w:w="45" w:type="dxa"/>
-              <w:start w:w="65" w:type="dxa"/>
-              <w:bottom w:w="45" w:type="dxa"/>
-              <w:end w:w="65" w:type="dxa"/>
+              <w:top w:w="32" w:type="dxa"/>
+              <w:start w:w="55" w:type="dxa"/>
+              <w:bottom w:w="32" w:type="dxa"/>
+              <w:end w:w="55" w:type="dxa"/>
             </w:tcMar>
           </w:tcPr>
           <w:p>
@@ -150,121 +263,9 @@
               <w:rPr>
                 <w:rFonts w:ascii="Microsoft YaHei" w:hAnsi="Microsoft YaHei" w:eastAsia="Microsoft YaHei"/>
                 <w:b w:val="0"/>
-                <w:sz w:val="14"/>
+                <w:sz w:val="13"/>
               </w:rPr>
-              <w:t>Agent 能否把自然语言科研目标转换为类型、逻辑、约束、相连基空间与可否证子任务，并依据 oracle 反馈改变下一行动？</w:t>
-            </w:r>
-          </w:p>
-        </w:tc>
-      </w:tr>
-      <w:tr>
-        <w:trPr>
-          <w:cantSplit/>
-        </w:trPr>
-        <w:tc>
-          <w:tcPr>
-            <w:tcW w:type="dxa" w:w="1474"/>
-            <w:vAlign w:val="center"/>
-            <w:tcMar>
-              <w:top w:w="45" w:type="dxa"/>
-              <w:start w:w="65" w:type="dxa"/>
-              <w:bottom w:w="45" w:type="dxa"/>
-              <w:end w:w="65" w:type="dxa"/>
-            </w:tcMar>
-            <w:shd w:fill="F2F4F5"/>
-          </w:tcPr>
-          <w:p>
-            <w:pPr>
-              <w:spacing w:after="0"/>
-            </w:pPr>
-            <w:r>
-              <w:rPr>
-                <w:rFonts w:ascii="Microsoft YaHei" w:hAnsi="Microsoft YaHei" w:eastAsia="Microsoft YaHei"/>
-                <w:b/>
-                <w:sz w:val="14"/>
-              </w:rPr>
-              <w:t>研究边界</w:t>
-            </w:r>
-          </w:p>
-        </w:tc>
-        <w:tc>
-          <w:tcPr>
-            <w:tcW w:type="dxa" w:w="8447"/>
-            <w:vAlign w:val="center"/>
-            <w:tcMar>
-              <w:top w:w="45" w:type="dxa"/>
-              <w:start w:w="65" w:type="dxa"/>
-              <w:bottom w:w="45" w:type="dxa"/>
-              <w:end w:w="65" w:type="dxa"/>
-            </w:tcMar>
-            <w:shd w:fill="F2F4F5"/>
-          </w:tcPr>
-          <w:p>
-            <w:pPr>
-              <w:spacing w:after="0"/>
-            </w:pPr>
-            <w:r>
-              <w:rPr>
-                <w:rFonts w:ascii="Microsoft YaHei" w:hAnsi="Microsoft YaHei" w:eastAsia="Microsoft YaHei"/>
-                <w:b w:val="0"/>
-                <w:sz w:val="14"/>
-              </w:rPr>
-              <w:t>这是数学滤镜与插件路由，不是万能 EML 解析器；催化只压测接口，EML 域/分支才是已运行科学切片；KaTeX 与 2D/3D 均非证明。</w:t>
-            </w:r>
-          </w:p>
-        </w:tc>
-      </w:tr>
-      <w:tr>
-        <w:trPr>
-          <w:cantSplit/>
-        </w:trPr>
-        <w:tc>
-          <w:tcPr>
-            <w:tcW w:type="dxa" w:w="1474"/>
-            <w:vAlign w:val="center"/>
-            <w:tcMar>
-              <w:top w:w="45" w:type="dxa"/>
-              <w:start w:w="65" w:type="dxa"/>
-              <w:bottom w:w="45" w:type="dxa"/>
-              <w:end w:w="65" w:type="dxa"/>
-            </w:tcMar>
-          </w:tcPr>
-          <w:p>
-            <w:pPr>
-              <w:spacing w:after="0"/>
-            </w:pPr>
-            <w:r>
-              <w:rPr>
-                <w:rFonts w:ascii="Microsoft YaHei" w:hAnsi="Microsoft YaHei" w:eastAsia="Microsoft YaHei"/>
-                <w:b/>
-                <w:sz w:val="14"/>
-              </w:rPr>
-              <w:t>当前成熟度</w:t>
-            </w:r>
-          </w:p>
-        </w:tc>
-        <w:tc>
-          <w:tcPr>
-            <w:tcW w:type="dxa" w:w="8447"/>
-            <w:vAlign w:val="center"/>
-            <w:tcMar>
-              <w:top w:w="45" w:type="dxa"/>
-              <w:start w:w="65" w:type="dxa"/>
-              <w:bottom w:w="45" w:type="dxa"/>
-              <w:end w:w="65" w:type="dxa"/>
-            </w:tcMar>
-          </w:tcPr>
-          <w:p>
-            <w:pPr>
-              <w:spacing w:after="0"/>
-            </w:pPr>
-            <w:r>
-              <w:rPr>
-                <w:rFonts w:ascii="Microsoft YaHei" w:hAnsi="Microsoft YaHei" w:eastAsia="Microsoft YaHei"/>
-                <w:b w:val="0"/>
-                <w:sz w:val="14"/>
-              </w:rPr>
-              <w:t>E1/E2/E5 已确认；Demo 12 项、面板 11 项和 Chrome 验收通过；环境技术闸门通过、科学发现闸门未通过；Lean 为部分形式化。</w:t>
+              <w:t>交互原型 v0.5；配平、守恒、类型化路由、特定算子调试与固定 Lean 义务通过。科学发现闸门未通过。</w:t>
             </w:r>
           </w:p>
         </w:tc>
@@ -272,7 +273,7 @@
     </w:tbl>
     <w:p>
       <w:pPr>
-        <w:spacing w:after="0"/>
+        <w:spacing w:after="0" w:line="20" w:lineRule="exact"/>
       </w:pPr>
     </w:p>
     <w:p>
@@ -295,28 +296,155 @@
     </w:p>
     <w:p>
       <w:pPr>
-        <w:spacing w:after="36"/>
+        <w:spacing w:after="30"/>
       </w:pPr>
       <w:r>
         <w:rPr>
           <w:rFonts w:ascii="Microsoft YaHei" w:hAnsi="Microsoft YaHei" w:eastAsia="Microsoft YaHei"/>
           <w:b w:val="0"/>
-          <w:sz w:val="17"/>
+          <w:sz w:val="15"/>
         </w:rPr>
-        <w:t>Math Structurer 先把 qNL 写成类型、逻辑、约束、基空间、机器任务和 KaTeX 视图，再用带验证器的部分映射连接多个空间。催化输入先交 ReactionDecomposer：默认式被判不守恒，补为 2CO2+6H2→C2H5OH+3H2O，得到 ν∈kerZ(A)；因条件化测量缺失，@best 弃权。EML 未被调用，3D 独立交给 GeometryPlugin——这里只压测路由，不宣称催化发现。</w:t>
+        <w:t>化学实验与数学研究都可能表现为“固定对象与约束—由有限结构生成候选—以反馈修订”的过程；相似之处是工作流，而非统一代数。CO₂ 加氢制乙醇的候选必须携带组分邻近方式、温压、进料和测量口径。Wang 等组合 Na–Fe@C 与 K–CuZnAl；ACS Figshare 官方记录写明，原位表征与 DFT 计算提示催化界面、组件邻近方式及醛类中间体具有重要作用。这支持按条件组织候选，却不支持脱离条件的全局最佳排名（</w:t>
+      </w:r>
+      <w:hyperlink r:id="rId10" w:history="1">
+        <w:r>
+          <w:rPr>
+            <w:rFonts w:ascii="Microsoft YaHei" w:hAnsi="Microsoft YaHei" w:eastAsia="Microsoft YaHei"/>
+            <w:b w:val="0"/>
+            <w:color w:val="245F83"/>
+            <w:sz w:val="15"/>
+            <w:u w:val="single"/>
+          </w:rPr>
+        </w:r>
+      </w:hyperlink>
+      <w:r>
+        <w:rPr>
+          <w:rFonts w:ascii="Microsoft YaHei" w:hAnsi="Microsoft YaHei" w:eastAsia="Microsoft YaHei"/>
+          <w:b w:val="0"/>
+          <w:sz w:val="15"/>
+        </w:rPr>
+        <w:t>）。</w:t>
       </w:r>
     </w:p>
     <w:p>
       <w:pPr>
-        <w:spacing w:after="36"/>
+        <w:spacing w:after="30"/>
       </w:pPr>
       <w:r>
         <w:rPr>
           <w:rFonts w:ascii="Microsoft YaHei" w:hAnsi="Microsoft YaHei" w:eastAsia="Microsoft YaHei"/>
           <w:b w:val="0"/>
-          <w:sz w:val="16"/>
+          <w:sz w:val="15"/>
         </w:rPr>
-        <w:t>当前唯一科学校准切片是 EML 的 eml(x,y)=exp(x)−log(y) 树。原论文记录零点、域端点和复对数主分支困难（E1）；Demo 在 x=−1 得到编译值约 −πi、参考值 +πi、误差 2π，x=0 未定义（P1）。这是已知复现，不是新定理。</w:t>
+        <w:t>半迭代是在指定 X 上寻找 g:X→X 使 g∘g=f。Kozyra 给出有限自映射的函数图判据；Murugan 与 Palanivel 仅在非单调性高度为 1 的连续非分段单调函数类中获得存在性结果，并另行研究 Hyers–Ulam 稳定性；二者均不能外推到任意光滑函数（</w:t>
+      </w:r>
+      <w:hyperlink r:id="rId11" w:history="1">
+        <w:r>
+          <w:rPr>
+            <w:rFonts w:ascii="Microsoft YaHei" w:hAnsi="Microsoft YaHei" w:eastAsia="Microsoft YaHei"/>
+            <w:b w:val="0"/>
+            <w:color w:val="245F83"/>
+            <w:sz w:val="15"/>
+            <w:u w:val="single"/>
+          </w:rPr>
+        </w:r>
+      </w:hyperlink>
+      <w:r>
+        <w:rPr>
+          <w:rFonts w:ascii="Microsoft YaHei" w:hAnsi="Microsoft YaHei" w:eastAsia="Microsoft YaHei"/>
+          <w:b w:val="0"/>
+          <w:sz w:val="15"/>
+        </w:rPr>
+        <w:t>；</w:t>
+      </w:r>
+      <w:hyperlink r:id="rId12" w:history="1">
+        <w:r>
+          <w:rPr>
+            <w:rFonts w:ascii="Microsoft YaHei" w:hAnsi="Microsoft YaHei" w:eastAsia="Microsoft YaHei"/>
+            <w:b w:val="0"/>
+            <w:color w:val="245F83"/>
+            <w:sz w:val="15"/>
+            <w:u w:val="single"/>
+          </w:rPr>
+        </w:r>
+      </w:hyperlink>
+      <w:r>
+        <w:rPr>
+          <w:rFonts w:ascii="Microsoft YaHei" w:hAnsi="Microsoft YaHei" w:eastAsia="Microsoft YaHei"/>
+          <w:b w:val="0"/>
+          <w:sz w:val="15"/>
+        </w:rPr>
+        <w:t>）。Güngör 综述说明 PDE 对称可减少独立变量、ODE 对称可降低阶数；所引两项代表工作分别将李对称用于数据增强和自监督表征，但不解决通用生成元、边界兼容或精确约化（</w:t>
+      </w:r>
+      <w:hyperlink r:id="rId13" w:history="1">
+        <w:r>
+          <w:rPr>
+            <w:rFonts w:ascii="Microsoft YaHei" w:hAnsi="Microsoft YaHei" w:eastAsia="Microsoft YaHei"/>
+            <w:b w:val="0"/>
+            <w:color w:val="245F83"/>
+            <w:sz w:val="15"/>
+            <w:u w:val="single"/>
+          </w:rPr>
+        </w:r>
+      </w:hyperlink>
+      <w:r>
+        <w:rPr>
+          <w:rFonts w:ascii="Microsoft YaHei" w:hAnsi="Microsoft YaHei" w:eastAsia="Microsoft YaHei"/>
+          <w:b w:val="0"/>
+          <w:sz w:val="15"/>
+        </w:rPr>
+        <w:t>；</w:t>
+      </w:r>
+      <w:hyperlink r:id="rId14" w:history="1">
+        <w:r>
+          <w:rPr>
+            <w:rFonts w:ascii="Microsoft YaHei" w:hAnsi="Microsoft YaHei" w:eastAsia="Microsoft YaHei"/>
+            <w:b w:val="0"/>
+            <w:color w:val="245F83"/>
+            <w:sz w:val="15"/>
+            <w:u w:val="single"/>
+          </w:rPr>
+        </w:r>
+      </w:hyperlink>
+      <w:r>
+        <w:rPr>
+          <w:rFonts w:ascii="Microsoft YaHei" w:hAnsi="Microsoft YaHei" w:eastAsia="Microsoft YaHei"/>
+          <w:b w:val="0"/>
+          <w:sz w:val="15"/>
+        </w:rPr>
+        <w:t>；</w:t>
+      </w:r>
+      <w:hyperlink r:id="rId15" w:history="1">
+        <w:r>
+          <w:rPr>
+            <w:rFonts w:ascii="Microsoft YaHei" w:hAnsi="Microsoft YaHei" w:eastAsia="Microsoft YaHei"/>
+            <w:b w:val="0"/>
+            <w:color w:val="245F83"/>
+            <w:sz w:val="15"/>
+            <w:u w:val="single"/>
+          </w:rPr>
+        </w:r>
+      </w:hyperlink>
+      <w:r>
+        <w:rPr>
+          <w:rFonts w:ascii="Microsoft YaHei" w:hAnsi="Microsoft YaHei" w:eastAsia="Microsoft YaHei"/>
+          <w:b w:val="0"/>
+          <w:sz w:val="15"/>
+        </w:rPr>
+        <w:t>）。</w:t>
+      </w:r>
+    </w:p>
+    <w:p>
+      <w:pPr>
+        <w:spacing w:after="30"/>
+      </w:pPr>
+      <w:r>
+        <w:rPr>
+          <w:rFonts w:ascii="Microsoft YaHei" w:hAnsi="Microsoft YaHei" w:eastAsia="Microsoft YaHei"/>
+          <w:b w:val="0"/>
+          <w:sz w:val="15"/>
+        </w:rPr>
+        <w:t>本地数论族 fₖ(n)=kP⁺(n)+(P⁺(n) mod k) 可生成轨道并检查素性、最大质因子、同余与闭合；旧 Lean 原型把本应参数化的模数固化为 10，最终命题仍以 sorry 占位，说明生成必须与定义检查和否证器绑定。这些场景都由有限结构生成候选，但缺少经验证的 AI 工具接口；该缺口仍是待检验假设。</w:t>
       </w:r>
     </w:p>
     <w:p>
@@ -330,15 +458,34 @@
     </w:p>
     <w:p>
       <w:pPr>
-        <w:spacing w:after="36"/>
+        <w:spacing w:after="30"/>
       </w:pPr>
       <w:r>
         <w:rPr>
           <w:rFonts w:ascii="Microsoft YaHei" w:hAnsi="Microsoft YaHei" w:eastAsia="Microsoft YaHei"/>
           <w:b w:val="0"/>
-          <w:sz w:val="17"/>
+          <w:sz w:val="15"/>
         </w:rPr>
-        <w:t>Content MathML 已能表示 domain、condition 与 compose（E2），类型系统、化学配平和几何工具也各自成熟；所以“统一表示”或“写一个 parser”不是创新。尚未结构化的是可审计循环：哪种目标先进入哪个专业插件，何时必须弃权，以及反例如何改变下一空间、基、oracle 或问题边界。系统性新颖性检索仍未完成。</w:t>
+        <w:t>困难不在万能展开公式，而在不同算子的定义域、陪域和验证义务。首版只统一带类型接口 bᵢ:Xᵢ⇀Xⱼ、zₜ₊₁=bᵢₜ(zₜ)：配平属于整数核 kerℤ(A)，构型属于 R³ⁿ/SE(3)，半迭代属于自映射空间，PDE 约化还需延拓、边界与不变量。Deng、Hani 与 Ma 的硬球—Boltzmann 长时推导用时间分层、累积量、部分展开、分子图和切割算法控制误差（</w:t>
+      </w:r>
+      <w:hyperlink r:id="rId16" w:history="1">
+        <w:r>
+          <w:rPr>
+            <w:rFonts w:ascii="Microsoft YaHei" w:hAnsi="Microsoft YaHei" w:eastAsia="Microsoft YaHei"/>
+            <w:b w:val="0"/>
+            <w:color w:val="245F83"/>
+            <w:sz w:val="15"/>
+            <w:u w:val="single"/>
+          </w:rPr>
+        </w:r>
+      </w:hyperlink>
+      <w:r>
+        <w:rPr>
+          <w:rFonts w:ascii="Microsoft YaHei" w:hAnsi="Microsoft YaHei" w:eastAsia="Microsoft YaHei"/>
+          <w:b w:val="0"/>
+          <w:sz w:val="15"/>
+        </w:rPr>
+        <w:t>，pp. 9–12）。这说明专业参数、结构表示和误差口径必须一起嵌入，公式与三维投影才可复核；该预印本仅作复杂度例证，不证明本工具能完成 PDE 约化、分子模拟或通用函数生成。</w:t>
       </w:r>
     </w:p>
     <w:p>
@@ -352,26 +499,41 @@
     </w:p>
     <w:p>
       <w:pPr>
-        <w:spacing w:after="36"/>
+        <w:spacing w:after="30"/>
       </w:pPr>
       <w:r>
         <w:rPr>
           <w:rFonts w:ascii="Microsoft YaHei" w:hAnsi="Microsoft YaHei" w:eastAsia="Microsoft YaHei"/>
           <w:b w:val="0"/>
-          <w:sz w:val="17"/>
+          <w:sz w:val="15"/>
         </w:rPr>
-        <w:t>AI 的价值是把模糊目标降到可检查的机器问题，并依据守恒失败、欠定目标、反例或 unknown 改变下一行动。四小时只以催化例检查多空间路由，以 E1 的 ln 树校准反例循环，并由 E5 支撑材料可得；只有在封存的新 EML 树上找到稳定新失败族，才算科学发现。</w:t>
+        <w:t>默认查询先被判为不守恒，再补成下式。由于 θ、候选域和观测表未冻结，arg max J(c;θ) 不可审计；系统只返回未排名文献候选、缺失参数、相连空间和示意构型。这一问题修正而非材料名称，构成首版可检查的负结果。</w:t>
       </w:r>
     </w:p>
     <w:p>
       <w:pPr>
-        <w:spacing w:after="24"/>
+        <w:spacing w:before="16" w:after="28"/>
+        <w:jc w:val="center"/>
+      </w:pPr>
+      <w:r>
+        <w:rPr>
+          <w:rFonts w:ascii="Cambria Math" w:hAnsi="Cambria Math" w:eastAsia="Cambria Math"/>
+          <w:b w:val="0"/>
+          <w:color w:val="0D2538"/>
+          <w:sz w:val="18"/>
+        </w:rPr>
+        <w:t>2CO₂(g)+6H₂(g) → C₂H₅OH(g)+3H₂O(g),   ν=(−2,−6,1,3),   Aν=0</w:t>
+      </w:r>
+    </w:p>
+    <w:p>
+      <w:pPr>
+        <w:spacing w:before="14" w:after="20"/>
         <w:jc w:val="center"/>
       </w:pPr>
       <w:r>
         <w:drawing>
           <wp:inline xmlns:a="http://schemas.openxmlformats.org/drawingml/2006/main" xmlns:pic="http://schemas.openxmlformats.org/drawingml/2006/picture">
-            <wp:extent cx="6120000" cy="2207942"/>
+            <wp:extent cx="6336000" cy="2618819"/>
             <wp:docPr id="1" name="Picture 1"/>
             <wp:cNvGraphicFramePr>
               <a:graphicFrameLocks noChangeAspect="1"/>
@@ -380,11 +542,11 @@
               <a:graphicData uri="http://schemas.openxmlformats.org/drawingml/2006/picture">
                 <pic:pic>
                   <pic:nvPicPr>
-                    <pic:cNvPr id="0" name="page1_branch_mismatch.png"/>
+                    <pic:cNvPr id="0" name="page1_demo_slice.png"/>
                     <pic:cNvPicPr/>
                   </pic:nvPicPr>
                   <pic:blipFill>
-                    <a:blip r:embed="rId10"/>
+                    <a:blip r:embed="rId17"/>
                     <a:stretch>
                       <a:fillRect/>
                     </a:stretch>
@@ -392,7 +554,7 @@
                   <pic:spPr>
                     <a:xfrm>
                       <a:off x="0" y="0"/>
-                      <a:ext cx="6120000" cy="2207942"/>
+                      <a:ext cx="6336000" cy="2618819"/>
                     </a:xfrm>
                     <a:prstGeom prst="rect"/>
                   </pic:spPr>
@@ -403,235 +565,233 @@
         </w:drawing>
       </w:r>
     </w:p>
-    <w:tbl>
-      <w:tblPr>
-        <w:tblStyle w:val="TableGrid"/>
-        <w:tblW w:type="auto" w:w="0"/>
-        <w:jc w:val="center"/>
-        <w:tblLayout w:type="fixed"/>
-        <w:tblLook w:firstColumn="1" w:firstRow="1" w:lastColumn="0" w:lastRow="0" w:noHBand="0" w:noVBand="1" w:val="04A0"/>
-      </w:tblPr>
-      <w:tblGrid>
-        <w:gridCol w:w="2594"/>
-        <w:gridCol w:w="2594"/>
-        <w:gridCol w:w="2594"/>
-        <w:gridCol w:w="2594"/>
-      </w:tblGrid>
-      <w:tr>
-        <w:trPr>
-          <w:cantSplit/>
-        </w:trPr>
-        <w:tc>
-          <w:tcPr>
-            <w:tcW w:type="dxa" w:w="1020"/>
-            <w:tcMar>
-              <w:top w:w="30" w:type="dxa"/>
-              <w:start w:w="65" w:type="dxa"/>
-              <w:bottom w:w="30" w:type="dxa"/>
-              <w:end w:w="65" w:type="dxa"/>
-            </w:tcMar>
-            <w:shd w:fill="EAF2F5"/>
-          </w:tcPr>
-          <w:p>
-            <w:pPr>
-              <w:spacing w:after="0"/>
-            </w:pPr>
-            <w:r>
-              <w:rPr>
-                <w:rFonts w:ascii="Microsoft YaHei" w:hAnsi="Microsoft YaHei" w:eastAsia="Microsoft YaHei"/>
-                <w:b/>
-                <w:color w:val="17324D"/>
-                <w:sz w:val="13"/>
-              </w:rPr>
-              <w:t>证据编号</w:t>
-            </w:r>
-          </w:p>
-        </w:tc>
-        <w:tc>
-          <w:tcPr>
-            <w:tcW w:type="dxa" w:w="3798"/>
-            <w:tcMar>
-              <w:top w:w="30" w:type="dxa"/>
-              <w:start w:w="65" w:type="dxa"/>
-              <w:bottom w:w="30" w:type="dxa"/>
-              <w:end w:w="65" w:type="dxa"/>
-            </w:tcMar>
-          </w:tcPr>
-          <w:p>
-            <w:pPr>
-              <w:spacing w:after="0"/>
-            </w:pPr>
-            <w:r>
-              <w:rPr>
-                <w:rFonts w:ascii="Microsoft YaHei" w:hAnsi="Microsoft YaHei" w:eastAsia="Microsoft YaHei"/>
-                <w:b w:val="0"/>
-                <w:color w:val="66727D"/>
-                <w:sz w:val="13"/>
-              </w:rPr>
-              <w:t>E1、E2、E5；P1、T1、B1</w:t>
-            </w:r>
-          </w:p>
-        </w:tc>
-        <w:tc>
-          <w:tcPr>
-            <w:tcW w:type="dxa" w:w="1020"/>
-            <w:tcMar>
-              <w:top w:w="30" w:type="dxa"/>
-              <w:start w:w="65" w:type="dxa"/>
-              <w:bottom w:w="30" w:type="dxa"/>
-              <w:end w:w="65" w:type="dxa"/>
-            </w:tcMar>
-            <w:shd w:fill="EAF2F5"/>
-          </w:tcPr>
-          <w:p>
-            <w:pPr>
-              <w:spacing w:after="0"/>
-            </w:pPr>
-            <w:r>
-              <w:rPr>
-                <w:rFonts w:ascii="Microsoft YaHei" w:hAnsi="Microsoft YaHei" w:eastAsia="Microsoft YaHei"/>
-                <w:b/>
-                <w:color w:val="17324D"/>
-                <w:sz w:val="13"/>
-              </w:rPr>
-              <w:t>建议视觉</w:t>
-            </w:r>
-          </w:p>
-        </w:tc>
-        <w:tc>
-          <w:tcPr>
-            <w:tcW w:type="dxa" w:w="3798"/>
-            <w:tcMar>
-              <w:top w:w="30" w:type="dxa"/>
-              <w:start w:w="65" w:type="dxa"/>
-              <w:bottom w:w="30" w:type="dxa"/>
-              <w:end w:w="65" w:type="dxa"/>
-            </w:tcMar>
-          </w:tcPr>
-          <w:p>
-            <w:pPr>
-              <w:spacing w:after="0"/>
-            </w:pPr>
-            <w:r>
-              <w:rPr>
-                <w:rFonts w:ascii="Microsoft YaHei" w:hAnsi="Microsoft YaHei" w:eastAsia="Microsoft YaHei"/>
-                <w:b w:val="0"/>
-                <w:color w:val="66727D"/>
-                <w:sz w:val="13"/>
-              </w:rPr>
-              <w:t>分支虚部图（标“已知复现”）</w:t>
-            </w:r>
-          </w:p>
-        </w:tc>
-      </w:tr>
-      <w:tr>
-        <w:trPr>
-          <w:cantSplit/>
-        </w:trPr>
-        <w:tc>
-          <w:tcPr>
-            <w:tcW w:type="dxa" w:w="1020"/>
-            <w:tcMar>
-              <w:top w:w="30" w:type="dxa"/>
-              <w:start w:w="65" w:type="dxa"/>
-              <w:bottom w:w="30" w:type="dxa"/>
-              <w:end w:w="65" w:type="dxa"/>
-            </w:tcMar>
-            <w:shd w:fill="EAF2F5"/>
-          </w:tcPr>
-          <w:p>
-            <w:pPr>
-              <w:spacing w:after="0"/>
-            </w:pPr>
-            <w:r>
-              <w:rPr>
-                <w:rFonts w:ascii="Microsoft YaHei" w:hAnsi="Microsoft YaHei" w:eastAsia="Microsoft YaHei"/>
-                <w:b/>
-                <w:color w:val="17324D"/>
-                <w:sz w:val="13"/>
-              </w:rPr>
-              <w:t>人工确认</w:t>
-            </w:r>
-          </w:p>
-        </w:tc>
-        <w:tc>
-          <w:tcPr>
-            <w:tcW w:type="dxa" w:w="3798"/>
-            <w:tcMar>
-              <w:top w:w="30" w:type="dxa"/>
-              <w:start w:w="65" w:type="dxa"/>
-              <w:bottom w:w="30" w:type="dxa"/>
-              <w:end w:w="65" w:type="dxa"/>
-            </w:tcMar>
-          </w:tcPr>
-          <w:p>
-            <w:pPr>
-              <w:spacing w:after="0"/>
-            </w:pPr>
-            <w:r>
-              <w:rPr>
-                <w:rFonts w:ascii="Microsoft YaHei" w:hAnsi="Microsoft YaHei" w:eastAsia="Microsoft YaHei"/>
-                <w:b w:val="0"/>
-                <w:color w:val="66727D"/>
-                <w:sz w:val="13"/>
-              </w:rPr>
-              <w:t>催化仅接口压测；不得把 x=−1 写成新发现。</w:t>
-            </w:r>
-          </w:p>
-        </w:tc>
-        <w:tc>
-          <w:tcPr>
-            <w:tcW w:type="dxa" w:w="1020"/>
-            <w:tcMar>
-              <w:top w:w="30" w:type="dxa"/>
-              <w:start w:w="65" w:type="dxa"/>
-              <w:bottom w:w="30" w:type="dxa"/>
-              <w:end w:w="65" w:type="dxa"/>
-            </w:tcMar>
-            <w:shd w:fill="EAF2F5"/>
-          </w:tcPr>
-          <w:p>
-            <w:pPr>
-              <w:spacing w:after="0"/>
-            </w:pPr>
-            <w:r>
-              <w:rPr>
-                <w:rFonts w:ascii="Microsoft YaHei" w:hAnsi="Microsoft YaHei" w:eastAsia="Microsoft YaHei"/>
-                <w:b/>
-                <w:color w:val="17324D"/>
-                <w:sz w:val="13"/>
-              </w:rPr>
-              <w:t>内容预算</w:t>
-            </w:r>
-          </w:p>
-        </w:tc>
-        <w:tc>
-          <w:tcPr>
-            <w:tcW w:type="dxa" w:w="3798"/>
-            <w:tcMar>
-              <w:top w:w="30" w:type="dxa"/>
-              <w:start w:w="65" w:type="dxa"/>
-              <w:bottom w:w="30" w:type="dxa"/>
-              <w:end w:w="65" w:type="dxa"/>
-            </w:tcMar>
-          </w:tcPr>
-          <w:p>
-            <w:pPr>
-              <w:spacing w:after="0"/>
-            </w:pPr>
-            <w:r>
-              <w:rPr>
-                <w:rFonts w:ascii="Microsoft YaHei" w:hAnsi="Microsoft YaHei" w:eastAsia="Microsoft YaHei"/>
-                <w:b w:val="0"/>
-                <w:color w:val="66727D"/>
-                <w:sz w:val="13"/>
-              </w:rPr>
-              <w:t>750–850 汉字；1 图</w:t>
-            </w:r>
-          </w:p>
-        </w:tc>
-      </w:tr>
-    </w:tbl>
+    <w:p>
+      <w:pPr>
+        <w:spacing w:before="10" w:after="0"/>
+        <w:ind w:left="85" w:right="85"/>
+      </w:pPr>
+      <w:r>
+        <w:rPr>
+          <w:rFonts w:ascii="Microsoft YaHei" w:hAnsi="Microsoft YaHei" w:eastAsia="Microsoft YaHei"/>
+          <w:b/>
+          <w:color w:val="245F83"/>
+          <w:sz w:val="12"/>
+        </w:rPr>
+        <w:t>页面字段：</w:t>
+      </w:r>
+      <w:r>
+        <w:rPr>
+          <w:rFonts w:ascii="Microsoft YaHei" w:hAnsi="Microsoft YaHei" w:eastAsia="Microsoft YaHei"/>
+          <w:b w:val="0"/>
+          <w:color w:val="66727D"/>
+          <w:sz w:val="12"/>
+        </w:rPr>
+        <w:t>原始目标、配平、Aν、θ、Cθ、目标完备性、拒绝原因。</w:t>
+      </w:r>
+      <w:r>
+        <w:rPr>
+          <w:rFonts w:ascii="Microsoft YaHei" w:hAnsi="Microsoft YaHei" w:eastAsia="Microsoft YaHei"/>
+          <w:b/>
+          <w:color w:val="245F83"/>
+          <w:sz w:val="12"/>
+        </w:rPr>
+        <w:t xml:space="preserve">  文献依据：</w:t>
+      </w:r>
+      <w:hyperlink r:id="rId10" w:history="1">
+        <w:r>
+          <w:rPr>
+            <w:rFonts w:ascii="Microsoft YaHei" w:hAnsi="Microsoft YaHei" w:eastAsia="Microsoft YaHei"/>
+            <w:b w:val="0"/>
+            <w:color w:val="245F83"/>
+            <w:sz w:val="12"/>
+            <w:u w:val="single"/>
+          </w:rPr>
+        </w:r>
+      </w:hyperlink>
+      <w:r>
+        <w:rPr>
+          <w:rFonts w:ascii="Microsoft YaHei" w:hAnsi="Microsoft YaHei" w:eastAsia="Microsoft YaHei"/>
+          <w:b w:val="0"/>
+          <w:color w:val="66727D"/>
+          <w:sz w:val="12"/>
+        </w:rPr>
+        <w:t>；</w:t>
+      </w:r>
+      <w:hyperlink r:id="rId11" w:history="1">
+        <w:r>
+          <w:rPr>
+            <w:rFonts w:ascii="Microsoft YaHei" w:hAnsi="Microsoft YaHei" w:eastAsia="Microsoft YaHei"/>
+            <w:b w:val="0"/>
+            <w:color w:val="245F83"/>
+            <w:sz w:val="12"/>
+            <w:u w:val="single"/>
+          </w:rPr>
+        </w:r>
+      </w:hyperlink>
+      <w:r>
+        <w:rPr>
+          <w:rFonts w:ascii="Microsoft YaHei" w:hAnsi="Microsoft YaHei" w:eastAsia="Microsoft YaHei"/>
+          <w:b w:val="0"/>
+          <w:color w:val="66727D"/>
+          <w:sz w:val="12"/>
+        </w:rPr>
+        <w:t>；</w:t>
+      </w:r>
+      <w:hyperlink r:id="rId12" w:history="1">
+        <w:r>
+          <w:rPr>
+            <w:rFonts w:ascii="Microsoft YaHei" w:hAnsi="Microsoft YaHei" w:eastAsia="Microsoft YaHei"/>
+            <w:b w:val="0"/>
+            <w:color w:val="245F83"/>
+            <w:sz w:val="12"/>
+            <w:u w:val="single"/>
+          </w:rPr>
+        </w:r>
+      </w:hyperlink>
+      <w:r>
+        <w:rPr>
+          <w:rFonts w:ascii="Microsoft YaHei" w:hAnsi="Microsoft YaHei" w:eastAsia="Microsoft YaHei"/>
+          <w:b w:val="0"/>
+          <w:color w:val="66727D"/>
+          <w:sz w:val="12"/>
+        </w:rPr>
+        <w:t>；</w:t>
+      </w:r>
+      <w:hyperlink r:id="rId13" w:history="1">
+        <w:r>
+          <w:rPr>
+            <w:rFonts w:ascii="Microsoft YaHei" w:hAnsi="Microsoft YaHei" w:eastAsia="Microsoft YaHei"/>
+            <w:b w:val="0"/>
+            <w:color w:val="245F83"/>
+            <w:sz w:val="12"/>
+            <w:u w:val="single"/>
+          </w:rPr>
+        </w:r>
+      </w:hyperlink>
+      <w:r>
+        <w:rPr>
+          <w:rFonts w:ascii="Microsoft YaHei" w:hAnsi="Microsoft YaHei" w:eastAsia="Microsoft YaHei"/>
+          <w:b w:val="0"/>
+          <w:color w:val="66727D"/>
+          <w:sz w:val="12"/>
+        </w:rPr>
+        <w:t>；</w:t>
+      </w:r>
+      <w:hyperlink r:id="rId14" w:history="1">
+        <w:r>
+          <w:rPr>
+            <w:rFonts w:ascii="Microsoft YaHei" w:hAnsi="Microsoft YaHei" w:eastAsia="Microsoft YaHei"/>
+            <w:b w:val="0"/>
+            <w:color w:val="245F83"/>
+            <w:sz w:val="12"/>
+            <w:u w:val="single"/>
+          </w:rPr>
+        </w:r>
+      </w:hyperlink>
+      <w:r>
+        <w:rPr>
+          <w:rFonts w:ascii="Microsoft YaHei" w:hAnsi="Microsoft YaHei" w:eastAsia="Microsoft YaHei"/>
+          <w:b w:val="0"/>
+          <w:color w:val="66727D"/>
+          <w:sz w:val="12"/>
+        </w:rPr>
+        <w:t>；</w:t>
+      </w:r>
+      <w:hyperlink r:id="rId15" w:history="1">
+        <w:r>
+          <w:rPr>
+            <w:rFonts w:ascii="Microsoft YaHei" w:hAnsi="Microsoft YaHei" w:eastAsia="Microsoft YaHei"/>
+            <w:b w:val="0"/>
+            <w:color w:val="245F83"/>
+            <w:sz w:val="12"/>
+            <w:u w:val="single"/>
+          </w:rPr>
+        </w:r>
+      </w:hyperlink>
+      <w:r>
+        <w:rPr>
+          <w:rFonts w:ascii="Microsoft YaHei" w:hAnsi="Microsoft YaHei" w:eastAsia="Microsoft YaHei"/>
+          <w:b w:val="0"/>
+          <w:color w:val="66727D"/>
+          <w:sz w:val="12"/>
+        </w:rPr>
+        <w:t>；</w:t>
+      </w:r>
+      <w:hyperlink r:id="rId16" w:history="1">
+        <w:r>
+          <w:rPr>
+            <w:rFonts w:ascii="Microsoft YaHei" w:hAnsi="Microsoft YaHei" w:eastAsia="Microsoft YaHei"/>
+            <w:b w:val="0"/>
+            <w:color w:val="245F83"/>
+            <w:sz w:val="12"/>
+            <w:u w:val="single"/>
+          </w:rPr>
+        </w:r>
+      </w:hyperlink>
+      <w:r>
+        <w:rPr>
+          <w:rFonts w:ascii="Microsoft YaHei" w:hAnsi="Microsoft YaHei" w:eastAsia="Microsoft YaHei"/>
+          <w:b w:val="0"/>
+          <w:color w:val="66727D"/>
+          <w:sz w:val="12"/>
+        </w:rPr>
+        <w:t>。</w:t>
+      </w:r>
+      <w:r>
+        <w:rPr>
+          <w:rFonts w:ascii="Microsoft YaHei" w:hAnsi="Microsoft YaHei" w:eastAsia="Microsoft YaHei"/>
+          <w:b/>
+          <w:color w:val="245F83"/>
+          <w:sz w:val="12"/>
+        </w:rPr>
+        <w:t xml:space="preserve">  建议视觉：</w:t>
+      </w:r>
+      <w:r>
+        <w:rPr>
+          <w:rFonts w:ascii="Microsoft YaHei" w:hAnsi="Microsoft YaHei" w:eastAsia="Microsoft YaHei"/>
+          <w:b w:val="0"/>
+          <w:color w:val="66727D"/>
+          <w:sz w:val="12"/>
+        </w:rPr>
+        <w:t>演示截图：守恒、欠定目标与相连空间。</w:t>
+      </w:r>
+      <w:r>
+        <w:rPr>
+          <w:rFonts w:ascii="Microsoft YaHei" w:hAnsi="Microsoft YaHei" w:eastAsia="Microsoft YaHei"/>
+          <w:b/>
+          <w:color w:val="245F83"/>
+          <w:sz w:val="12"/>
+        </w:rPr>
+        <w:t xml:space="preserve">  人工确认：</w:t>
+      </w:r>
+      <w:r>
+        <w:rPr>
+          <w:rFonts w:ascii="Microsoft YaHei" w:hAnsi="Microsoft YaHei" w:eastAsia="Microsoft YaHei"/>
+          <w:b w:val="0"/>
+          <w:color w:val="66727D"/>
+          <w:sz w:val="12"/>
+        </w:rPr>
+        <w:t>候选未写成最优；构型标为示意；共享接口缺口仍是待检验假设。</w:t>
+      </w:r>
+      <w:r>
+        <w:rPr>
+          <w:rFonts w:ascii="Microsoft YaHei" w:hAnsi="Microsoft YaHei" w:eastAsia="Microsoft YaHei"/>
+          <w:b/>
+          <w:color w:val="245F83"/>
+          <w:sz w:val="12"/>
+        </w:rPr>
+        <w:t xml:space="preserve">  内容预算：</w:t>
+      </w:r>
+      <w:r>
+        <w:rPr>
+          <w:rFonts w:ascii="Microsoft YaHei" w:hAnsi="Microsoft YaHei" w:eastAsia="Microsoft YaHei"/>
+          <w:b w:val="0"/>
+          <w:color w:val="66727D"/>
+          <w:sz w:val="12"/>
+        </w:rPr>
+        <w:t>约 900 字＋1 图。</w:t>
+      </w:r>
+    </w:p>
     <w:p>
       <w:r>
         <w:br w:type="page"/>
@@ -655,362 +815,65 @@
         <w:t>2.1 固定规则</w:t>
       </w:r>
     </w:p>
-    <w:tbl>
-      <w:tblPr>
-        <w:tblStyle w:val="TableGrid"/>
-        <w:tblW w:type="auto" w:w="0"/>
-        <w:jc w:val="center"/>
-        <w:tblLayout w:type="fixed"/>
-        <w:tblLook w:firstColumn="1" w:firstRow="1" w:lastColumn="0" w:lastRow="0" w:noHBand="0" w:noVBand="1" w:val="04A0"/>
-      </w:tblPr>
-      <w:tblGrid>
-        <w:gridCol w:w="5188"/>
-        <w:gridCol w:w="5188"/>
-      </w:tblGrid>
-      <w:tr>
-        <w:trPr>
-          <w:tblHeader w:val="true"/>
-          <w:cantSplit/>
-        </w:trPr>
-        <w:tc>
-          <w:tcPr>
-            <w:tcW w:type="dxa" w:w="1757"/>
-            <w:shd w:fill="17324D"/>
-            <w:vAlign w:val="center"/>
-            <w:tcMar>
-              <w:top w:w="45" w:type="dxa"/>
-              <w:start w:w="65" w:type="dxa"/>
-              <w:bottom w:w="45" w:type="dxa"/>
-              <w:end w:w="65" w:type="dxa"/>
-            </w:tcMar>
-          </w:tcPr>
-          <w:p>
-            <w:pPr>
-              <w:spacing w:after="0"/>
-            </w:pPr>
-            <w:r>
-              <w:rPr>
-                <w:rFonts w:ascii="Microsoft YaHei" w:hAnsi="Microsoft YaHei" w:eastAsia="Microsoft YaHei"/>
-                <w:b/>
-                <w:color w:val="FFFFFF"/>
-                <w:sz w:val="15"/>
-              </w:rPr>
-              <w:t>固定项</w:t>
-            </w:r>
-          </w:p>
-        </w:tc>
-        <w:tc>
-          <w:tcPr>
-            <w:tcW w:type="dxa" w:w="8164"/>
-            <w:shd w:fill="17324D"/>
-            <w:vAlign w:val="center"/>
-            <w:tcMar>
-              <w:top w:w="45" w:type="dxa"/>
-              <w:start w:w="65" w:type="dxa"/>
-              <w:bottom w:w="45" w:type="dxa"/>
-              <w:end w:w="65" w:type="dxa"/>
-            </w:tcMar>
-          </w:tcPr>
-          <w:p>
-            <w:pPr>
-              <w:spacing w:after="0"/>
-            </w:pPr>
-            <w:r>
-              <w:rPr>
-                <w:rFonts w:ascii="Microsoft YaHei" w:hAnsi="Microsoft YaHei" w:eastAsia="Microsoft YaHei"/>
-                <w:b/>
-                <w:color w:val="FFFFFF"/>
-                <w:sz w:val="15"/>
-              </w:rPr>
-              <w:t>可执行定义</w:t>
-            </w:r>
-          </w:p>
-        </w:tc>
-      </w:tr>
-      <w:tr>
-        <w:trPr>
-          <w:cantSplit/>
-        </w:trPr>
-        <w:tc>
-          <w:tcPr>
-            <w:tcW w:type="dxa" w:w="1757"/>
-            <w:vAlign w:val="center"/>
-            <w:tcMar>
-              <w:top w:w="45" w:type="dxa"/>
-              <w:start w:w="65" w:type="dxa"/>
-              <w:bottom w:w="45" w:type="dxa"/>
-              <w:end w:w="65" w:type="dxa"/>
-            </w:tcMar>
-          </w:tcPr>
-          <w:p>
-            <w:pPr>
-              <w:spacing w:after="0"/>
-            </w:pPr>
-            <w:r>
-              <w:rPr>
-                <w:rFonts w:ascii="Microsoft YaHei" w:hAnsi="Microsoft YaHei" w:eastAsia="Microsoft YaHei"/>
-                <w:b/>
-                <w:sz w:val="15"/>
-              </w:rPr>
-              <w:t>目标记录</w:t>
-            </w:r>
-          </w:p>
-        </w:tc>
-        <w:tc>
-          <w:tcPr>
-            <w:tcW w:type="dxa" w:w="8164"/>
-            <w:vAlign w:val="center"/>
-            <w:tcMar>
-              <w:top w:w="45" w:type="dxa"/>
-              <w:start w:w="65" w:type="dxa"/>
-              <w:bottom w:w="45" w:type="dxa"/>
-              <w:end w:w="65" w:type="dxa"/>
-            </w:tcMar>
-          </w:tcPr>
-          <w:p>
-            <w:pPr>
-              <w:spacing w:after="0"/>
-            </w:pPr>
-            <w:r>
-              <w:rPr>
-                <w:rFonts w:ascii="Microsoft YaHei" w:hAnsi="Microsoft YaHei" w:eastAsia="Microsoft YaHei"/>
-                <w:b w:val="0"/>
-                <w:sz w:val="15"/>
-              </w:rPr>
-              <w:t>保存 user_target、typed_logic、KaTeX、constraints、basis、spaces、plugin_route；显示公式不等于真值。</w:t>
-            </w:r>
-          </w:p>
-        </w:tc>
-      </w:tr>
-      <w:tr>
-        <w:trPr>
-          <w:cantSplit/>
-        </w:trPr>
-        <w:tc>
-          <w:tcPr>
-            <w:tcW w:type="dxa" w:w="1757"/>
-            <w:vAlign w:val="center"/>
-            <w:tcMar>
-              <w:top w:w="45" w:type="dxa"/>
-              <w:start w:w="65" w:type="dxa"/>
-              <w:bottom w:w="45" w:type="dxa"/>
-              <w:end w:w="65" w:type="dxa"/>
-            </w:tcMar>
-            <w:shd w:fill="F2F4F5"/>
-          </w:tcPr>
-          <w:p>
-            <w:pPr>
-              <w:spacing w:after="0"/>
-            </w:pPr>
-            <w:r>
-              <w:rPr>
-                <w:rFonts w:ascii="Microsoft YaHei" w:hAnsi="Microsoft YaHei" w:eastAsia="Microsoft YaHei"/>
-                <w:b/>
-                <w:sz w:val="15"/>
-              </w:rPr>
-              <w:t>相连空间</w:t>
-            </w:r>
-          </w:p>
-        </w:tc>
-        <w:tc>
-          <w:tcPr>
-            <w:tcW w:type="dxa" w:w="8164"/>
-            <w:vAlign w:val="center"/>
-            <w:tcMar>
-              <w:top w:w="45" w:type="dxa"/>
-              <w:start w:w="65" w:type="dxa"/>
-              <w:bottom w:w="45" w:type="dxa"/>
-              <w:end w:w="65" w:type="dxa"/>
-            </w:tcMar>
-            <w:shd w:fill="F2F4F5"/>
-          </w:tcPr>
-          <w:p>
-            <w:pPr>
-              <w:spacing w:after="0"/>
-            </w:pPr>
-            <w:r>
-              <w:rPr>
-                <w:rFonts w:ascii="Microsoft YaHei" w:hAnsi="Microsoft YaHei" w:eastAsia="Microsoft YaHei"/>
-                <w:b w:val="0"/>
-                <w:sz w:val="15"/>
-              </w:rPr>
-              <w:t>催化固定为 N→S→C→Y→G→P；映射逐个带输入/输出类型和 oracle，不假定它们是同一向量空间。</w:t>
-            </w:r>
-          </w:p>
-        </w:tc>
-      </w:tr>
-      <w:tr>
-        <w:trPr>
-          <w:cantSplit/>
-        </w:trPr>
-        <w:tc>
-          <w:tcPr>
-            <w:tcW w:type="dxa" w:w="1757"/>
-            <w:vAlign w:val="center"/>
-            <w:tcMar>
-              <w:top w:w="45" w:type="dxa"/>
-              <w:start w:w="65" w:type="dxa"/>
-              <w:bottom w:w="45" w:type="dxa"/>
-              <w:end w:w="65" w:type="dxa"/>
-            </w:tcMar>
-          </w:tcPr>
-          <w:p>
-            <w:pPr>
-              <w:spacing w:after="0"/>
-            </w:pPr>
-            <w:r>
-              <w:rPr>
-                <w:rFonts w:ascii="Microsoft YaHei" w:hAnsi="Microsoft YaHei" w:eastAsia="Microsoft YaHei"/>
-                <w:b/>
-                <w:sz w:val="15"/>
-              </w:rPr>
-              <w:t>插件路由</w:t>
-            </w:r>
-          </w:p>
-        </w:tc>
-        <w:tc>
-          <w:tcPr>
-            <w:tcW w:type="dxa" w:w="8164"/>
-            <w:vAlign w:val="center"/>
-            <w:tcMar>
-              <w:top w:w="45" w:type="dxa"/>
-              <w:start w:w="65" w:type="dxa"/>
-              <w:bottom w:w="45" w:type="dxa"/>
-              <w:end w:w="65" w:type="dxa"/>
-            </w:tcMar>
-          </w:tcPr>
-          <w:p>
-            <w:pPr>
-              <w:spacing w:after="0"/>
-            </w:pPr>
-            <w:r>
-              <w:rPr>
-                <w:rFonts w:ascii="Microsoft YaHei" w:hAnsi="Microsoft YaHei" w:eastAsia="Microsoft YaHei"/>
-                <w:b w:val="0"/>
-                <w:sz w:val="15"/>
-              </w:rPr>
-              <w:t>ReactionDecomposer 管反应；ObjectiveStructurer 管标量目标；GeometryPlugin 管坐标；Lean 只查明示命题。</w:t>
-            </w:r>
-          </w:p>
-        </w:tc>
-      </w:tr>
-      <w:tr>
-        <w:trPr>
-          <w:cantSplit/>
-        </w:trPr>
-        <w:tc>
-          <w:tcPr>
-            <w:tcW w:type="dxa" w:w="1757"/>
-            <w:vAlign w:val="center"/>
-            <w:tcMar>
-              <w:top w:w="45" w:type="dxa"/>
-              <w:start w:w="65" w:type="dxa"/>
-              <w:bottom w:w="45" w:type="dxa"/>
-              <w:end w:w="65" w:type="dxa"/>
-            </w:tcMar>
-            <w:shd w:fill="F2F4F5"/>
-          </w:tcPr>
-          <w:p>
-            <w:pPr>
-              <w:spacing w:after="0"/>
-            </w:pPr>
-            <w:r>
-              <w:rPr>
-                <w:rFonts w:ascii="Microsoft YaHei" w:hAnsi="Microsoft YaHei" w:eastAsia="Microsoft YaHei"/>
-                <w:b/>
-                <w:sz w:val="15"/>
-              </w:rPr>
-              <w:t>EML 闸门</w:t>
-            </w:r>
-          </w:p>
-        </w:tc>
-        <w:tc>
-          <w:tcPr>
-            <w:tcW w:type="dxa" w:w="8164"/>
-            <w:vAlign w:val="center"/>
-            <w:tcMar>
-              <w:top w:w="45" w:type="dxa"/>
-              <w:start w:w="65" w:type="dxa"/>
-              <w:bottom w:w="45" w:type="dxa"/>
-              <w:end w:w="65" w:type="dxa"/>
-            </w:tcMar>
-            <w:shd w:fill="F2F4F5"/>
-          </w:tcPr>
-          <w:p>
-            <w:pPr>
-              <w:spacing w:after="0"/>
-            </w:pPr>
-            <w:r>
-              <w:rPr>
-                <w:rFonts w:ascii="Microsoft YaHei" w:hAnsi="Microsoft YaHei" w:eastAsia="Microsoft YaHei"/>
-                <w:b w:val="0"/>
-                <w:sz w:val="15"/>
-              </w:rPr>
-              <w:t>只接收合格标量解析 AST；代数结构标 unconfirmed；科学切片固定主分支、7 点池、1e−10 与 5 次预算。</w:t>
-            </w:r>
-          </w:p>
-        </w:tc>
-      </w:tr>
-      <w:tr>
-        <w:trPr>
-          <w:cantSplit/>
-        </w:trPr>
-        <w:tc>
-          <w:tcPr>
-            <w:tcW w:type="dxa" w:w="1757"/>
-            <w:vAlign w:val="center"/>
-            <w:tcMar>
-              <w:top w:w="45" w:type="dxa"/>
-              <w:start w:w="65" w:type="dxa"/>
-              <w:bottom w:w="45" w:type="dxa"/>
-              <w:end w:w="65" w:type="dxa"/>
-            </w:tcMar>
-          </w:tcPr>
-          <w:p>
-            <w:pPr>
-              <w:spacing w:after="0"/>
-            </w:pPr>
-            <w:r>
-              <w:rPr>
-                <w:rFonts w:ascii="Microsoft YaHei" w:hAnsi="Microsoft YaHei" w:eastAsia="Microsoft YaHei"/>
-                <w:b/>
-                <w:sz w:val="15"/>
-              </w:rPr>
-              <w:t>状态/安全</w:t>
-            </w:r>
-          </w:p>
-        </w:tc>
-        <w:tc>
-          <w:tcPr>
-            <w:tcW w:type="dxa" w:w="8164"/>
-            <w:vAlign w:val="center"/>
-            <w:tcMar>
-              <w:top w:w="45" w:type="dxa"/>
-              <w:start w:w="65" w:type="dxa"/>
-              <w:bottom w:w="45" w:type="dxa"/>
-              <w:end w:w="65" w:type="dxa"/>
-            </w:tcMar>
-          </w:tcPr>
-          <w:p>
-            <w:pPr>
-              <w:spacing w:after="0"/>
-            </w:pPr>
-            <w:r>
-              <w:rPr>
-                <w:rFonts w:ascii="Microsoft YaHei" w:hAnsi="Microsoft YaHei" w:eastAsia="Microsoft YaHei"/>
-                <w:b w:val="0"/>
-                <w:sz w:val="15"/>
-              </w:rPr>
-              <w:t>solved / mismatch / undefined / unknown / abstain；不用 eval、exec、裸 sympify，运行后不得换指标。</w:t>
-            </w:r>
-          </w:p>
-        </w:tc>
-      </w:tr>
-    </w:tbl>
     <w:p>
       <w:pPr>
-        <w:spacing w:after="0"/>
+        <w:spacing w:after="30"/>
       </w:pPr>
+      <w:r>
+        <w:rPr>
+          <w:rFonts w:ascii="Microsoft YaHei" w:hAnsi="Microsoft YaHei" w:eastAsia="Microsoft YaHei"/>
+          <w:b w:val="0"/>
+          <w:sz w:val="15"/>
+        </w:rPr>
+        <w:t>每次运行先冻结原始目标、物种与相态、条件向量 θ、候选集合 Cθ、指标和允许调用的特定基算子。催化路线固定经过反应解析、元素矩阵、整数核配平、目标完备性、文献检索和几何投影；未经配平不得排名，指标欠定不得补写“最佳”，无来源坐标只能画示意构型，含 sorry 的 Lean 文件不得标为已证明。</w:t>
+      </w:r>
+    </w:p>
+    <w:p>
+      <w:pPr>
+        <w:spacing w:before="16" w:after="28"/>
+        <w:jc w:val="center"/>
+      </w:pPr>
+      <w:r>
+        <w:rPr>
+          <w:rFonts w:ascii="Cambria Math" w:hAnsi="Cambria Math" w:eastAsia="Cambria Math"/>
+          <w:b w:val="0"/>
+          <w:color w:val="0D2538"/>
+          <w:sz w:val="18"/>
+        </w:rPr>
+        <w:t>θlit={T=320 °C, P=5.0 MPa, 进料=(3.25% Ar, 26.5% CO₂, 70.25% H₂), 反应器=内径 6 mm 固定床}</w:t>
+      </w:r>
+    </w:p>
+    <w:p>
+      <w:pPr>
+        <w:spacing w:after="30"/>
+      </w:pPr>
+      <w:r>
+        <w:rPr>
+          <w:rFonts w:ascii="Microsoft YaHei" w:hAnsi="Microsoft YaHei" w:eastAsia="Microsoft YaHei"/>
+          <w:b w:val="0"/>
+          <w:sz w:val="15"/>
+        </w:rPr>
+        <w:t xml:space="preserve">该参数截面来自 </w:t>
+      </w:r>
+      <w:hyperlink r:id="rId10" w:history="1">
+        <w:r>
+          <w:rPr>
+            <w:rFonts w:ascii="Microsoft YaHei" w:hAnsi="Microsoft YaHei" w:eastAsia="Microsoft YaHei"/>
+            <w:b w:val="0"/>
+            <w:color w:val="245F83"/>
+            <w:sz w:val="15"/>
+            <w:u w:val="single"/>
+          </w:rPr>
+        </w:r>
+      </w:hyperlink>
+      <w:r>
+        <w:rPr>
+          <w:rFonts w:ascii="Microsoft YaHei" w:hAnsi="Microsoft YaHei" w:eastAsia="Microsoft YaHei"/>
+          <w:b w:val="0"/>
+          <w:sz w:val="15"/>
+        </w:rPr>
+        <w:t xml:space="preserve"> 的补充材料，只说明专业比较所需的粒度，不自动成为演示环境的条件，也不能与其他论文横向排名。</w:t>
+      </w:r>
     </w:p>
     <w:p>
       <w:pPr>
@@ -1030,24 +893,109 @@
         <w:tblLook w:firstColumn="1" w:firstRow="1" w:lastColumn="0" w:lastRow="0" w:noHBand="0" w:noVBand="1" w:val="04A0"/>
       </w:tblPr>
       <w:tblGrid>
-        <w:gridCol w:w="5188"/>
-        <w:gridCol w:w="5188"/>
+        <w:gridCol w:w="3496"/>
+        <w:gridCol w:w="3496"/>
+        <w:gridCol w:w="3496"/>
       </w:tblGrid>
       <w:tr>
         <w:trPr>
-          <w:tblHeader w:val="true"/>
           <w:cantSplit/>
         </w:trPr>
         <w:tc>
           <w:tcPr>
-            <w:tcW w:type="dxa" w:w="1757"/>
-            <w:shd w:fill="17324D"/>
+            <w:tcW w:type="dxa" w:w="1247"/>
             <w:vAlign w:val="center"/>
             <w:tcMar>
-              <w:top w:w="45" w:type="dxa"/>
-              <w:start w:w="65" w:type="dxa"/>
-              <w:bottom w:w="45" w:type="dxa"/>
-              <w:end w:w="65" w:type="dxa"/>
+              <w:top w:w="32" w:type="dxa"/>
+              <w:start w:w="55" w:type="dxa"/>
+              <w:bottom w:w="32" w:type="dxa"/>
+              <w:end w:w="55" w:type="dxa"/>
+            </w:tcMar>
+            <w:shd w:fill="0D2538"/>
+          </w:tcPr>
+          <w:p>
+            <w:pPr>
+              <w:spacing w:after="0"/>
+            </w:pPr>
+            <w:r>
+              <w:rPr>
+                <w:rFonts w:ascii="Microsoft YaHei" w:hAnsi="Microsoft YaHei" w:eastAsia="Microsoft YaHei"/>
+                <w:b/>
+                <w:color w:val="FFFFFF"/>
+                <w:sz w:val="13"/>
+              </w:rPr>
+              <w:t>接口</w:t>
+            </w:r>
+          </w:p>
+        </w:tc>
+        <w:tc>
+          <w:tcPr>
+            <w:tcW w:type="dxa" w:w="4762"/>
+            <w:vAlign w:val="center"/>
+            <w:tcMar>
+              <w:top w:w="32" w:type="dxa"/>
+              <w:start w:w="55" w:type="dxa"/>
+              <w:bottom w:w="32" w:type="dxa"/>
+              <w:end w:w="55" w:type="dxa"/>
+            </w:tcMar>
+            <w:shd w:fill="0D2538"/>
+          </w:tcPr>
+          <w:p>
+            <w:pPr>
+              <w:spacing w:after="0"/>
+            </w:pPr>
+            <w:r>
+              <w:rPr>
+                <w:rFonts w:ascii="Microsoft YaHei" w:hAnsi="Microsoft YaHei" w:eastAsia="Microsoft YaHei"/>
+                <w:b/>
+                <w:color w:val="FFFFFF"/>
+                <w:sz w:val="13"/>
+              </w:rPr>
+              <w:t>落地字段或操作</w:t>
+            </w:r>
+          </w:p>
+        </w:tc>
+        <w:tc>
+          <w:tcPr>
+            <w:tcW w:type="dxa" w:w="4365"/>
+            <w:vAlign w:val="center"/>
+            <w:tcMar>
+              <w:top w:w="32" w:type="dxa"/>
+              <w:start w:w="55" w:type="dxa"/>
+              <w:bottom w:w="32" w:type="dxa"/>
+              <w:end w:w="55" w:type="dxa"/>
+            </w:tcMar>
+            <w:shd w:fill="0D2538"/>
+          </w:tcPr>
+          <w:p>
+            <w:pPr>
+              <w:spacing w:after="0"/>
+            </w:pPr>
+            <w:r>
+              <w:rPr>
+                <w:rFonts w:ascii="Microsoft YaHei" w:hAnsi="Microsoft YaHei" w:eastAsia="Microsoft YaHei"/>
+                <w:b/>
+                <w:color w:val="FFFFFF"/>
+                <w:sz w:val="13"/>
+              </w:rPr>
+              <w:t>反馈如何改变下一步</w:t>
+            </w:r>
+          </w:p>
+        </w:tc>
+      </w:tr>
+      <w:tr>
+        <w:trPr>
+          <w:cantSplit/>
+        </w:trPr>
+        <w:tc>
+          <w:tcPr>
+            <w:tcW w:type="dxa" w:w="1247"/>
+            <w:vAlign w:val="center"/>
+            <w:tcMar>
+              <w:top w:w="32" w:type="dxa"/>
+              <w:start w:w="55" w:type="dxa"/>
+              <w:bottom w:w="32" w:type="dxa"/>
+              <w:end w:w="55" w:type="dxa"/>
             </w:tcMar>
           </w:tcPr>
           <w:p>
@@ -1058,23 +1006,159 @@
               <w:rPr>
                 <w:rFonts w:ascii="Microsoft YaHei" w:hAnsi="Microsoft YaHei" w:eastAsia="Microsoft YaHei"/>
                 <w:b/>
-                <w:color w:val="FFFFFF"/>
-                <w:sz w:val="14"/>
+                <w:sz w:val="13"/>
               </w:rPr>
-              <w:t>接口</w:t>
+              <w:t>观察</w:t>
             </w:r>
           </w:p>
         </w:tc>
         <w:tc>
           <w:tcPr>
-            <w:tcW w:type="dxa" w:w="8164"/>
-            <w:shd w:fill="17324D"/>
+            <w:tcW w:type="dxa" w:w="4762"/>
             <w:vAlign w:val="center"/>
             <w:tcMar>
-              <w:top w:w="45" w:type="dxa"/>
-              <w:start w:w="65" w:type="dxa"/>
-              <w:bottom w:w="45" w:type="dxa"/>
-              <w:end w:w="65" w:type="dxa"/>
+              <w:top w:w="32" w:type="dxa"/>
+              <w:start w:w="55" w:type="dxa"/>
+              <w:bottom w:w="32" w:type="dxa"/>
+              <w:end w:w="55" w:type="dxa"/>
+            </w:tcMar>
+          </w:tcPr>
+          <w:p>
+            <w:pPr>
+              <w:spacing w:after="0"/>
+            </w:pPr>
+            <w:r>
+              <w:rPr>
+                <w:rFonts w:ascii="Microsoft YaHei" w:hAnsi="Microsoft YaHei" w:eastAsia="Microsoft YaHei"/>
+                <w:b w:val="0"/>
+                <w:sz w:val="13"/>
+              </w:rPr>
+              <w:t>原目标、标准数学式、θ 完整度、Cθ、来源层级、相连空间、反例、预算</w:t>
+            </w:r>
+          </w:p>
+        </w:tc>
+        <w:tc>
+          <w:tcPr>
+            <w:tcW w:type="dxa" w:w="4365"/>
+            <w:vAlign w:val="center"/>
+            <w:tcMar>
+              <w:top w:w="32" w:type="dxa"/>
+              <w:start w:w="55" w:type="dxa"/>
+              <w:bottom w:w="32" w:type="dxa"/>
+              <w:end w:w="55" w:type="dxa"/>
+            </w:tcMar>
+          </w:tcPr>
+          <w:p>
+            <w:pPr>
+              <w:spacing w:after="0"/>
+            </w:pPr>
+            <w:r>
+              <w:rPr>
+                <w:rFonts w:ascii="Microsoft YaHei" w:hAnsi="Microsoft YaHei" w:eastAsia="Microsoft YaHei"/>
+                <w:b w:val="0"/>
+                <w:sz w:val="13"/>
+              </w:rPr>
+              <w:t>形成当前可判定问题切片</w:t>
+            </w:r>
+          </w:p>
+        </w:tc>
+      </w:tr>
+      <w:tr>
+        <w:trPr>
+          <w:cantSplit/>
+        </w:trPr>
+        <w:tc>
+          <w:tcPr>
+            <w:tcW w:type="dxa" w:w="1247"/>
+            <w:vAlign w:val="center"/>
+            <w:tcMar>
+              <w:top w:w="32" w:type="dxa"/>
+              <w:start w:w="55" w:type="dxa"/>
+              <w:bottom w:w="32" w:type="dxa"/>
+              <w:end w:w="55" w:type="dxa"/>
+            </w:tcMar>
+            <w:shd w:fill="F7F8F7"/>
+          </w:tcPr>
+          <w:p>
+            <w:pPr>
+              <w:spacing w:after="0"/>
+            </w:pPr>
+            <w:r>
+              <w:rPr>
+                <w:rFonts w:ascii="Microsoft YaHei" w:hAnsi="Microsoft YaHei" w:eastAsia="Microsoft YaHei"/>
+                <w:b/>
+                <w:sz w:val="13"/>
+              </w:rPr>
+              <w:t>行动</w:t>
+            </w:r>
+          </w:p>
+        </w:tc>
+        <w:tc>
+          <w:tcPr>
+            <w:tcW w:type="dxa" w:w="4762"/>
+            <w:vAlign w:val="center"/>
+            <w:tcMar>
+              <w:top w:w="32" w:type="dxa"/>
+              <w:start w:w="55" w:type="dxa"/>
+              <w:bottom w:w="32" w:type="dxa"/>
+              <w:end w:w="55" w:type="dxa"/>
+            </w:tcMar>
+            <w:shd w:fill="F7F8F7"/>
+          </w:tcPr>
+          <w:p>
+            <w:pPr>
+              <w:spacing w:after="0"/>
+            </w:pPr>
+            <w:r>
+              <w:rPr>
+                <w:rFonts w:ascii="Microsoft YaHei" w:hAnsi="Microsoft YaHei" w:eastAsia="Microsoft YaHei"/>
+                <w:b w:val="0"/>
+                <w:sz w:val="13"/>
+              </w:rPr>
+              <w:t>配平；补齐/收缩条件域；换候选子集；调用文献、几何、Lean；生成反例；停止</w:t>
+            </w:r>
+          </w:p>
+        </w:tc>
+        <w:tc>
+          <w:tcPr>
+            <w:tcW w:type="dxa" w:w="4365"/>
+            <w:vAlign w:val="center"/>
+            <w:tcMar>
+              <w:top w:w="32" w:type="dxa"/>
+              <w:start w:w="55" w:type="dxa"/>
+              <w:bottom w:w="32" w:type="dxa"/>
+              <w:end w:w="55" w:type="dxa"/>
+            </w:tcMar>
+            <w:shd w:fill="F7F8F7"/>
+          </w:tcPr>
+          <w:p>
+            <w:pPr>
+              <w:spacing w:after="0"/>
+            </w:pPr>
+            <w:r>
+              <w:rPr>
+                <w:rFonts w:ascii="Microsoft YaHei" w:hAnsi="Microsoft YaHei" w:eastAsia="Microsoft YaHei"/>
+                <w:b w:val="0"/>
+                <w:sz w:val="13"/>
+              </w:rPr>
+              <w:t>选择下一特定算子或插件</w:t>
+            </w:r>
+          </w:p>
+        </w:tc>
+      </w:tr>
+      <w:tr>
+        <w:trPr>
+          <w:cantSplit/>
+        </w:trPr>
+        <w:tc>
+          <w:tcPr>
+            <w:tcW w:type="dxa" w:w="1247"/>
+            <w:vAlign w:val="center"/>
+            <w:tcMar>
+              <w:top w:w="32" w:type="dxa"/>
+              <w:start w:w="55" w:type="dxa"/>
+              <w:bottom w:w="32" w:type="dxa"/>
+              <w:end w:w="55" w:type="dxa"/>
             </w:tcMar>
           </w:tcPr>
           <w:p>
@@ -1085,52 +1169,21 @@
               <w:rPr>
                 <w:rFonts w:ascii="Microsoft YaHei" w:hAnsi="Microsoft YaHei" w:eastAsia="Microsoft YaHei"/>
                 <w:b/>
-                <w:color w:val="FFFFFF"/>
-                <w:sz w:val="14"/>
+                <w:sz w:val="13"/>
               </w:rPr>
-              <w:t>字段/函数</w:t>
-            </w:r>
-          </w:p>
-        </w:tc>
-      </w:tr>
-      <w:tr>
-        <w:trPr>
-          <w:cantSplit/>
-        </w:trPr>
-        <w:tc>
-          <w:tcPr>
-            <w:tcW w:type="dxa" w:w="1757"/>
-            <w:vAlign w:val="center"/>
-            <w:tcMar>
-              <w:top w:w="45" w:type="dxa"/>
-              <w:start w:w="65" w:type="dxa"/>
-              <w:bottom w:w="45" w:type="dxa"/>
-              <w:end w:w="65" w:type="dxa"/>
-            </w:tcMar>
-          </w:tcPr>
-          <w:p>
-            <w:pPr>
-              <w:spacing w:after="0"/>
-            </w:pPr>
-            <w:r>
-              <w:rPr>
-                <w:rFonts w:ascii="Microsoft YaHei" w:hAnsi="Microsoft YaHei" w:eastAsia="Microsoft YaHei"/>
-                <w:b/>
-                <w:sz w:val="14"/>
-              </w:rPr>
-              <w:t>观察</w:t>
+              <w:t>反馈</w:t>
             </w:r>
           </w:p>
         </w:tc>
         <w:tc>
           <w:tcPr>
-            <w:tcW w:type="dxa" w:w="8164"/>
+            <w:tcW w:type="dxa" w:w="4762"/>
             <w:vAlign w:val="center"/>
             <w:tcMar>
-              <w:top w:w="45" w:type="dxa"/>
-              <w:start w:w="65" w:type="dxa"/>
-              <w:bottom w:w="45" w:type="dxa"/>
-              <w:end w:w="65" w:type="dxa"/>
+              <w:top w:w="32" w:type="dxa"/>
+              <w:start w:w="55" w:type="dxa"/>
+              <w:bottom w:w="32" w:type="dxa"/>
+              <w:end w:w="55" w:type="dxa"/>
             </w:tcMar>
           </w:tcPr>
           <w:p>
@@ -1141,108 +1194,21 @@
               <w:rPr>
                 <w:rFonts w:ascii="Microsoft YaHei" w:hAnsi="Microsoft YaHei" w:eastAsia="Microsoft YaHei"/>
                 <w:b w:val="0"/>
-                <w:sz w:val="14"/>
+                <w:sz w:val="13"/>
               </w:rPr>
-              <w:t>typed_target, spaces, plugin_route, AST/domain/branch, conditioned_data, counterexamples, budget_left</w:t>
-            </w:r>
-          </w:p>
-        </w:tc>
-      </w:tr>
-      <w:tr>
-        <w:trPr>
-          <w:cantSplit/>
-        </w:trPr>
-        <w:tc>
-          <w:tcPr>
-            <w:tcW w:type="dxa" w:w="1757"/>
-            <w:vAlign w:val="center"/>
-            <w:tcMar>
-              <w:top w:w="45" w:type="dxa"/>
-              <w:start w:w="65" w:type="dxa"/>
-              <w:bottom w:w="45" w:type="dxa"/>
-              <w:end w:w="65" w:type="dxa"/>
-            </w:tcMar>
-            <w:shd w:fill="F2F4F5"/>
-          </w:tcPr>
-          <w:p>
-            <w:pPr>
-              <w:spacing w:after="0"/>
-            </w:pPr>
-            <w:r>
-              <w:rPr>
-                <w:rFonts w:ascii="Microsoft YaHei" w:hAnsi="Microsoft YaHei" w:eastAsia="Microsoft YaHei"/>
-                <w:b/>
-                <w:sz w:val="14"/>
-              </w:rPr>
-              <w:t>行动</w:t>
+              <w:t>通过／否证／未知／证据不足／超时；守恒余量、失败字段、来源位置、轨迹</w:t>
             </w:r>
           </w:p>
         </w:tc>
         <w:tc>
           <w:tcPr>
-            <w:tcW w:type="dxa" w:w="8164"/>
+            <w:tcW w:type="dxa" w:w="4365"/>
             <w:vAlign w:val="center"/>
             <w:tcMar>
-              <w:top w:w="45" w:type="dxa"/>
-              <w:start w:w="65" w:type="dxa"/>
-              <w:bottom w:w="45" w:type="dxa"/>
-              <w:end w:w="65" w:type="dxa"/>
-            </w:tcMar>
-            <w:shd w:fill="F2F4F5"/>
-          </w:tcPr>
-          <w:p>
-            <w:pPr>
-              <w:spacing w:after="0"/>
-            </w:pPr>
-            <w:r>
-              <w:rPr>
-                <w:rFonts w:ascii="Microsoft YaHei" w:hAnsi="Microsoft YaHei" w:eastAsia="Microsoft YaHei"/>
-                <w:b w:val="0"/>
-                <w:sz w:val="14"/>
-              </w:rPr>
-              <w:t>decompose_reaction(), choose_basis(), probe(), inspect_subtree(), revise(diff), project_geometry(), emit_lean()</w:t>
-            </w:r>
-          </w:p>
-        </w:tc>
-      </w:tr>
-      <w:tr>
-        <w:trPr>
-          <w:cantSplit/>
-        </w:trPr>
-        <w:tc>
-          <w:tcPr>
-            <w:tcW w:type="dxa" w:w="1757"/>
-            <w:vAlign w:val="center"/>
-            <w:tcMar>
-              <w:top w:w="45" w:type="dxa"/>
-              <w:start w:w="65" w:type="dxa"/>
-              <w:bottom w:w="45" w:type="dxa"/>
-              <w:end w:w="65" w:type="dxa"/>
-            </w:tcMar>
-          </w:tcPr>
-          <w:p>
-            <w:pPr>
-              <w:spacing w:after="0"/>
-            </w:pPr>
-            <w:r>
-              <w:rPr>
-                <w:rFonts w:ascii="Microsoft YaHei" w:hAnsi="Microsoft YaHei" w:eastAsia="Microsoft YaHei"/>
-                <w:b/>
-                <w:sz w:val="14"/>
-              </w:rPr>
-              <w:t>反馈</w:t>
-            </w:r>
-          </w:p>
-        </w:tc>
-        <w:tc>
-          <w:tcPr>
-            <w:tcW w:type="dxa" w:w="8164"/>
-            <w:vAlign w:val="center"/>
-            <w:tcMar>
-              <w:top w:w="45" w:type="dxa"/>
-              <w:start w:w="65" w:type="dxa"/>
-              <w:bottom w:w="45" w:type="dxa"/>
-              <w:end w:w="65" w:type="dxa"/>
+              <w:top w:w="32" w:type="dxa"/>
+              <w:start w:w="55" w:type="dxa"/>
+              <w:bottom w:w="32" w:type="dxa"/>
+              <w:end w:w="55" w:type="dxa"/>
             </w:tcMar>
           </w:tcPr>
           <w:p>
@@ -1253,9 +1219,9 @@
               <w:rPr>
                 <w:rFonts w:ascii="Microsoft YaHei" w:hAnsi="Microsoft YaHei" w:eastAsia="Microsoft YaHei"/>
                 <w:b w:val="0"/>
-                <w:sz w:val="14"/>
+                <w:sz w:val="13"/>
               </w:rPr>
-              <w:t>balance/Aν, objective_status, evidence_span, mismatch/undefined/unknown, failed_subtree, proof_status, oracle_trace</w:t>
+              <w:t>不守恒→配平；欠定→索取条件或拒绝排名；仅元数据→读摘要/原文</w:t>
             </w:r>
           </w:p>
         </w:tc>
@@ -1263,21 +1229,8 @@
     </w:tbl>
     <w:p>
       <w:pPr>
-        <w:spacing w:after="0"/>
+        <w:spacing w:after="0" w:line="20" w:lineRule="exact"/>
       </w:pPr>
-    </w:p>
-    <w:p>
-      <w:pPr>
-        <w:spacing w:after="36"/>
-      </w:pPr>
-      <w:r>
-        <w:rPr>
-          <w:rFonts w:ascii="Microsoft YaHei" w:hAnsi="Microsoft YaHei" w:eastAsia="Microsoft YaHei"/>
-          <w:b w:val="0"/>
-          <w:sz w:val="16"/>
-        </w:rPr>
-        <w:t>反馈必须改变行动：输入不守恒→补齐计量空间；@best 欠定→弃权并索取条件化观测；标量 AST 才可进 EML；x=1 一致→下一步改测 x=−1；失配→检查负轴与零边界。固定 Lean 义务通过，但上游 EML reconstruct_ln 含 sorry，只能返回 partial_formalization。</w:t>
-      </w:r>
     </w:p>
     <w:p>
       <w:pPr>
@@ -1290,26 +1243,26 @@
     </w:p>
     <w:p>
       <w:pPr>
-        <w:spacing w:after="36"/>
+        <w:spacing w:after="30"/>
       </w:pPr>
       <w:r>
         <w:rPr>
           <w:rFonts w:ascii="Microsoft YaHei" w:hAnsi="Microsoft YaHei" w:eastAsia="Microsoft YaHei"/>
           <w:b w:val="0"/>
-          <w:sz w:val="16"/>
+          <w:sz w:val="15"/>
         </w:rPr>
-        <w:t>每步向 events.jsonl 写 step/action/feedback/next_action_reason，并记录模型、插件、来源 URL、unknown 与 SHA-256。当前验收模型调用/外网请求均为 0；可选 Harness 每次最多 1 个模型。EML 随机参照共享 5 次预算、20 固定种子；有限映射另测恒等根、g²≠f 与 g(D)⊄D。</w:t>
+        <w:t>日志保存目标版本、算子签名、输入输出哈希、反馈、下一动作理由、模型/插件版本、来源链接和失败状态。默认精确内核不调用模型；本地 Qwen3-8B 每次至多用于一次语义解析，输出仍须精确复核。Codex 或 DeepSeek 仅在用户显式选择时二选一、最多一次；文献接口至多八次，几何输出至多一幅二维和一幅三维图，探索至多六轮。后端不可用必须明示，不得静默替换。</w:t>
       </w:r>
     </w:p>
     <w:p>
       <w:pPr>
-        <w:spacing w:after="24"/>
+        <w:spacing w:before="14" w:after="20"/>
         <w:jc w:val="center"/>
       </w:pPr>
       <w:r>
         <w:drawing>
           <wp:inline xmlns:a="http://schemas.openxmlformats.org/drawingml/2006/main" xmlns:pic="http://schemas.openxmlformats.org/drawingml/2006/picture">
-            <wp:extent cx="6120000" cy="1700000"/>
+            <wp:extent cx="6336000" cy="2175724"/>
             <wp:docPr id="2" name="Picture 2"/>
             <wp:cNvGraphicFramePr>
               <a:graphicFrameLocks noChangeAspect="1"/>
@@ -1318,11 +1271,11 @@
               <a:graphicData uri="http://schemas.openxmlformats.org/drawingml/2006/picture">
                 <pic:pic>
                   <pic:nvPicPr>
-                    <pic:cNvPr id="0" name="page2_environment_loop.png"/>
+                    <pic:cNvPr id="0" name="page2_environment_interface.png"/>
                     <pic:cNvPicPr/>
                   </pic:nvPicPr>
                   <pic:blipFill>
-                    <a:blip r:embed="rId11"/>
+                    <a:blip r:embed="rId18"/>
                     <a:stretch>
                       <a:fillRect/>
                     </a:stretch>
@@ -1330,7 +1283,7 @@
                   <pic:spPr>
                     <a:xfrm>
                       <a:off x="0" y="0"/>
-                      <a:ext cx="6120000" cy="1700000"/>
+                      <a:ext cx="6336000" cy="2175724"/>
                     </a:xfrm>
                     <a:prstGeom prst="rect"/>
                   </pic:spPr>
@@ -1341,235 +1294,133 @@
         </w:drawing>
       </w:r>
     </w:p>
-    <w:tbl>
-      <w:tblPr>
-        <w:tblStyle w:val="TableGrid"/>
-        <w:tblW w:type="auto" w:w="0"/>
-        <w:jc w:val="center"/>
-        <w:tblLayout w:type="fixed"/>
-        <w:tblLook w:firstColumn="1" w:firstRow="1" w:lastColumn="0" w:lastRow="0" w:noHBand="0" w:noVBand="1" w:val="04A0"/>
-      </w:tblPr>
-      <w:tblGrid>
-        <w:gridCol w:w="2594"/>
-        <w:gridCol w:w="2594"/>
-        <w:gridCol w:w="2594"/>
-        <w:gridCol w:w="2594"/>
-      </w:tblGrid>
-      <w:tr>
-        <w:trPr>
-          <w:cantSplit/>
-        </w:trPr>
-        <w:tc>
-          <w:tcPr>
-            <w:tcW w:type="dxa" w:w="1020"/>
-            <w:tcMar>
-              <w:top w:w="30" w:type="dxa"/>
-              <w:start w:w="65" w:type="dxa"/>
-              <w:bottom w:w="30" w:type="dxa"/>
-              <w:end w:w="65" w:type="dxa"/>
-            </w:tcMar>
-            <w:shd w:fill="EAF2F5"/>
-          </w:tcPr>
-          <w:p>
-            <w:pPr>
-              <w:spacing w:after="0"/>
-            </w:pPr>
-            <w:r>
-              <w:rPr>
-                <w:rFonts w:ascii="Microsoft YaHei" w:hAnsi="Microsoft YaHei" w:eastAsia="Microsoft YaHei"/>
-                <w:b/>
-                <w:color w:val="17324D"/>
-                <w:sz w:val="13"/>
-              </w:rPr>
-              <w:t>证据编号</w:t>
-            </w:r>
-          </w:p>
-        </w:tc>
-        <w:tc>
-          <w:tcPr>
-            <w:tcW w:type="dxa" w:w="3798"/>
-            <w:tcMar>
-              <w:top w:w="30" w:type="dxa"/>
-              <w:start w:w="65" w:type="dxa"/>
-              <w:bottom w:w="30" w:type="dxa"/>
-              <w:end w:w="65" w:type="dxa"/>
-            </w:tcMar>
-          </w:tcPr>
-          <w:p>
-            <w:pPr>
-              <w:spacing w:after="0"/>
-            </w:pPr>
-            <w:r>
-              <w:rPr>
-                <w:rFonts w:ascii="Microsoft YaHei" w:hAnsi="Microsoft YaHei" w:eastAsia="Microsoft YaHei"/>
-                <w:b w:val="0"/>
-                <w:color w:val="66727D"/>
-                <w:sz w:val="13"/>
-              </w:rPr>
-              <w:t>E1、E2、E5；P1、T1、T2、L1、B1</w:t>
-            </w:r>
-          </w:p>
-        </w:tc>
-        <w:tc>
-          <w:tcPr>
-            <w:tcW w:type="dxa" w:w="1020"/>
-            <w:tcMar>
-              <w:top w:w="30" w:type="dxa"/>
-              <w:start w:w="65" w:type="dxa"/>
-              <w:bottom w:w="30" w:type="dxa"/>
-              <w:end w:w="65" w:type="dxa"/>
-            </w:tcMar>
-            <w:shd w:fill="EAF2F5"/>
-          </w:tcPr>
-          <w:p>
-            <w:pPr>
-              <w:spacing w:after="0"/>
-            </w:pPr>
-            <w:r>
-              <w:rPr>
-                <w:rFonts w:ascii="Microsoft YaHei" w:hAnsi="Microsoft YaHei" w:eastAsia="Microsoft YaHei"/>
-                <w:b/>
-                <w:color w:val="17324D"/>
-                <w:sz w:val="13"/>
-              </w:rPr>
-              <w:t>建议视觉</w:t>
-            </w:r>
-          </w:p>
-        </w:tc>
-        <w:tc>
-          <w:tcPr>
-            <w:tcW w:type="dxa" w:w="3798"/>
-            <w:tcMar>
-              <w:top w:w="30" w:type="dxa"/>
-              <w:start w:w="65" w:type="dxa"/>
-              <w:bottom w:w="30" w:type="dxa"/>
-              <w:end w:w="65" w:type="dxa"/>
-            </w:tcMar>
-          </w:tcPr>
-          <w:p>
-            <w:pPr>
-              <w:spacing w:after="0"/>
-            </w:pPr>
-            <w:r>
-              <w:rPr>
-                <w:rFonts w:ascii="Microsoft YaHei" w:hAnsi="Microsoft YaHei" w:eastAsia="Microsoft YaHei"/>
-                <w:b w:val="0"/>
-                <w:color w:val="66727D"/>
-                <w:sz w:val="13"/>
-              </w:rPr>
-              <w:t>类型过滤→插件→oracle→修订；N/S/C/Y/G/P</w:t>
-            </w:r>
-          </w:p>
-        </w:tc>
-      </w:tr>
-      <w:tr>
-        <w:trPr>
-          <w:cantSplit/>
-        </w:trPr>
-        <w:tc>
-          <w:tcPr>
-            <w:tcW w:type="dxa" w:w="1020"/>
-            <w:tcMar>
-              <w:top w:w="30" w:type="dxa"/>
-              <w:start w:w="65" w:type="dxa"/>
-              <w:bottom w:w="30" w:type="dxa"/>
-              <w:end w:w="65" w:type="dxa"/>
-            </w:tcMar>
-            <w:shd w:fill="EAF2F5"/>
-          </w:tcPr>
-          <w:p>
-            <w:pPr>
-              <w:spacing w:after="0"/>
-            </w:pPr>
-            <w:r>
-              <w:rPr>
-                <w:rFonts w:ascii="Microsoft YaHei" w:hAnsi="Microsoft YaHei" w:eastAsia="Microsoft YaHei"/>
-                <w:b/>
-                <w:color w:val="17324D"/>
-                <w:sz w:val="13"/>
-              </w:rPr>
-              <w:t>人工确认</w:t>
-            </w:r>
-          </w:p>
-        </w:tc>
-        <w:tc>
-          <w:tcPr>
-            <w:tcW w:type="dxa" w:w="3798"/>
-            <w:tcMar>
-              <w:top w:w="30" w:type="dxa"/>
-              <w:start w:w="65" w:type="dxa"/>
-              <w:bottom w:w="30" w:type="dxa"/>
-              <w:end w:w="65" w:type="dxa"/>
-            </w:tcMar>
-          </w:tcPr>
-          <w:p>
-            <w:pPr>
-              <w:spacing w:after="0"/>
-            </w:pPr>
-            <w:r>
-              <w:rPr>
-                <w:rFonts w:ascii="Microsoft YaHei" w:hAnsi="Microsoft YaHei" w:eastAsia="Microsoft YaHei"/>
-                <w:b w:val="0"/>
-                <w:color w:val="66727D"/>
-                <w:sz w:val="13"/>
-              </w:rPr>
-              <w:t>确认插件边界、预算与上游 sorry。</w:t>
-            </w:r>
-          </w:p>
-        </w:tc>
-        <w:tc>
-          <w:tcPr>
-            <w:tcW w:type="dxa" w:w="1020"/>
-            <w:tcMar>
-              <w:top w:w="30" w:type="dxa"/>
-              <w:start w:w="65" w:type="dxa"/>
-              <w:bottom w:w="30" w:type="dxa"/>
-              <w:end w:w="65" w:type="dxa"/>
-            </w:tcMar>
-            <w:shd w:fill="EAF2F5"/>
-          </w:tcPr>
-          <w:p>
-            <w:pPr>
-              <w:spacing w:after="0"/>
-            </w:pPr>
-            <w:r>
-              <w:rPr>
-                <w:rFonts w:ascii="Microsoft YaHei" w:hAnsi="Microsoft YaHei" w:eastAsia="Microsoft YaHei"/>
-                <w:b/>
-                <w:color w:val="17324D"/>
-                <w:sz w:val="13"/>
-              </w:rPr>
-              <w:t>内容预算</w:t>
-            </w:r>
-          </w:p>
-        </w:tc>
-        <w:tc>
-          <w:tcPr>
-            <w:tcW w:type="dxa" w:w="3798"/>
-            <w:tcMar>
-              <w:top w:w="30" w:type="dxa"/>
-              <w:start w:w="65" w:type="dxa"/>
-              <w:bottom w:w="30" w:type="dxa"/>
-              <w:end w:w="65" w:type="dxa"/>
-            </w:tcMar>
-          </w:tcPr>
-          <w:p>
-            <w:pPr>
-              <w:spacing w:after="0"/>
-            </w:pPr>
-            <w:r>
-              <w:rPr>
-                <w:rFonts w:ascii="Microsoft YaHei" w:hAnsi="Microsoft YaHei" w:eastAsia="Microsoft YaHei"/>
-                <w:b w:val="0"/>
-                <w:color w:val="66727D"/>
-                <w:sz w:val="13"/>
-              </w:rPr>
-              <w:t>700–800 汉字；2 表1图</w:t>
-            </w:r>
-          </w:p>
-        </w:tc>
-      </w:tr>
-    </w:tbl>
+    <w:p>
+      <w:pPr>
+        <w:spacing w:before="10" w:after="0"/>
+        <w:ind w:left="85" w:right="85"/>
+      </w:pPr>
+      <w:r>
+        <w:rPr>
+          <w:rFonts w:ascii="Microsoft YaHei" w:hAnsi="Microsoft YaHei" w:eastAsia="Microsoft YaHei"/>
+          <w:b/>
+          <w:color w:val="245F83"/>
+          <w:sz w:val="12"/>
+        </w:rPr>
+        <w:t>页面字段：</w:t>
+      </w:r>
+      <w:r>
+        <w:rPr>
+          <w:rFonts w:ascii="Microsoft YaHei" w:hAnsi="Microsoft YaHei" w:eastAsia="Microsoft YaHei"/>
+          <w:b w:val="0"/>
+          <w:color w:val="66727D"/>
+          <w:sz w:val="12"/>
+        </w:rPr>
+        <w:t>固定规则、观察字段、动作枚举、反馈状态、日志与模型/文献/几何/轮数预算。</w:t>
+      </w:r>
+      <w:r>
+        <w:rPr>
+          <w:rFonts w:ascii="Microsoft YaHei" w:hAnsi="Microsoft YaHei" w:eastAsia="Microsoft YaHei"/>
+          <w:b/>
+          <w:color w:val="245F83"/>
+          <w:sz w:val="12"/>
+        </w:rPr>
+        <w:t xml:space="preserve">  文献依据：</w:t>
+      </w:r>
+      <w:hyperlink r:id="rId10" w:history="1">
+        <w:r>
+          <w:rPr>
+            <w:rFonts w:ascii="Microsoft YaHei" w:hAnsi="Microsoft YaHei" w:eastAsia="Microsoft YaHei"/>
+            <w:b w:val="0"/>
+            <w:color w:val="245F83"/>
+            <w:sz w:val="12"/>
+            <w:u w:val="single"/>
+          </w:rPr>
+        </w:r>
+      </w:hyperlink>
+      <w:r>
+        <w:rPr>
+          <w:rFonts w:ascii="Microsoft YaHei" w:hAnsi="Microsoft YaHei" w:eastAsia="Microsoft YaHei"/>
+          <w:b w:val="0"/>
+          <w:color w:val="66727D"/>
+          <w:sz w:val="12"/>
+        </w:rPr>
+        <w:t xml:space="preserve"> 补充材料 pp. 3–4；</w:t>
+      </w:r>
+      <w:hyperlink r:id="rId16" w:history="1">
+        <w:r>
+          <w:rPr>
+            <w:rFonts w:ascii="Microsoft YaHei" w:hAnsi="Microsoft YaHei" w:eastAsia="Microsoft YaHei"/>
+            <w:b w:val="0"/>
+            <w:color w:val="245F83"/>
+            <w:sz w:val="12"/>
+            <w:u w:val="single"/>
+          </w:rPr>
+        </w:r>
+      </w:hyperlink>
+      <w:r>
+        <w:rPr>
+          <w:rFonts w:ascii="Microsoft YaHei" w:hAnsi="Microsoft YaHei" w:eastAsia="Microsoft YaHei"/>
+          <w:b w:val="0"/>
+          <w:color w:val="66727D"/>
+          <w:sz w:val="12"/>
+        </w:rPr>
+        <w:t xml:space="preserve"> 仅作复杂度参照。</w:t>
+      </w:r>
+      <w:r>
+        <w:rPr>
+          <w:rFonts w:ascii="Microsoft YaHei" w:hAnsi="Microsoft YaHei" w:eastAsia="Microsoft YaHei"/>
+          <w:b/>
+          <w:color w:val="245F83"/>
+          <w:sz w:val="12"/>
+        </w:rPr>
+        <w:t xml:space="preserve">  建议视觉：</w:t>
+      </w:r>
+      <w:r>
+        <w:rPr>
+          <w:rFonts w:ascii="Microsoft YaHei" w:hAnsi="Microsoft YaHei" w:eastAsia="Microsoft YaHei"/>
+          <w:b w:val="0"/>
+          <w:color w:val="66727D"/>
+          <w:sz w:val="12"/>
+        </w:rPr>
+        <w:t>带类型部分映射与反馈闭环。</w:t>
+      </w:r>
+      <w:r>
+        <w:rPr>
+          <w:rFonts w:ascii="Microsoft YaHei" w:hAnsi="Microsoft YaHei" w:eastAsia="Microsoft YaHei"/>
+          <w:b/>
+          <w:color w:val="245F83"/>
+          <w:sz w:val="12"/>
+        </w:rPr>
+        <w:t xml:space="preserve">  人工确认：</w:t>
+      </w:r>
+      <w:r>
+        <w:rPr>
+          <w:rFonts w:ascii="Microsoft YaHei" w:hAnsi="Microsoft YaHei" w:eastAsia="Microsoft YaHei"/>
+          <w:b w:val="0"/>
+          <w:color w:val="66727D"/>
+          <w:sz w:val="12"/>
+        </w:rPr>
+        <w:t>专业参数标明来源；Qwen3-8B 不是验证器；Linux/macOS 未宣称实测。</w:t>
+      </w:r>
+      <w:r>
+        <w:rPr>
+          <w:rFonts w:ascii="Microsoft YaHei" w:hAnsi="Microsoft YaHei" w:eastAsia="Microsoft YaHei"/>
+          <w:b/>
+          <w:color w:val="245F83"/>
+          <w:sz w:val="12"/>
+        </w:rPr>
+        <w:t xml:space="preserve">  内容预算：</w:t>
+      </w:r>
+      <w:r>
+        <w:rPr>
+          <w:rFonts w:ascii="Microsoft YaHei" w:hAnsi="Microsoft YaHei" w:eastAsia="Microsoft YaHei"/>
+          <w:b w:val="0"/>
+          <w:color w:val="66727D"/>
+          <w:sz w:val="12"/>
+        </w:rPr>
+        <w:t>约 700 字＋1 表1图。</w:t>
+      </w:r>
+    </w:p>
     <w:p>
       <w:r>
         <w:br w:type="page"/>
@@ -1595,15 +1446,15 @@
     </w:p>
     <w:p>
       <w:pPr>
-        <w:spacing w:after="36"/>
+        <w:spacing w:after="30"/>
       </w:pPr>
       <w:r>
         <w:rPr>
           <w:rFonts w:ascii="Microsoft YaHei" w:hAnsi="Microsoft YaHei" w:eastAsia="Microsoft YaHei"/>
           <w:b w:val="0"/>
-          <w:sz w:val="17"/>
+          <w:sz w:val="15"/>
         </w:rPr>
-        <w:t>科学发现须在探索前定义：①封存树中可跨多个输入复现的域/分支失效族；②能定位到最小子树的反例；③稳定 unknown/后端失败；④反例迫使把“全域等价”改成带域、分支和弃权项的契约。每项须保存输入、树、后端版本、轨迹和修订 diff。催化路由与 E1 已报告的负实轴问题都只算环境校准。</w:t>
+        <w:t>输出一个材料名称不算发现。正向发现必须是条件化、可反驳的结构关系：冻结温压、进料、候选域和指标后，某类组件邻近关系或构型形成稳定可行候选；按预注册方式扰动一个条件，候选集合或可行性发生可解释变化；关系同时通过守恒、来源和专业插件。稳定负结果是同预算下候选均违反同一冻结约束；异常/反例是预期可行候选被守恒、原文或验证器否证；问题修正则是识别 θ、Cθ 与测量表缺失并生成下一次可运行查询。当前演示环境只取得最后一种信号，尚未构成催化发现。</w:t>
       </w:r>
     </w:p>
     <w:p>
@@ -1615,6 +1466,34 @@
         <w:t>3.2 平凡解/随机/无干预</w:t>
       </w:r>
     </w:p>
+    <w:p>
+      <w:pPr>
+        <w:spacing w:before="16" w:after="28"/>
+        <w:jc w:val="center"/>
+      </w:pPr>
+      <w:r>
+        <w:rPr>
+          <w:rFonts w:ascii="Cambria Math" w:hAnsi="Cambria Math" w:eastAsia="Cambria Math"/>
+          <w:b w:val="0"/>
+          <w:color w:val="0D2538"/>
+          <w:sz w:val="18"/>
+        </w:rPr>
+        <w:t>F(θ)={c∈Cθ : Aν=0, hⱼ(c;θ)=0, qᵢ(c;θ)≤0},   c*∈arg max[c∈F(θ)] J(c;θ)</w:t>
+      </w:r>
+    </w:p>
+    <w:p>
+      <w:pPr>
+        <w:spacing w:after="30"/>
+      </w:pPr>
+      <w:r>
+        <w:rPr>
+          <w:rFonts w:ascii="Microsoft YaHei" w:hAnsi="Microsoft YaHei" w:eastAsia="Microsoft YaHei"/>
+          <w:b w:val="0"/>
+          <w:sz w:val="15"/>
+        </w:rPr>
+        <w:t>解只可能从冻结后的非空可行域出现：F(θ)=∅ 即无可行解；极值集合含多个元素即非唯一。当目标与约束对某个非平凡群作用不变时，唯一性应在等价类商空间中讨论，或在固定规范后讨论代表元的唯一性。验证依次经过类型/单位、守恒、原文、专业求解器、条件扰动或反例、人工复核；有限采样只算检验。</w:t>
+      </w:r>
+    </w:p>
     <w:tbl>
       <w:tblPr>
         <w:tblStyle w:val="TableGrid"/>
@@ -1624,24 +1503,109 @@
         <w:tblLook w:firstColumn="1" w:firstRow="1" w:lastColumn="0" w:lastRow="0" w:noHBand="0" w:noVBand="1" w:val="04A0"/>
       </w:tblPr>
       <w:tblGrid>
-        <w:gridCol w:w="5188"/>
-        <w:gridCol w:w="5188"/>
+        <w:gridCol w:w="3496"/>
+        <w:gridCol w:w="3496"/>
+        <w:gridCol w:w="3496"/>
       </w:tblGrid>
       <w:tr>
         <w:trPr>
-          <w:tblHeader w:val="true"/>
           <w:cantSplit/>
         </w:trPr>
         <w:tc>
           <w:tcPr>
-            <w:tcW w:type="dxa" w:w="1757"/>
-            <w:shd w:fill="17324D"/>
+            <w:tcW w:type="dxa" w:w="1304"/>
             <w:vAlign w:val="center"/>
             <w:tcMar>
-              <w:top w:w="45" w:type="dxa"/>
-              <w:start w:w="65" w:type="dxa"/>
-              <w:bottom w:w="45" w:type="dxa"/>
-              <w:end w:w="65" w:type="dxa"/>
+              <w:top w:w="32" w:type="dxa"/>
+              <w:start w:w="55" w:type="dxa"/>
+              <w:bottom w:w="32" w:type="dxa"/>
+              <w:end w:w="55" w:type="dxa"/>
+            </w:tcMar>
+            <w:shd w:fill="0D2538"/>
+          </w:tcPr>
+          <w:p>
+            <w:pPr>
+              <w:spacing w:after="0"/>
+            </w:pPr>
+            <w:r>
+              <w:rPr>
+                <w:rFonts w:ascii="Microsoft YaHei" w:hAnsi="Microsoft YaHei" w:eastAsia="Microsoft YaHei"/>
+                <w:b/>
+                <w:color w:val="FFFFFF"/>
+                <w:sz w:val="13"/>
+              </w:rPr>
+              <w:t>参照</w:t>
+            </w:r>
+          </w:p>
+        </w:tc>
+        <w:tc>
+          <w:tcPr>
+            <w:tcW w:type="dxa" w:w="4139"/>
+            <w:vAlign w:val="center"/>
+            <w:tcMar>
+              <w:top w:w="32" w:type="dxa"/>
+              <w:start w:w="55" w:type="dxa"/>
+              <w:bottom w:w="32" w:type="dxa"/>
+              <w:end w:w="55" w:type="dxa"/>
+            </w:tcMar>
+            <w:shd w:fill="0D2538"/>
+          </w:tcPr>
+          <w:p>
+            <w:pPr>
+              <w:spacing w:after="0"/>
+            </w:pPr>
+            <w:r>
+              <w:rPr>
+                <w:rFonts w:ascii="Microsoft YaHei" w:hAnsi="Microsoft YaHei" w:eastAsia="Microsoft YaHei"/>
+                <w:b/>
+                <w:color w:val="FFFFFF"/>
+                <w:sz w:val="13"/>
+              </w:rPr>
+              <w:t>同预算操作</w:t>
+            </w:r>
+          </w:p>
+        </w:tc>
+        <w:tc>
+          <w:tcPr>
+            <w:tcW w:type="dxa" w:w="4932"/>
+            <w:vAlign w:val="center"/>
+            <w:tcMar>
+              <w:top w:w="32" w:type="dxa"/>
+              <w:start w:w="55" w:type="dxa"/>
+              <w:bottom w:w="32" w:type="dxa"/>
+              <w:end w:w="55" w:type="dxa"/>
+            </w:tcMar>
+            <w:shd w:fill="0D2538"/>
+          </w:tcPr>
+          <w:p>
+            <w:pPr>
+              <w:spacing w:after="0"/>
+            </w:pPr>
+            <w:r>
+              <w:rPr>
+                <w:rFonts w:ascii="Microsoft YaHei" w:hAnsi="Microsoft YaHei" w:eastAsia="Microsoft YaHei"/>
+                <w:b/>
+                <w:color w:val="FFFFFF"/>
+                <w:sz w:val="13"/>
+              </w:rPr>
+              <w:t>比较指标</w:t>
+            </w:r>
+          </w:p>
+        </w:tc>
+      </w:tr>
+      <w:tr>
+        <w:trPr>
+          <w:cantSplit/>
+        </w:trPr>
+        <w:tc>
+          <w:tcPr>
+            <w:tcW w:type="dxa" w:w="1304"/>
+            <w:vAlign w:val="center"/>
+            <w:tcMar>
+              <w:top w:w="32" w:type="dxa"/>
+              <w:start w:w="55" w:type="dxa"/>
+              <w:bottom w:w="32" w:type="dxa"/>
+              <w:end w:w="55" w:type="dxa"/>
             </w:tcMar>
           </w:tcPr>
           <w:p>
@@ -1652,23 +1616,159 @@
               <w:rPr>
                 <w:rFonts w:ascii="Microsoft YaHei" w:hAnsi="Microsoft YaHei" w:eastAsia="Microsoft YaHei"/>
                 <w:b/>
-                <w:color w:val="FFFFFF"/>
-                <w:sz w:val="14"/>
+                <w:sz w:val="13"/>
               </w:rPr>
-              <w:t>参照</w:t>
+              <w:t>平凡</w:t>
             </w:r>
           </w:p>
         </w:tc>
         <w:tc>
           <w:tcPr>
-            <w:tcW w:type="dxa" w:w="8164"/>
-            <w:shd w:fill="17324D"/>
+            <w:tcW w:type="dxa" w:w="4139"/>
             <w:vAlign w:val="center"/>
             <w:tcMar>
-              <w:top w:w="45" w:type="dxa"/>
-              <w:start w:w="65" w:type="dxa"/>
-              <w:bottom w:w="45" w:type="dxa"/>
-              <w:end w:w="65" w:type="dxa"/>
+              <w:top w:w="32" w:type="dxa"/>
+              <w:start w:w="55" w:type="dxa"/>
+              <w:bottom w:w="32" w:type="dxa"/>
+              <w:end w:w="55" w:type="dxa"/>
+            </w:tcMar>
+          </w:tcPr>
+          <w:p>
+            <w:pPr>
+              <w:spacing w:after="0"/>
+            </w:pPr>
+            <w:r>
+              <w:rPr>
+                <w:rFonts w:ascii="Microsoft YaHei" w:hAnsi="Microsoft YaHei" w:eastAsia="Microsoft YaHei"/>
+                <w:b w:val="0"/>
+                <w:sz w:val="13"/>
+              </w:rPr>
+              <w:t>直接让语言模型回答</w:t>
+            </w:r>
+          </w:p>
+        </w:tc>
+        <w:tc>
+          <w:tcPr>
+            <w:tcW w:type="dxa" w:w="4932"/>
+            <w:vAlign w:val="center"/>
+            <w:tcMar>
+              <w:top w:w="32" w:type="dxa"/>
+              <w:start w:w="55" w:type="dxa"/>
+              <w:bottom w:w="32" w:type="dxa"/>
+              <w:end w:w="55" w:type="dxa"/>
+            </w:tcMar>
+          </w:tcPr>
+          <w:p>
+            <w:pPr>
+              <w:spacing w:after="0"/>
+            </w:pPr>
+            <w:r>
+              <w:rPr>
+                <w:rFonts w:ascii="Microsoft YaHei" w:hAnsi="Microsoft YaHei" w:eastAsia="Microsoft YaHei"/>
+                <w:b w:val="0"/>
+                <w:sz w:val="13"/>
+              </w:rPr>
+              <w:t>类型错误、无来源主张</w:t>
+            </w:r>
+          </w:p>
+        </w:tc>
+      </w:tr>
+      <w:tr>
+        <w:trPr>
+          <w:cantSplit/>
+        </w:trPr>
+        <w:tc>
+          <w:tcPr>
+            <w:tcW w:type="dxa" w:w="1304"/>
+            <w:vAlign w:val="center"/>
+            <w:tcMar>
+              <w:top w:w="32" w:type="dxa"/>
+              <w:start w:w="55" w:type="dxa"/>
+              <w:bottom w:w="32" w:type="dxa"/>
+              <w:end w:w="55" w:type="dxa"/>
+            </w:tcMar>
+            <w:shd w:fill="F7F8F7"/>
+          </w:tcPr>
+          <w:p>
+            <w:pPr>
+              <w:spacing w:after="0"/>
+            </w:pPr>
+            <w:r>
+              <w:rPr>
+                <w:rFonts w:ascii="Microsoft YaHei" w:hAnsi="Microsoft YaHei" w:eastAsia="Microsoft YaHei"/>
+                <w:b/>
+                <w:sz w:val="13"/>
+              </w:rPr>
+              <w:t>无干预</w:t>
+            </w:r>
+          </w:p>
+        </w:tc>
+        <w:tc>
+          <w:tcPr>
+            <w:tcW w:type="dxa" w:w="4139"/>
+            <w:vAlign w:val="center"/>
+            <w:tcMar>
+              <w:top w:w="32" w:type="dxa"/>
+              <w:start w:w="55" w:type="dxa"/>
+              <w:bottom w:w="32" w:type="dxa"/>
+              <w:end w:w="55" w:type="dxa"/>
+            </w:tcMar>
+            <w:shd w:fill="F7F8F7"/>
+          </w:tcPr>
+          <w:p>
+            <w:pPr>
+              <w:spacing w:after="0"/>
+            </w:pPr>
+            <w:r>
+              <w:rPr>
+                <w:rFonts w:ascii="Microsoft YaHei" w:hAnsi="Microsoft YaHei" w:eastAsia="Microsoft YaHei"/>
+                <w:b w:val="0"/>
+                <w:sz w:val="13"/>
+              </w:rPr>
+              <w:t>不修正输入的关键词检索</w:t>
+            </w:r>
+          </w:p>
+        </w:tc>
+        <w:tc>
+          <w:tcPr>
+            <w:tcW w:type="dxa" w:w="4932"/>
+            <w:vAlign w:val="center"/>
+            <w:tcMar>
+              <w:top w:w="32" w:type="dxa"/>
+              <w:start w:w="55" w:type="dxa"/>
+              <w:bottom w:w="32" w:type="dxa"/>
+              <w:end w:w="55" w:type="dxa"/>
+            </w:tcMar>
+            <w:shd w:fill="F7F8F7"/>
+          </w:tcPr>
+          <w:p>
+            <w:pPr>
+              <w:spacing w:after="0"/>
+            </w:pPr>
+            <w:r>
+              <w:rPr>
+                <w:rFonts w:ascii="Microsoft YaHei" w:hAnsi="Microsoft YaHei" w:eastAsia="Microsoft YaHei"/>
+                <w:b w:val="0"/>
+                <w:sz w:val="13"/>
+              </w:rPr>
+              <w:t>是否发现欠定并改变行动</w:t>
+            </w:r>
+          </w:p>
+        </w:tc>
+      </w:tr>
+      <w:tr>
+        <w:trPr>
+          <w:cantSplit/>
+        </w:trPr>
+        <w:tc>
+          <w:tcPr>
+            <w:tcW w:type="dxa" w:w="1304"/>
+            <w:vAlign w:val="center"/>
+            <w:tcMar>
+              <w:top w:w="32" w:type="dxa"/>
+              <w:start w:w="55" w:type="dxa"/>
+              <w:bottom w:w="32" w:type="dxa"/>
+              <w:end w:w="55" w:type="dxa"/>
             </w:tcMar>
           </w:tcPr>
           <w:p>
@@ -1679,10 +1779,59 @@
               <w:rPr>
                 <w:rFonts w:ascii="Microsoft YaHei" w:hAnsi="Microsoft YaHei" w:eastAsia="Microsoft YaHei"/>
                 <w:b/>
-                <w:color w:val="FFFFFF"/>
-                <w:sz w:val="14"/>
+                <w:sz w:val="13"/>
               </w:rPr>
-              <w:t>同预算比较</w:t>
+              <w:t>随机</w:t>
+            </w:r>
+          </w:p>
+        </w:tc>
+        <w:tc>
+          <w:tcPr>
+            <w:tcW w:type="dxa" w:w="4139"/>
+            <w:vAlign w:val="center"/>
+            <w:tcMar>
+              <w:top w:w="32" w:type="dxa"/>
+              <w:start w:w="55" w:type="dxa"/>
+              <w:bottom w:w="32" w:type="dxa"/>
+              <w:end w:w="55" w:type="dxa"/>
+            </w:tcMar>
+          </w:tcPr>
+          <w:p>
+            <w:pPr>
+              <w:spacing w:after="0"/>
+            </w:pPr>
+            <w:r>
+              <w:rPr>
+                <w:rFonts w:ascii="Microsoft YaHei" w:hAnsi="Microsoft YaHei" w:eastAsia="Microsoft YaHei"/>
+                <w:b w:val="0"/>
+                <w:sz w:val="13"/>
+              </w:rPr>
+              <w:t>随机选择基算子或候选</w:t>
+            </w:r>
+          </w:p>
+        </w:tc>
+        <w:tc>
+          <w:tcPr>
+            <w:tcW w:type="dxa" w:w="4932"/>
+            <w:vAlign w:val="center"/>
+            <w:tcMar>
+              <w:top w:w="32" w:type="dxa"/>
+              <w:start w:w="55" w:type="dxa"/>
+              <w:bottom w:w="32" w:type="dxa"/>
+              <w:end w:w="55" w:type="dxa"/>
+            </w:tcMar>
+          </w:tcPr>
+          <w:p>
+            <w:pPr>
+              <w:spacing w:after="0"/>
+            </w:pPr>
+            <w:r>
+              <w:rPr>
+                <w:rFonts w:ascii="Microsoft YaHei" w:hAnsi="Microsoft YaHei" w:eastAsia="Microsoft YaHei"/>
+                <w:b w:val="0"/>
+                <w:sz w:val="13"/>
+              </w:rPr>
+              <w:t>有效反例、正确拒答率</w:t>
             </w:r>
           </w:p>
         </w:tc>
@@ -1693,14 +1842,15 @@
         </w:trPr>
         <w:tc>
           <w:tcPr>
-            <w:tcW w:type="dxa" w:w="1757"/>
+            <w:tcW w:type="dxa" w:w="1304"/>
             <w:vAlign w:val="center"/>
             <w:tcMar>
-              <w:top w:w="45" w:type="dxa"/>
-              <w:start w:w="65" w:type="dxa"/>
-              <w:bottom w:w="45" w:type="dxa"/>
-              <w:end w:w="65" w:type="dxa"/>
+              <w:top w:w="32" w:type="dxa"/>
+              <w:start w:w="55" w:type="dxa"/>
+              <w:bottom w:w="32" w:type="dxa"/>
+              <w:end w:w="55" w:type="dxa"/>
             </w:tcMar>
+            <w:shd w:fill="F7F8F7"/>
           </w:tcPr>
           <w:p>
             <w:pPr>
@@ -1710,22 +1860,23 @@
               <w:rPr>
                 <w:rFonts w:ascii="Microsoft YaHei" w:hAnsi="Microsoft YaHei" w:eastAsia="Microsoft YaHei"/>
                 <w:b/>
-                <w:sz w:val="14"/>
+                <w:sz w:val="13"/>
               </w:rPr>
-              <w:t>平凡</w:t>
+              <w:t>非平凡</w:t>
             </w:r>
           </w:p>
         </w:tc>
         <w:tc>
           <w:tcPr>
-            <w:tcW w:type="dxa" w:w="8164"/>
+            <w:tcW w:type="dxa" w:w="4139"/>
             <w:vAlign w:val="center"/>
             <w:tcMar>
-              <w:top w:w="45" w:type="dxa"/>
-              <w:start w:w="65" w:type="dxa"/>
-              <w:bottom w:w="45" w:type="dxa"/>
-              <w:end w:w="65" w:type="dxa"/>
+              <w:top w:w="32" w:type="dxa"/>
+              <w:start w:w="55" w:type="dxa"/>
+              <w:bottom w:w="32" w:type="dxa"/>
+              <w:end w:w="55" w:type="dxa"/>
             </w:tcMar>
+            <w:shd w:fill="F7F8F7"/>
           </w:tcPr>
           <w:p>
             <w:pPr>
@@ -1735,54 +1886,23 @@
               <w:rPr>
                 <w:rFonts w:ascii="Microsoft YaHei" w:hAnsi="Microsoft YaHei" w:eastAsia="Microsoft YaHei"/>
                 <w:b w:val="0"/>
-                <w:sz w:val="14"/>
+                <w:sz w:val="13"/>
               </w:rPr>
-              <w:t>只过 AST/schema；若不给数学反例则不合格。</w:t>
-            </w:r>
-          </w:p>
-        </w:tc>
-      </w:tr>
-      <w:tr>
-        <w:trPr>
-          <w:cantSplit/>
-        </w:trPr>
-        <w:tc>
-          <w:tcPr>
-            <w:tcW w:type="dxa" w:w="1757"/>
-            <w:vAlign w:val="center"/>
-            <w:tcMar>
-              <w:top w:w="45" w:type="dxa"/>
-              <w:start w:w="65" w:type="dxa"/>
-              <w:bottom w:w="45" w:type="dxa"/>
-              <w:end w:w="65" w:type="dxa"/>
-            </w:tcMar>
-            <w:shd w:fill="F2F4F5"/>
-          </w:tcPr>
-          <w:p>
-            <w:pPr>
-              <w:spacing w:after="0"/>
-            </w:pPr>
-            <w:r>
-              <w:rPr>
-                <w:rFonts w:ascii="Microsoft YaHei" w:hAnsi="Microsoft YaHei" w:eastAsia="Microsoft YaHei"/>
-                <w:b/>
-                <w:sz w:val="14"/>
-              </w:rPr>
-              <w:t>无干预</w:t>
+              <w:t>确定性配平＋目标完备性＋结构化检索</w:t>
             </w:r>
           </w:p>
         </w:tc>
         <w:tc>
           <w:tcPr>
-            <w:tcW w:type="dxa" w:w="8164"/>
+            <w:tcW w:type="dxa" w:w="4932"/>
             <w:vAlign w:val="center"/>
             <w:tcMar>
-              <w:top w:w="45" w:type="dxa"/>
-              <w:start w:w="65" w:type="dxa"/>
-              <w:bottom w:w="45" w:type="dxa"/>
-              <w:end w:w="65" w:type="dxa"/>
+              <w:top w:w="32" w:type="dxa"/>
+              <w:start w:w="55" w:type="dxa"/>
+              <w:bottom w:w="32" w:type="dxa"/>
+              <w:end w:w="55" w:type="dxa"/>
             </w:tcMar>
-            <w:shd w:fill="F2F4F5"/>
+            <w:shd w:fill="F7F8F7"/>
           </w:tcPr>
           <w:p>
             <w:pPr>
@@ -1792,176 +1912,9 @@
               <w:rPr>
                 <w:rFonts w:ascii="Microsoft YaHei" w:hAnsi="Microsoft YaHei" w:eastAsia="Microsoft YaHei"/>
                 <w:b w:val="0"/>
-                <w:sz w:val="14"/>
+                <w:sz w:val="13"/>
               </w:rPr>
-              <w:t>固定 1,2,0.5，不按反馈改动作；本轮未发现失败。</w:t>
-            </w:r>
-          </w:p>
-        </w:tc>
-      </w:tr>
-      <w:tr>
-        <w:trPr>
-          <w:cantSplit/>
-        </w:trPr>
-        <w:tc>
-          <w:tcPr>
-            <w:tcW w:type="dxa" w:w="1757"/>
-            <w:vAlign w:val="center"/>
-            <w:tcMar>
-              <w:top w:w="45" w:type="dxa"/>
-              <w:start w:w="65" w:type="dxa"/>
-              <w:bottom w:w="45" w:type="dxa"/>
-              <w:end w:w="65" w:type="dxa"/>
-            </w:tcMar>
-          </w:tcPr>
-          <w:p>
-            <w:pPr>
-              <w:spacing w:after="0"/>
-            </w:pPr>
-            <w:r>
-              <w:rPr>
-                <w:rFonts w:ascii="Microsoft YaHei" w:hAnsi="Microsoft YaHei" w:eastAsia="Microsoft YaHei"/>
-                <w:b/>
-                <w:sz w:val="14"/>
-              </w:rPr>
-              <w:t>随机</w:t>
-            </w:r>
-          </w:p>
-        </w:tc>
-        <w:tc>
-          <w:tcPr>
-            <w:tcW w:type="dxa" w:w="8164"/>
-            <w:vAlign w:val="center"/>
-            <w:tcMar>
-              <w:top w:w="45" w:type="dxa"/>
-              <w:start w:w="65" w:type="dxa"/>
-              <w:bottom w:w="45" w:type="dxa"/>
-              <w:end w:w="65" w:type="dxa"/>
-            </w:tcMar>
-          </w:tcPr>
-          <w:p>
-            <w:pPr>
-              <w:spacing w:after="0"/>
-            </w:pPr>
-            <w:r>
-              <w:rPr>
-                <w:rFonts w:ascii="Microsoft YaHei" w:hAnsi="Microsoft YaHei" w:eastAsia="Microsoft YaHei"/>
-                <w:b w:val="0"/>
-                <w:sz w:val="14"/>
-              </w:rPr>
-              <w:t>同一 7 点池、5 次、20 种子；统计首次失败步数。</w:t>
-            </w:r>
-          </w:p>
-        </w:tc>
-      </w:tr>
-      <w:tr>
-        <w:trPr>
-          <w:cantSplit/>
-        </w:trPr>
-        <w:tc>
-          <w:tcPr>
-            <w:tcW w:type="dxa" w:w="1757"/>
-            <w:vAlign w:val="center"/>
-            <w:tcMar>
-              <w:top w:w="45" w:type="dxa"/>
-              <w:start w:w="65" w:type="dxa"/>
-              <w:bottom w:w="45" w:type="dxa"/>
-              <w:end w:w="65" w:type="dxa"/>
-            </w:tcMar>
-            <w:shd w:fill="F2F4F5"/>
-          </w:tcPr>
-          <w:p>
-            <w:pPr>
-              <w:spacing w:after="0"/>
-            </w:pPr>
-            <w:r>
-              <w:rPr>
-                <w:rFonts w:ascii="Microsoft YaHei" w:hAnsi="Microsoft YaHei" w:eastAsia="Microsoft YaHei"/>
-                <w:b/>
-                <w:sz w:val="14"/>
-              </w:rPr>
-              <w:t>非平凡</w:t>
-            </w:r>
-          </w:p>
-        </w:tc>
-        <w:tc>
-          <w:tcPr>
-            <w:tcW w:type="dxa" w:w="8164"/>
-            <w:vAlign w:val="center"/>
-            <w:tcMar>
-              <w:top w:w="45" w:type="dxa"/>
-              <w:start w:w="65" w:type="dxa"/>
-              <w:bottom w:w="45" w:type="dxa"/>
-              <w:end w:w="65" w:type="dxa"/>
-            </w:tcMar>
-            <w:shd w:fill="F2F4F5"/>
-          </w:tcPr>
-          <w:p>
-            <w:pPr>
-              <w:spacing w:after="0"/>
-            </w:pPr>
-            <w:r>
-              <w:rPr>
-                <w:rFonts w:ascii="Microsoft YaHei" w:hAnsi="Microsoft YaHei" w:eastAsia="Microsoft YaHei"/>
-                <w:b w:val="0"/>
-                <w:sz w:val="14"/>
-              </w:rPr>
-              <w:t>SymPy continuous_domain；两式实连续域均为 (0,∞)。</w:t>
-            </w:r>
-          </w:p>
-        </w:tc>
-      </w:tr>
-      <w:tr>
-        <w:trPr>
-          <w:cantSplit/>
-        </w:trPr>
-        <w:tc>
-          <w:tcPr>
-            <w:tcW w:type="dxa" w:w="1757"/>
-            <w:vAlign w:val="center"/>
-            <w:tcMar>
-              <w:top w:w="45" w:type="dxa"/>
-              <w:start w:w="65" w:type="dxa"/>
-              <w:bottom w:w="45" w:type="dxa"/>
-              <w:end w:w="65" w:type="dxa"/>
-            </w:tcMar>
-          </w:tcPr>
-          <w:p>
-            <w:pPr>
-              <w:spacing w:after="0"/>
-            </w:pPr>
-            <w:r>
-              <w:rPr>
-                <w:rFonts w:ascii="Microsoft YaHei" w:hAnsi="Microsoft YaHei" w:eastAsia="Microsoft YaHei"/>
-                <w:b/>
-                <w:sz w:val="14"/>
-              </w:rPr>
-              <w:t>精确校准</w:t>
-            </w:r>
-          </w:p>
-        </w:tc>
-        <w:tc>
-          <w:tcPr>
-            <w:tcW w:type="dxa" w:w="8164"/>
-            <w:vAlign w:val="center"/>
-            <w:tcMar>
-              <w:top w:w="45" w:type="dxa"/>
-              <w:start w:w="65" w:type="dxa"/>
-              <w:bottom w:w="45" w:type="dxa"/>
-              <w:end w:w="65" w:type="dxa"/>
-            </w:tcMar>
-          </w:tcPr>
-          <w:p>
-            <w:pPr>
-              <w:spacing w:after="0"/>
-            </w:pPr>
-            <w:r>
-              <w:rPr>
-                <w:rFonts w:ascii="Microsoft YaHei" w:hAnsi="Microsoft YaHei" w:eastAsia="Microsoft YaHei"/>
-                <w:b w:val="0"/>
-                <w:sz w:val="14"/>
-              </w:rPr>
-              <w:t>有限域先查闭合，再逐点查 g(g(x))=f(x)。</w:t>
+              <w:t>可复查结论与失败轨迹</w:t>
             </w:r>
           </w:p>
         </w:tc>
@@ -1969,7 +1922,7 @@
     </w:tbl>
     <w:p>
       <w:pPr>
-        <w:spacing w:after="0"/>
+        <w:spacing w:after="0" w:line="20" w:lineRule="exact"/>
       </w:pPr>
     </w:p>
     <w:p>
@@ -1983,39 +1936,68 @@
     </w:p>
     <w:p>
       <w:pPr>
-        <w:spacing w:after="36"/>
+        <w:spacing w:after="16"/>
+      </w:pPr>
+      <w:r>
+        <w:rPr>
+          <w:rFonts w:ascii="Microsoft YaHei" w:hAnsi="Microsoft YaHei" w:eastAsia="Microsoft YaHei"/>
+          <w:b/>
+          <w:sz w:val="15"/>
+        </w:rPr>
+        <w:t>环境技术通过：</w:t>
+      </w:r>
+      <w:r>
+        <w:rPr>
+          <w:rFonts w:ascii="Microsoft YaHei" w:hAnsi="Microsoft YaHei" w:eastAsia="Microsoft YaHei"/>
+          <w:b w:val="0"/>
+          <w:sz w:val="15"/>
+        </w:rPr>
+        <w:t>alphaXiv＋DOI 接口快速核验完成，并分层记录 DOI 解析、元数据、摘要和实际打开的正文层级；本地无数值验证器对类型、配平与 Aν=0 零错误通过，且不伪造催化数值；人工终审公式、链接、构型标签和结论边界；至少一次反馈确实改变下一查询、候选域或动作。</w:t>
+      </w:r>
+    </w:p>
+    <w:p>
+      <w:pPr>
+        <w:spacing w:after="16"/>
+      </w:pPr>
+      <w:r>
+        <w:rPr>
+          <w:rFonts w:ascii="Microsoft YaHei" w:hAnsi="Microsoft YaHei" w:eastAsia="Microsoft YaHei"/>
+          <w:b/>
+          <w:sz w:val="15"/>
+        </w:rPr>
+        <w:t>科学发现通过：</w:t>
+      </w:r>
+      <w:r>
+        <w:rPr>
+          <w:rFonts w:ascii="Microsoft YaHei" w:hAnsi="Microsoft YaHei" w:eastAsia="Microsoft YaHei"/>
+          <w:b w:val="0"/>
+          <w:sz w:val="15"/>
+        </w:rPr>
+        <w:t>冻结 θ、Cθ、J 与预算后，得到确定性基线没有给出的、可复现的条件—结构关系或稳定负结果，并通过预注册扰动与专业验证。当前 @best 仅达到问题修正／接口验证，科学发现闸门未通过。</w:t>
+      </w:r>
+    </w:p>
+    <w:p>
+      <w:pPr>
+        <w:spacing w:after="30"/>
       </w:pPr>
       <w:r>
         <w:rPr>
           <w:rFonts w:ascii="Microsoft YaHei" w:hAnsi="Microsoft YaHei" w:eastAsia="Microsoft YaHei"/>
           <w:b w:val="0"/>
-          <w:sz w:val="17"/>
+          <w:sz w:val="15"/>
         </w:rPr>
-        <w:t>技术门槛：反馈改变查询；5 步内捕获已知分支失配与零点未定义；轨迹齐全；闭合先验；测试全过。本轮第2步首次失效、三个负点失配、零点未定义，12/12 测试通过（P1/T1）。</w:t>
+        <w:t>任一情形直接失败：无条件排名；元数据冒充实验结论；示意图冒充弛豫结构；有限采样或 sorry 冒充证明；检索失败冒充“不存在”；反馈不改变动作。条件化试跑若仍只得到标题且不优于确定性基线，就应承认切片不成立并缩小问题。</w:t>
       </w:r>
     </w:p>
     <w:p>
       <w:pPr>
-        <w:spacing w:after="36"/>
-      </w:pPr>
-      <w:r>
-        <w:rPr>
-          <w:rFonts w:ascii="Microsoft YaHei" w:hAnsi="Microsoft YaHei" w:eastAsia="Microsoft YaHei"/>
-          <w:b w:val="0"/>
-          <w:sz w:val="16"/>
-        </w:rPr>
-        <w:t>探索门槛：在封存的其他 EML 树中找到至少一个 E1 未直接报告的稳定失败族，且首次失败步数或有效反例数至少一项严格优于随机中位数。本轮自适应=2、随机中位=2，未达门槛；结论是“环境技术通过，科学发现未通过”。若扩大封存集后仍不胜随机，只能降级为验证工具。</w:t>
-      </w:r>
-    </w:p>
-    <w:p>
-      <w:pPr>
-        <w:spacing w:after="24"/>
+        <w:spacing w:before="14" w:after="20"/>
         <w:jc w:val="center"/>
       </w:pPr>
       <w:r>
         <w:drawing>
           <wp:inline xmlns:a="http://schemas.openxmlformats.org/drawingml/2006/main" xmlns:pic="http://schemas.openxmlformats.org/drawingml/2006/picture">
-            <wp:extent cx="6120000" cy="2181827"/>
+            <wp:extent cx="6336000" cy="2580828"/>
             <wp:docPr id="3" name="Picture 3"/>
             <wp:cNvGraphicFramePr>
               <a:graphicFrameLocks noChangeAspect="1"/>
@@ -2024,11 +2006,11 @@
               <a:graphicData uri="http://schemas.openxmlformats.org/drawingml/2006/picture">
                 <pic:pic>
                   <pic:nvPicPr>
-                    <pic:cNvPr id="0" name="page3_baseline_result.png"/>
+                    <pic:cNvPr id="0" name="page3_discovery_gates.png"/>
                     <pic:cNvPicPr/>
                   </pic:nvPicPr>
                   <pic:blipFill>
-                    <a:blip r:embed="rId12"/>
+                    <a:blip r:embed="rId19"/>
                     <a:stretch>
                       <a:fillRect/>
                     </a:stretch>
@@ -2036,7 +2018,7 @@
                   <pic:spPr>
                     <a:xfrm>
                       <a:off x="0" y="0"/>
-                      <a:ext cx="6120000" cy="2181827"/>
+                      <a:ext cx="6336000" cy="2580828"/>
                     </a:xfrm>
                     <a:prstGeom prst="rect"/>
                   </pic:spPr>
@@ -2047,235 +2029,113 @@
         </w:drawing>
       </w:r>
     </w:p>
-    <w:tbl>
-      <w:tblPr>
-        <w:tblStyle w:val="TableGrid"/>
-        <w:tblW w:type="auto" w:w="0"/>
-        <w:jc w:val="center"/>
-        <w:tblLayout w:type="fixed"/>
-        <w:tblLook w:firstColumn="1" w:firstRow="1" w:lastColumn="0" w:lastRow="0" w:noHBand="0" w:noVBand="1" w:val="04A0"/>
-      </w:tblPr>
-      <w:tblGrid>
-        <w:gridCol w:w="2594"/>
-        <w:gridCol w:w="2594"/>
-        <w:gridCol w:w="2594"/>
-        <w:gridCol w:w="2594"/>
-      </w:tblGrid>
-      <w:tr>
-        <w:trPr>
-          <w:cantSplit/>
-        </w:trPr>
-        <w:tc>
-          <w:tcPr>
-            <w:tcW w:type="dxa" w:w="1020"/>
-            <w:tcMar>
-              <w:top w:w="30" w:type="dxa"/>
-              <w:start w:w="65" w:type="dxa"/>
-              <w:bottom w:w="30" w:type="dxa"/>
-              <w:end w:w="65" w:type="dxa"/>
-            </w:tcMar>
-            <w:shd w:fill="EAF2F5"/>
-          </w:tcPr>
-          <w:p>
-            <w:pPr>
-              <w:spacing w:after="0"/>
-            </w:pPr>
-            <w:r>
-              <w:rPr>
-                <w:rFonts w:ascii="Microsoft YaHei" w:hAnsi="Microsoft YaHei" w:eastAsia="Microsoft YaHei"/>
-                <w:b/>
-                <w:color w:val="17324D"/>
-                <w:sz w:val="13"/>
-              </w:rPr>
-              <w:t>证据编号</w:t>
-            </w:r>
-          </w:p>
-        </w:tc>
-        <w:tc>
-          <w:tcPr>
-            <w:tcW w:type="dxa" w:w="3798"/>
-            <w:tcMar>
-              <w:top w:w="30" w:type="dxa"/>
-              <w:start w:w="65" w:type="dxa"/>
-              <w:bottom w:w="30" w:type="dxa"/>
-              <w:end w:w="65" w:type="dxa"/>
-            </w:tcMar>
-          </w:tcPr>
-          <w:p>
-            <w:pPr>
-              <w:spacing w:after="0"/>
-            </w:pPr>
-            <w:r>
-              <w:rPr>
-                <w:rFonts w:ascii="Microsoft YaHei" w:hAnsi="Microsoft YaHei" w:eastAsia="Microsoft YaHei"/>
-                <w:b w:val="0"/>
-                <w:color w:val="66727D"/>
-                <w:sz w:val="13"/>
-              </w:rPr>
-              <w:t>E1、E2；P1、T1</w:t>
-            </w:r>
-          </w:p>
-        </w:tc>
-        <w:tc>
-          <w:tcPr>
-            <w:tcW w:type="dxa" w:w="1020"/>
-            <w:tcMar>
-              <w:top w:w="30" w:type="dxa"/>
-              <w:start w:w="65" w:type="dxa"/>
-              <w:bottom w:w="30" w:type="dxa"/>
-              <w:end w:w="65" w:type="dxa"/>
-            </w:tcMar>
-            <w:shd w:fill="EAF2F5"/>
-          </w:tcPr>
-          <w:p>
-            <w:pPr>
-              <w:spacing w:after="0"/>
-            </w:pPr>
-            <w:r>
-              <w:rPr>
-                <w:rFonts w:ascii="Microsoft YaHei" w:hAnsi="Microsoft YaHei" w:eastAsia="Microsoft YaHei"/>
-                <w:b/>
-                <w:color w:val="17324D"/>
-                <w:sz w:val="13"/>
-              </w:rPr>
-              <w:t>建议视觉</w:t>
-            </w:r>
-          </w:p>
-        </w:tc>
-        <w:tc>
-          <w:tcPr>
-            <w:tcW w:type="dxa" w:w="3798"/>
-            <w:tcMar>
-              <w:top w:w="30" w:type="dxa"/>
-              <w:start w:w="65" w:type="dxa"/>
-              <w:bottom w:w="30" w:type="dxa"/>
-              <w:end w:w="65" w:type="dxa"/>
-            </w:tcMar>
-          </w:tcPr>
-          <w:p>
-            <w:pPr>
-              <w:spacing w:after="0"/>
-            </w:pPr>
-            <w:r>
-              <w:rPr>
-                <w:rFonts w:ascii="Microsoft YaHei" w:hAnsi="Microsoft YaHei" w:eastAsia="Microsoft YaHei"/>
-                <w:b w:val="0"/>
-                <w:color w:val="66727D"/>
-                <w:sz w:val="13"/>
-              </w:rPr>
-              <w:t>首次失败步数对照，显式标平局</w:t>
-            </w:r>
-          </w:p>
-        </w:tc>
-      </w:tr>
-      <w:tr>
-        <w:trPr>
-          <w:cantSplit/>
-        </w:trPr>
-        <w:tc>
-          <w:tcPr>
-            <w:tcW w:type="dxa" w:w="1020"/>
-            <w:tcMar>
-              <w:top w:w="30" w:type="dxa"/>
-              <w:start w:w="65" w:type="dxa"/>
-              <w:bottom w:w="30" w:type="dxa"/>
-              <w:end w:w="65" w:type="dxa"/>
-            </w:tcMar>
-            <w:shd w:fill="EAF2F5"/>
-          </w:tcPr>
-          <w:p>
-            <w:pPr>
-              <w:spacing w:after="0"/>
-            </w:pPr>
-            <w:r>
-              <w:rPr>
-                <w:rFonts w:ascii="Microsoft YaHei" w:hAnsi="Microsoft YaHei" w:eastAsia="Microsoft YaHei"/>
-                <w:b/>
-                <w:color w:val="17324D"/>
-                <w:sz w:val="13"/>
-              </w:rPr>
-              <w:t>人工确认</w:t>
-            </w:r>
-          </w:p>
-        </w:tc>
-        <w:tc>
-          <w:tcPr>
-            <w:tcW w:type="dxa" w:w="3798"/>
-            <w:tcMar>
-              <w:top w:w="30" w:type="dxa"/>
-              <w:start w:w="65" w:type="dxa"/>
-              <w:bottom w:w="30" w:type="dxa"/>
-              <w:end w:w="65" w:type="dxa"/>
-            </w:tcMar>
-          </w:tcPr>
-          <w:p>
-            <w:pPr>
-              <w:spacing w:after="0"/>
-            </w:pPr>
-            <w:r>
-              <w:rPr>
-                <w:rFonts w:ascii="Microsoft YaHei" w:hAnsi="Microsoft YaHei" w:eastAsia="Microsoft YaHei"/>
-                <w:b w:val="0"/>
-                <w:color w:val="66727D"/>
-                <w:sz w:val="13"/>
-              </w:rPr>
-              <w:t>保留未胜随机、无新发现原判。</w:t>
-            </w:r>
-          </w:p>
-        </w:tc>
-        <w:tc>
-          <w:tcPr>
-            <w:tcW w:type="dxa" w:w="1020"/>
-            <w:tcMar>
-              <w:top w:w="30" w:type="dxa"/>
-              <w:start w:w="65" w:type="dxa"/>
-              <w:bottom w:w="30" w:type="dxa"/>
-              <w:end w:w="65" w:type="dxa"/>
-            </w:tcMar>
-            <w:shd w:fill="EAF2F5"/>
-          </w:tcPr>
-          <w:p>
-            <w:pPr>
-              <w:spacing w:after="0"/>
-            </w:pPr>
-            <w:r>
-              <w:rPr>
-                <w:rFonts w:ascii="Microsoft YaHei" w:hAnsi="Microsoft YaHei" w:eastAsia="Microsoft YaHei"/>
-                <w:b/>
-                <w:color w:val="17324D"/>
-                <w:sz w:val="13"/>
-              </w:rPr>
-              <w:t>内容预算</w:t>
-            </w:r>
-          </w:p>
-        </w:tc>
-        <w:tc>
-          <w:tcPr>
-            <w:tcW w:type="dxa" w:w="3798"/>
-            <w:tcMar>
-              <w:top w:w="30" w:type="dxa"/>
-              <w:start w:w="65" w:type="dxa"/>
-              <w:bottom w:w="30" w:type="dxa"/>
-              <w:end w:w="65" w:type="dxa"/>
-            </w:tcMar>
-          </w:tcPr>
-          <w:p>
-            <w:pPr>
-              <w:spacing w:after="0"/>
-            </w:pPr>
-            <w:r>
-              <w:rPr>
-                <w:rFonts w:ascii="Microsoft YaHei" w:hAnsi="Microsoft YaHei" w:eastAsia="Microsoft YaHei"/>
-                <w:b w:val="0"/>
-                <w:color w:val="66727D"/>
-                <w:sz w:val="13"/>
-              </w:rPr>
-              <w:t>700–800 汉字；1 表1图</w:t>
-            </w:r>
-          </w:p>
-        </w:tc>
-      </w:tr>
-    </w:tbl>
+    <w:p>
+      <w:pPr>
+        <w:spacing w:before="10" w:after="0"/>
+        <w:ind w:left="85" w:right="85"/>
+      </w:pPr>
+      <w:r>
+        <w:rPr>
+          <w:rFonts w:ascii="Microsoft YaHei" w:hAnsi="Microsoft YaHei" w:eastAsia="Microsoft YaHei"/>
+          <w:b/>
+          <w:color w:val="245F83"/>
+          <w:sz w:val="12"/>
+        </w:rPr>
+        <w:t>页面字段：</w:t>
+      </w:r>
+      <w:r>
+        <w:rPr>
+          <w:rFonts w:ascii="Microsoft YaHei" w:hAnsi="Microsoft YaHei" w:eastAsia="Microsoft YaHei"/>
+          <w:b w:val="0"/>
+          <w:color w:val="66727D"/>
+          <w:sz w:val="12"/>
+        </w:rPr>
+        <w:t>发现类型、预注册条件、可行域、扰动、四类参照、三道闸门、成功/失败判据。</w:t>
+      </w:r>
+      <w:r>
+        <w:rPr>
+          <w:rFonts w:ascii="Microsoft YaHei" w:hAnsi="Microsoft YaHei" w:eastAsia="Microsoft YaHei"/>
+          <w:b/>
+          <w:color w:val="245F83"/>
+          <w:sz w:val="12"/>
+        </w:rPr>
+        <w:t xml:space="preserve">  文献依据：</w:t>
+      </w:r>
+      <w:hyperlink r:id="rId10" w:history="1">
+        <w:r>
+          <w:rPr>
+            <w:rFonts w:ascii="Microsoft YaHei" w:hAnsi="Microsoft YaHei" w:eastAsia="Microsoft YaHei"/>
+            <w:b w:val="0"/>
+            <w:color w:val="245F83"/>
+            <w:sz w:val="12"/>
+            <w:u w:val="single"/>
+          </w:rPr>
+        </w:r>
+      </w:hyperlink>
+      <w:r>
+        <w:rPr>
+          <w:rFonts w:ascii="Microsoft YaHei" w:hAnsi="Microsoft YaHei" w:eastAsia="Microsoft YaHei"/>
+          <w:b w:val="0"/>
+          <w:color w:val="66727D"/>
+          <w:sz w:val="12"/>
+        </w:rPr>
+        <w:t>；alphaXiv 读取收据；本地精确内核与浏览器收据。</w:t>
+      </w:r>
+      <w:r>
+        <w:rPr>
+          <w:rFonts w:ascii="Microsoft YaHei" w:hAnsi="Microsoft YaHei" w:eastAsia="Microsoft YaHei"/>
+          <w:b/>
+          <w:color w:val="245F83"/>
+          <w:sz w:val="12"/>
+        </w:rPr>
+        <w:t xml:space="preserve">  建议视觉：</w:t>
+      </w:r>
+      <w:r>
+        <w:rPr>
+          <w:rFonts w:ascii="Microsoft YaHei" w:hAnsi="Microsoft YaHei" w:eastAsia="Microsoft YaHei"/>
+          <w:b w:val="0"/>
+          <w:color w:val="66727D"/>
+          <w:sz w:val="12"/>
+        </w:rPr>
+        <w:t>四类发现信号与三道核验闸门。</w:t>
+      </w:r>
+      <w:r>
+        <w:rPr>
+          <w:rFonts w:ascii="Microsoft YaHei" w:hAnsi="Microsoft YaHei" w:eastAsia="Microsoft YaHei"/>
+          <w:b/>
+          <w:color w:val="245F83"/>
+          <w:sz w:val="12"/>
+        </w:rPr>
+        <w:t xml:space="preserve">  人工确认：</w:t>
+      </w:r>
+      <w:r>
+        <w:rPr>
+          <w:rFonts w:ascii="Microsoft YaHei" w:hAnsi="Microsoft YaHei" w:eastAsia="Microsoft YaHei"/>
+          <w:b w:val="0"/>
+          <w:color w:val="66727D"/>
+          <w:sz w:val="12"/>
+        </w:rPr>
+        <w:t>保留 ACS 主页面 403、无催化数值模拟、当前无催化发现。</w:t>
+      </w:r>
+      <w:r>
+        <w:rPr>
+          <w:rFonts w:ascii="Microsoft YaHei" w:hAnsi="Microsoft YaHei" w:eastAsia="Microsoft YaHei"/>
+          <w:b/>
+          <w:color w:val="245F83"/>
+          <w:sz w:val="12"/>
+        </w:rPr>
+        <w:t xml:space="preserve">  内容预算：</w:t>
+      </w:r>
+      <w:r>
+        <w:rPr>
+          <w:rFonts w:ascii="Microsoft YaHei" w:hAnsi="Microsoft YaHei" w:eastAsia="Microsoft YaHei"/>
+          <w:b w:val="0"/>
+          <w:color w:val="66727D"/>
+          <w:sz w:val="12"/>
+        </w:rPr>
+        <w:t>约 800 字＋1 表1图。</w:t>
+      </w:r>
+    </w:p>
     <w:p>
       <w:r>
         <w:br w:type="page"/>
@@ -2301,71 +2161,43 @@
     </w:p>
     <w:p>
       <w:pPr>
-        <w:spacing w:after="36"/>
+        <w:spacing w:after="30"/>
       </w:pPr>
       <w:r>
         <w:rPr>
           <w:rFonts w:ascii="Microsoft YaHei" w:hAnsi="Microsoft YaHei" w:eastAsia="Microsoft YaHei"/>
           <w:b w:val="0"/>
-          <w:sz w:val="17"/>
+          <w:sz w:val="15"/>
         </w:rPr>
-        <w:t>目标：先验证数学滤镜不把反应、标量目标与几何混为一谈，再验证反馈能从正实一致转向负实反例。输入：默认催化 DSL；冻结 EML ln JSON、7 点池、主分支与 5 次预算。步骤：ReactionDecomposer 配平/守恒/中间体槽位→ObjectiveStructurer 对欠定 @best 弃权→确认 EML not_invoked、GeometryPlugin 独立→运行 EML 自适应/随机/SymPy→保存日志、Lean 与浏览器证据。</w:t>
+        <w:t>解压后在项目根目录执行同一行命令：</w:t>
       </w:r>
     </w:p>
     <w:p>
       <w:pPr>
         <w:spacing w:after="40"/>
-        <w:ind w:left="198"/>
+        <w:jc w:val="center"/>
       </w:pPr>
       <w:r>
         <w:rPr>
           <w:rFonts w:ascii="Consolas" w:hAnsi="Consolas" w:eastAsia="Consolas"/>
-          <w:b w:val="0"/>
-          <w:color w:val="17324D"/>
-          <w:sz w:val="15"/>
+          <w:b/>
+          <w:color w:val="0D2538"/>
+          <w:sz w:val="20"/>
         </w:rPr>
-        <w:t>python demo/run_demo.py</w:t>
-      </w:r>
-      <w:r>
-        <w:rPr>
-          <w:rFonts w:ascii="Consolas" w:hAnsi="Consolas" w:eastAsia="Consolas"/>
-          <w:b w:val="0"/>
-          <w:color w:val="17324D"/>
-          <w:sz w:val="15"/>
-        </w:rPr>
-        <w:br/>
-        <w:t>python -m pytest -q demo/test_demo.py panel/test_panel.py</w:t>
-      </w:r>
-      <w:r>
-        <w:rPr>
-          <w:rFonts w:ascii="Consolas" w:hAnsi="Consolas" w:eastAsia="Consolas"/>
-          <w:b w:val="0"/>
-          <w:color w:val="17324D"/>
-          <w:sz w:val="15"/>
-        </w:rPr>
-        <w:br/>
-        <w:t>python panel/serve_panel.py  # open :8766</w:t>
+        <w:t>python3 run.py</w:t>
       </w:r>
     </w:p>
     <w:p>
       <w:pPr>
-        <w:spacing w:after="36"/>
+        <w:spacing w:after="30"/>
       </w:pPr>
       <w:r>
         <w:rPr>
           <w:rFonts w:ascii="Microsoft YaHei" w:hAnsi="Microsoft YaHei" w:eastAsia="Microsoft YaHei"/>
-          <w:b/>
-          <w:sz w:val="16"/>
+          <w:b w:val="0"/>
+          <w:sz w:val="15"/>
         </w:rPr>
-        <w:t>实际结果：</w:t>
-      </w:r>
-      <w:r>
-        <w:rPr>
-          <w:rFonts w:ascii="Microsoft YaHei" w:hAnsi="Microsoft YaHei" w:eastAsia="Microsoft YaHei"/>
-          <w:b w:val="0"/>
-          <w:sz w:val="16"/>
-        </w:rPr>
-        <w:t>Demo 12 项、双面板 11 项及真实 Chrome 桌面/移动验收通过；输出含 KaTeX、N/S/C/Y/G/P、未排名文献候选与示意 2D/3D；默认内核无外网请求、无模型调用。Lean 本地义务通过，上游文件 accepted_with_sorry。</w:t>
+        <w:t>浏览器打开终端给出的本地地址，保留默认查询并点击一次“运行”。应看到原输入不守恒、配平方程与 Aν=0、目标因条件和测量缺失而欠定、六个相连空间、未排名文献候选及“示意、未经弛豫”的二维/三维构型。离线检查为 python3 run.py --check。默认启动只用相对路径与 Python 标准库；特定算子的符号分支比较才需要 SymPy。Windows 已实测；Linux/macOS 仍须真实复跑。</w:t>
       </w:r>
     </w:p>
     <w:p>
@@ -2379,9 +2211,7 @@
     </w:p>
     <w:p>
       <w:pPr>
-        <w:pStyle w:val="ListBullet"/>
-        <w:spacing w:after="22"/>
-        <w:ind w:left="238" w:hanging="125"/>
+        <w:spacing w:after="30"/>
       </w:pPr>
       <w:r>
         <w:rPr>
@@ -2389,97 +2219,7 @@
           <w:b w:val="0"/>
           <w:sz w:val="15"/>
         </w:rPr>
-        <w:t>已知例冒充发现：校准集与 holdout 新表达式严格分离。</w:t>
-      </w:r>
-    </w:p>
-    <w:p>
-      <w:pPr>
-        <w:pStyle w:val="ListBullet"/>
-        <w:spacing w:after="22"/>
-        <w:ind w:left="238" w:hanging="125"/>
-      </w:pPr>
-      <w:r>
-        <w:rPr>
-          <w:rFonts w:ascii="Microsoft YaHei" w:hAnsi="Microsoft YaHei" w:eastAsia="Microsoft YaHei"/>
-          <w:b w:val="0"/>
-          <w:sz w:val="15"/>
-        </w:rPr>
-        <w:t>后端分支差异：SymPy 与递归 cmath 轨迹都保存，不挑有利后端。</w:t>
-      </w:r>
-    </w:p>
-    <w:p>
-      <w:pPr>
-        <w:pStyle w:val="ListBullet"/>
-        <w:spacing w:after="22"/>
-        <w:ind w:left="238" w:hanging="125"/>
-      </w:pPr>
-      <w:r>
-        <w:rPr>
-          <w:rFonts w:ascii="Microsoft YaHei" w:hAnsi="Microsoft YaHei" w:eastAsia="Microsoft YaHei"/>
-          <w:b w:val="0"/>
-          <w:sz w:val="15"/>
-        </w:rPr>
-        <w:t>采样冒充证明：数值一致不是恒等证明；Lean 含 sorry 即部分形式化。</w:t>
-      </w:r>
-    </w:p>
-    <w:p>
-      <w:pPr>
-        <w:pStyle w:val="ListBullet"/>
-        <w:spacing w:after="22"/>
-        <w:ind w:left="238" w:hanging="125"/>
-      </w:pPr>
-      <w:r>
-        <w:rPr>
-          <w:rFonts w:ascii="Microsoft YaHei" w:hAnsi="Microsoft YaHei" w:eastAsia="Microsoft YaHei"/>
-          <w:b w:val="0"/>
-          <w:sz w:val="15"/>
-        </w:rPr>
-        <w:t>Agent 伪装：当前是确定性策略；反馈不改变动作即判失败。</w:t>
-      </w:r>
-    </w:p>
-    <w:p>
-      <w:pPr>
-        <w:pStyle w:val="ListBullet"/>
-        <w:spacing w:after="22"/>
-        <w:ind w:left="238" w:hanging="125"/>
-      </w:pPr>
-      <w:r>
-        <w:rPr>
-          <w:rFonts w:ascii="Microsoft YaHei" w:hAnsi="Microsoft YaHei" w:eastAsia="Microsoft YaHei"/>
-          <w:b w:val="0"/>
-          <w:sz w:val="15"/>
-        </w:rPr>
-        <w:t>基线过弱：下一轮加入固定边界扫描；不得只和随机比。</w:t>
-      </w:r>
-    </w:p>
-    <w:p>
-      <w:pPr>
-        <w:pStyle w:val="ListBullet"/>
-        <w:spacing w:after="22"/>
-        <w:ind w:left="238" w:hanging="125"/>
-      </w:pPr>
-      <w:r>
-        <w:rPr>
-          <w:rFonts w:ascii="Microsoft YaHei" w:hAnsi="Microsoft YaHei" w:eastAsia="Microsoft YaHei"/>
-          <w:b w:val="0"/>
-          <w:sz w:val="15"/>
-        </w:rPr>
-        <w:t>插件越权：EML 若接到配平、机理或 3D 坐标，路由测试立即失败。</w:t>
-      </w:r>
-    </w:p>
-    <w:p>
-      <w:pPr>
-        <w:pStyle w:val="ListBullet"/>
-        <w:spacing w:after="22"/>
-        <w:ind w:left="238" w:hanging="125"/>
-      </w:pPr>
-      <w:r>
-        <w:rPr>
-          <w:rFonts w:ascii="Microsoft YaHei" w:hAnsi="Microsoft YaHei" w:eastAsia="Microsoft YaHei"/>
-          <w:b w:val="0"/>
-          <w:sz w:val="15"/>
-        </w:rPr>
-        <w:t>跨域夸张：催化候选/示意构型和 PDE/理论适配器不进入当前科学结论。</w:t>
+        <w:t>核心风险不是报错，而是失败后仍生成可信语气。系统实行“拒绝冒充性失败”：配平失败不排名；条件欠定不输出最佳；仅有元数据不推断实验性能；无坐标只画示意；数值一致不声称形式证明；含占位符只返回部分形式化。本地参数化记录使用 p mod k，旧 Lean 原型却固定为 p mod 10 且最终命题仍含 sorry；因此，对 k≠10 的整齐输出也不能支持原问题。模型超时、接口受限、文献矛盾和几何失败均须保存触发字段、原始状态与下一修复动作。</w:t>
       </w:r>
     </w:p>
     <w:p>
@@ -2493,26 +2233,54 @@
     </w:p>
     <w:p>
       <w:pPr>
-        <w:spacing w:after="36"/>
+        <w:spacing w:after="30"/>
       </w:pPr>
       <w:r>
         <w:rPr>
           <w:rFonts w:ascii="Microsoft YaHei" w:hAnsi="Microsoft YaHei" w:eastAsia="Microsoft YaHei"/>
           <w:b w:val="0"/>
-          <w:sz w:val="16"/>
+          <w:sz w:val="15"/>
         </w:rPr>
-        <w:t>公开 demo/、panel/、冻结合同、日志、结果、测试、截图、来源 URL 和 SHA-256；不打包论文 PDF。第三方在 Python 3.14.2 / SymPy 1.14.0 下应复现配平与弃权、EML 第2步失效、随机中位第2步、12+11 项测试和本地 2D/3D 面板。Lean 复跑须保留上游 sorry。</w:t>
+        <w:t>开源包包含单行入口、冻结查询、特定基算子签名、结果 JSON、事件日志、测试收据、来源链接和源码哈希，不收录论文 PDF。复现截图须显示 Aν=0、J(c;θ) 在 θ/Cθ/测量表冻结前未定义、Gₙ=R³ⁿ/SE(3)，以及六个空间之间的带类型映射。发布前在 Ubuntu 与 macOS 各运行 python3 run.py --check；未实测的平台继续标为未验证。</w:t>
       </w:r>
     </w:p>
     <w:p>
       <w:pPr>
-        <w:spacing w:after="24"/>
+        <w:spacing w:before="16" w:after="28"/>
+        <w:jc w:val="center"/>
+      </w:pPr>
+      <w:r>
+        <w:rPr>
+          <w:rFonts w:ascii="Cambria Math" w:hAnsi="Cambria Math" w:eastAsia="Cambria Math"/>
+          <w:b w:val="0"/>
+          <w:color w:val="0D2538"/>
+          <w:sz w:val="17"/>
+        </w:rPr>
+        <w:t>B: ℂ×ℂ^×→ℂ,  B(u,v)=eᵘ−Log(v),  E(x)=B(1, B(B(1,x),1))</w:t>
+      </w:r>
+    </w:p>
+    <w:p>
+      <w:pPr>
+        <w:spacing w:after="20"/>
+      </w:pPr>
+      <w:r>
+        <w:rPr>
+          <w:rFonts w:ascii="Microsoft YaHei" w:hAnsi="Microsoft YaHei" w:eastAsia="Microsoft YaHei"/>
+          <w:b w:val="0"/>
+          <w:sz w:val="14"/>
+        </w:rPr>
+        <w:t>每个 B 节点都检查第二参数非零，并约定 Arg(v)∈(−π,π]、逐点采用主值复对数。测试 x=−1 时，E(−1)=−iπ 而 Log(−1)=+iπ，故 E(−1)−Log(−1)=−2πi；该反例保留为“不匹配”。这只是特定基算子复合表达树，不代表统一代数。</w:t>
+      </w:r>
+    </w:p>
+    <w:p>
+      <w:pPr>
+        <w:spacing w:before="14" w:after="20"/>
         <w:jc w:val="center"/>
       </w:pPr>
       <w:r>
         <w:drawing>
           <wp:inline xmlns:a="http://schemas.openxmlformats.org/drawingml/2006/main" xmlns:pic="http://schemas.openxmlformats.org/drawingml/2006/picture">
-            <wp:extent cx="6120000" cy="1476875"/>
+            <wp:extent cx="5400000" cy="4991250"/>
             <wp:docPr id="4" name="Picture 4"/>
             <wp:cNvGraphicFramePr>
               <a:graphicFrameLocks noChangeAspect="1"/>
@@ -2521,11 +2289,11 @@
               <a:graphicData uri="http://schemas.openxmlformats.org/drawingml/2006/picture">
                 <pic:pic>
                   <pic:nvPicPr>
-                    <pic:cNvPr id="0" name="page4_reproduction.png"/>
+                    <pic:cNvPr id="0" name="page4_function_space_screenshot.png"/>
                     <pic:cNvPicPr/>
                   </pic:nvPicPr>
                   <pic:blipFill>
-                    <a:blip r:embed="rId13"/>
+                    <a:blip r:embed="rId20"/>
                     <a:stretch>
                       <a:fillRect/>
                     </a:stretch>
@@ -2533,7 +2301,7 @@
                   <pic:spPr>
                     <a:xfrm>
                       <a:off x="0" y="0"/>
-                      <a:ext cx="6120000" cy="1476875"/>
+                      <a:ext cx="5400000" cy="4991250"/>
                     </a:xfrm>
                     <a:prstGeom prst="rect"/>
                   </pic:spPr>
@@ -2544,239 +2312,117 @@
         </w:drawing>
       </w:r>
     </w:p>
-    <w:tbl>
-      <w:tblPr>
-        <w:tblStyle w:val="TableGrid"/>
-        <w:tblW w:type="auto" w:w="0"/>
-        <w:jc w:val="center"/>
-        <w:tblLayout w:type="fixed"/>
-        <w:tblLook w:firstColumn="1" w:firstRow="1" w:lastColumn="0" w:lastRow="0" w:noHBand="0" w:noVBand="1" w:val="04A0"/>
-      </w:tblPr>
-      <w:tblGrid>
-        <w:gridCol w:w="2594"/>
-        <w:gridCol w:w="2594"/>
-        <w:gridCol w:w="2594"/>
-        <w:gridCol w:w="2594"/>
-      </w:tblGrid>
-      <w:tr>
-        <w:trPr>
-          <w:cantSplit/>
-        </w:trPr>
-        <w:tc>
-          <w:tcPr>
-            <w:tcW w:type="dxa" w:w="1020"/>
-            <w:tcMar>
-              <w:top w:w="30" w:type="dxa"/>
-              <w:start w:w="65" w:type="dxa"/>
-              <w:bottom w:w="30" w:type="dxa"/>
-              <w:end w:w="65" w:type="dxa"/>
-            </w:tcMar>
-            <w:shd w:fill="EAF2F5"/>
-          </w:tcPr>
-          <w:p>
-            <w:pPr>
-              <w:spacing w:after="0"/>
-            </w:pPr>
-            <w:r>
-              <w:rPr>
-                <w:rFonts w:ascii="Microsoft YaHei" w:hAnsi="Microsoft YaHei" w:eastAsia="Microsoft YaHei"/>
-                <w:b/>
-                <w:color w:val="17324D"/>
-                <w:sz w:val="13"/>
-              </w:rPr>
-              <w:t>证据编号</w:t>
-            </w:r>
-          </w:p>
-        </w:tc>
-        <w:tc>
-          <w:tcPr>
-            <w:tcW w:type="dxa" w:w="3798"/>
-            <w:tcMar>
-              <w:top w:w="30" w:type="dxa"/>
-              <w:start w:w="65" w:type="dxa"/>
-              <w:bottom w:w="30" w:type="dxa"/>
-              <w:end w:w="65" w:type="dxa"/>
-            </w:tcMar>
-          </w:tcPr>
-          <w:p>
-            <w:pPr>
-              <w:spacing w:after="0"/>
-            </w:pPr>
-            <w:r>
-              <w:rPr>
-                <w:rFonts w:ascii="Microsoft YaHei" w:hAnsi="Microsoft YaHei" w:eastAsia="Microsoft YaHei"/>
-                <w:b w:val="0"/>
-                <w:color w:val="66727D"/>
-                <w:sz w:val="13"/>
-              </w:rPr>
-              <w:t>E1、E2、E5；P1、T1、T2、R1、L1、B1</w:t>
-            </w:r>
-          </w:p>
-        </w:tc>
-        <w:tc>
-          <w:tcPr>
-            <w:tcW w:type="dxa" w:w="1020"/>
-            <w:tcMar>
-              <w:top w:w="30" w:type="dxa"/>
-              <w:start w:w="65" w:type="dxa"/>
-              <w:bottom w:w="30" w:type="dxa"/>
-              <w:end w:w="65" w:type="dxa"/>
-            </w:tcMar>
-            <w:shd w:fill="EAF2F5"/>
-          </w:tcPr>
-          <w:p>
-            <w:pPr>
-              <w:spacing w:after="0"/>
-            </w:pPr>
-            <w:r>
-              <w:rPr>
-                <w:rFonts w:ascii="Microsoft YaHei" w:hAnsi="Microsoft YaHei" w:eastAsia="Microsoft YaHei"/>
-                <w:b/>
-                <w:color w:val="17324D"/>
-                <w:sz w:val="13"/>
-              </w:rPr>
-              <w:t>建议视觉</w:t>
-            </w:r>
-          </w:p>
-        </w:tc>
-        <w:tc>
-          <w:tcPr>
-            <w:tcW w:type="dxa" w:w="3798"/>
-            <w:tcMar>
-              <w:top w:w="30" w:type="dxa"/>
-              <w:start w:w="65" w:type="dxa"/>
-              <w:bottom w:w="30" w:type="dxa"/>
-              <w:end w:w="65" w:type="dxa"/>
-            </w:tcMar>
-          </w:tcPr>
-          <w:p>
-            <w:pPr>
-              <w:spacing w:after="0"/>
-            </w:pPr>
-            <w:r>
-              <w:rPr>
-                <w:rFonts w:ascii="Microsoft YaHei" w:hAnsi="Microsoft YaHei" w:eastAsia="Microsoft YaHei"/>
-                <w:b w:val="0"/>
-                <w:color w:val="66727D"/>
-                <w:sz w:val="13"/>
-              </w:rPr>
-              <w:t>输入→运行→日志→测试→Lean/面板</w:t>
-            </w:r>
-          </w:p>
-        </w:tc>
-      </w:tr>
-      <w:tr>
-        <w:trPr>
-          <w:cantSplit/>
-        </w:trPr>
-        <w:tc>
-          <w:tcPr>
-            <w:tcW w:type="dxa" w:w="1020"/>
-            <w:tcMar>
-              <w:top w:w="30" w:type="dxa"/>
-              <w:start w:w="65" w:type="dxa"/>
-              <w:bottom w:w="30" w:type="dxa"/>
-              <w:end w:w="65" w:type="dxa"/>
-            </w:tcMar>
-            <w:shd w:fill="EAF2F5"/>
-          </w:tcPr>
-          <w:p>
-            <w:pPr>
-              <w:spacing w:after="0"/>
-            </w:pPr>
-            <w:r>
-              <w:rPr>
-                <w:rFonts w:ascii="Microsoft YaHei" w:hAnsi="Microsoft YaHei" w:eastAsia="Microsoft YaHei"/>
-                <w:b/>
-                <w:color w:val="17324D"/>
-                <w:sz w:val="13"/>
-              </w:rPr>
-              <w:t>人工确认</w:t>
-            </w:r>
-          </w:p>
-        </w:tc>
-        <w:tc>
-          <w:tcPr>
-            <w:tcW w:type="dxa" w:w="3798"/>
-            <w:tcMar>
-              <w:top w:w="30" w:type="dxa"/>
-              <w:start w:w="65" w:type="dxa"/>
-              <w:bottom w:w="30" w:type="dxa"/>
-              <w:end w:w="65" w:type="dxa"/>
-            </w:tcMar>
-          </w:tcPr>
-          <w:p>
-            <w:pPr>
-              <w:spacing w:after="0"/>
-            </w:pPr>
-            <w:r>
-              <w:rPr>
-                <w:rFonts w:ascii="Microsoft YaHei" w:hAnsi="Microsoft YaHei" w:eastAsia="Microsoft YaHei"/>
-                <w:b w:val="0"/>
-                <w:color w:val="66727D"/>
-                <w:sz w:val="13"/>
-              </w:rPr>
-              <w:t>异机复跑；核对 sorry、截图与哈希。</w:t>
-            </w:r>
-          </w:p>
-        </w:tc>
-        <w:tc>
-          <w:tcPr>
-            <w:tcW w:type="dxa" w:w="1020"/>
-            <w:tcMar>
-              <w:top w:w="30" w:type="dxa"/>
-              <w:start w:w="65" w:type="dxa"/>
-              <w:bottom w:w="30" w:type="dxa"/>
-              <w:end w:w="65" w:type="dxa"/>
-            </w:tcMar>
-            <w:shd w:fill="EAF2F5"/>
-          </w:tcPr>
-          <w:p>
-            <w:pPr>
-              <w:spacing w:after="0"/>
-            </w:pPr>
-            <w:r>
-              <w:rPr>
-                <w:rFonts w:ascii="Microsoft YaHei" w:hAnsi="Microsoft YaHei" w:eastAsia="Microsoft YaHei"/>
-                <w:b/>
-                <w:color w:val="17324D"/>
-                <w:sz w:val="13"/>
-              </w:rPr>
-              <w:t>内容预算</w:t>
-            </w:r>
-          </w:p>
-        </w:tc>
-        <w:tc>
-          <w:tcPr>
-            <w:tcW w:type="dxa" w:w="3798"/>
-            <w:tcMar>
-              <w:top w:w="30" w:type="dxa"/>
-              <w:start w:w="65" w:type="dxa"/>
-              <w:bottom w:w="30" w:type="dxa"/>
-              <w:end w:w="65" w:type="dxa"/>
-            </w:tcMar>
-          </w:tcPr>
-          <w:p>
-            <w:pPr>
-              <w:spacing w:after="0"/>
-            </w:pPr>
-            <w:r>
-              <w:rPr>
-                <w:rFonts w:ascii="Microsoft YaHei" w:hAnsi="Microsoft YaHei" w:eastAsia="Microsoft YaHei"/>
-                <w:b w:val="0"/>
-                <w:color w:val="66727D"/>
-                <w:sz w:val="13"/>
-              </w:rPr>
-              <w:t>700–800 汉字；命令+1图</w:t>
-            </w:r>
-          </w:p>
-        </w:tc>
-      </w:tr>
-    </w:tbl>
+    <w:p>
+      <w:pPr>
+        <w:spacing w:before="10" w:after="0"/>
+        <w:ind w:left="85" w:right="85"/>
+      </w:pPr>
+      <w:r>
+        <w:rPr>
+          <w:rFonts w:ascii="Microsoft YaHei" w:hAnsi="Microsoft YaHei" w:eastAsia="Microsoft YaHei"/>
+          <w:b/>
+          <w:color w:val="245F83"/>
+          <w:sz w:val="12"/>
+        </w:rPr>
+        <w:t>页面字段：</w:t>
+      </w:r>
+      <w:r>
+        <w:rPr>
+          <w:rFonts w:ascii="Microsoft YaHei" w:hAnsi="Microsoft YaHei" w:eastAsia="Microsoft YaHei"/>
+          <w:b w:val="0"/>
+          <w:color w:val="66727D"/>
+          <w:sz w:val="12"/>
+        </w:rPr>
+        <w:t>单行命令、冻结输入、预期输出、拒绝冒充规则、平台状态、源码/日志哈希、开源边界。</w:t>
+      </w:r>
+      <w:r>
+        <w:rPr>
+          <w:rFonts w:ascii="Microsoft YaHei" w:hAnsi="Microsoft YaHei" w:eastAsia="Microsoft YaHei"/>
+          <w:b/>
+          <w:color w:val="245F83"/>
+          <w:sz w:val="12"/>
+        </w:rPr>
+        <w:t xml:space="preserve">  文献依据：</w:t>
+      </w:r>
+      <w:hyperlink r:id="rId11" w:history="1">
+        <w:r>
+          <w:rPr>
+            <w:rFonts w:ascii="Microsoft YaHei" w:hAnsi="Microsoft YaHei" w:eastAsia="Microsoft YaHei"/>
+            <w:b w:val="0"/>
+            <w:color w:val="245F83"/>
+            <w:sz w:val="12"/>
+            <w:u w:val="single"/>
+          </w:rPr>
+        </w:r>
+      </w:hyperlink>
+      <w:r>
+        <w:rPr>
+          <w:rFonts w:ascii="Microsoft YaHei" w:hAnsi="Microsoft YaHei" w:eastAsia="Microsoft YaHei"/>
+          <w:b w:val="0"/>
+          <w:color w:val="66727D"/>
+          <w:sz w:val="12"/>
+        </w:rPr>
+        <w:t>；本地数论生成—否证记录；测试、浏览器与 Lean 收据。</w:t>
+      </w:r>
+      <w:r>
+        <w:rPr>
+          <w:rFonts w:ascii="Microsoft YaHei" w:hAnsi="Microsoft YaHei" w:eastAsia="Microsoft YaHei"/>
+          <w:b/>
+          <w:color w:val="245F83"/>
+          <w:sz w:val="12"/>
+        </w:rPr>
+        <w:t xml:space="preserve">  建议视觉：</w:t>
+      </w:r>
+      <w:r>
+        <w:rPr>
+          <w:rFonts w:ascii="Microsoft YaHei" w:hAnsi="Microsoft YaHei" w:eastAsia="Microsoft YaHei"/>
+          <w:b w:val="0"/>
+          <w:color w:val="66727D"/>
+          <w:sz w:val="12"/>
+        </w:rPr>
+        <w:t>含 B:ℂ×ℂ^×→ℂ、E(x)=B(1,B(B(1,x),1))、反例和 Lean 状态的工作台截图。</w:t>
+      </w:r>
+      <w:r>
+        <w:rPr>
+          <w:rFonts w:ascii="Microsoft YaHei" w:hAnsi="Microsoft YaHei" w:eastAsia="Microsoft YaHei"/>
+          <w:b/>
+          <w:color w:val="245F83"/>
+          <w:sz w:val="12"/>
+        </w:rPr>
+        <w:t xml:space="preserve">  人工确认：</w:t>
+      </w:r>
+      <w:r>
+        <w:rPr>
+          <w:rFonts w:ascii="Microsoft YaHei" w:hAnsi="Microsoft YaHei" w:eastAsia="Microsoft YaHei"/>
+          <w:b w:val="0"/>
+          <w:color w:val="66727D"/>
+          <w:sz w:val="12"/>
+        </w:rPr>
+        <w:t>核对命令、平台记录、来源跳转、示意标签与提交哈希；不把设计适配写成跨平台实测。</w:t>
+      </w:r>
+      <w:r>
+        <w:rPr>
+          <w:rFonts w:ascii="Microsoft YaHei" w:hAnsi="Microsoft YaHei" w:eastAsia="Microsoft YaHei"/>
+          <w:b/>
+          <w:color w:val="245F83"/>
+          <w:sz w:val="12"/>
+        </w:rPr>
+        <w:t xml:space="preserve">  内容预算：</w:t>
+      </w:r>
+      <w:r>
+        <w:rPr>
+          <w:rFonts w:ascii="Microsoft YaHei" w:hAnsi="Microsoft YaHei" w:eastAsia="Microsoft YaHei"/>
+          <w:b w:val="0"/>
+          <w:color w:val="66727D"/>
+          <w:sz w:val="12"/>
+        </w:rPr>
+        <w:t>约 650 字＋1 行命令1图。</w:t>
+      </w:r>
+    </w:p>
     <w:sectPr>
       <w:footerReference w:type="default" r:id="rId9"/>
       <w:pgSz w:w="11906" w:h="16838"/>
-      <w:pgMar w:top="709" w:right="765" w:bottom="652" w:left="765" w:header="255" w:footer="255" w:gutter="0"/>
+      <w:pgMar w:top="595" w:right="709" w:bottom="567" w:left="709" w:header="198" w:footer="198" w:gutter="0"/>
       <w:cols w:space="720"/>
       <w:docGrid w:linePitch="360"/>
     </w:sectPr>
@@ -2796,7 +2442,7 @@
         <w:rFonts w:ascii="Microsoft YaHei" w:hAnsi="Microsoft YaHei" w:eastAsia="Microsoft YaHei"/>
         <w:b w:val="0"/>
         <w:color w:val="66727D"/>
-        <w:sz w:val="14"/>
+        <w:sz w:val="13"/>
       </w:rPr>
       <w:t xml:space="preserve">GOAI 开放探索  •  </w:t>
       <w:fldChar w:fldCharType="begin"/>
@@ -3171,11 +2817,11 @@
     <w:qFormat/>
     <w:rsid w:val="00FC693F"/>
     <w:pPr>
-      <w:spacing w:after="36" w:line="240" w:lineRule="auto"/>
+      <w:spacing w:line="240" w:lineRule="auto" w:after="30"/>
     </w:pPr>
     <w:rPr>
       <w:rFonts w:ascii="Microsoft YaHei" w:hAnsi="Microsoft YaHei" w:eastAsia="Microsoft YaHei"/>
-      <w:sz w:val="17"/>
+      <w:sz w:val="15"/>
     </w:rPr>
   </w:style>
   <w:style w:type="paragraph" w:styleId="Header">
@@ -3233,15 +2879,15 @@
     <w:pPr>
       <w:keepNext/>
       <w:keepLines/>
-      <w:spacing w:before="50" w:after="36"/>
+      <w:spacing w:before="40" w:after="28"/>
       <w:outlineLvl w:val="0"/>
     </w:pPr>
     <w:rPr>
       <w:rFonts w:asciiTheme="majorHAnsi" w:eastAsiaTheme="majorEastAsia" w:hAnsiTheme="majorHAnsi" w:cstheme="majorBidi" w:ascii="Microsoft YaHei" w:hAnsi="Microsoft YaHei" w:eastAsia="Microsoft YaHei"/>
       <w:b/>
       <w:bCs/>
-      <w:color w:val="17324D"/>
-      <w:sz w:val="26"/>
+      <w:color w:val="0D2538"/>
+      <w:sz w:val="25"/>
       <w:szCs w:val="28"/>
     </w:rPr>
   </w:style>
@@ -3257,15 +2903,15 @@
     <w:pPr>
       <w:keepNext/>
       <w:keepLines/>
-      <w:spacing w:before="50" w:after="36"/>
+      <w:spacing w:before="40" w:after="28"/>
       <w:outlineLvl w:val="1"/>
     </w:pPr>
     <w:rPr>
       <w:rFonts w:asciiTheme="majorHAnsi" w:eastAsiaTheme="majorEastAsia" w:hAnsiTheme="majorHAnsi" w:cstheme="majorBidi" w:ascii="Microsoft YaHei" w:hAnsi="Microsoft YaHei" w:eastAsia="Microsoft YaHei"/>
       <w:b/>
       <w:bCs/>
-      <w:color w:val="2E6F95"/>
-      <w:sz w:val="20"/>
+      <w:color w:val="245F83"/>
+      <w:sz w:val="19"/>
       <w:szCs w:val="26"/>
     </w:rPr>
   </w:style>
@@ -3281,15 +2927,15 @@
     <w:pPr>
       <w:keepNext/>
       <w:keepLines/>
-      <w:spacing w:before="50" w:after="36"/>
+      <w:spacing w:before="40" w:after="28"/>
       <w:outlineLvl w:val="2"/>
     </w:pPr>
     <w:rPr>
       <w:rFonts w:asciiTheme="majorHAnsi" w:eastAsiaTheme="majorEastAsia" w:hAnsiTheme="majorHAnsi" w:cstheme="majorBidi" w:ascii="Microsoft YaHei" w:hAnsi="Microsoft YaHei" w:eastAsia="Microsoft YaHei"/>
       <w:b/>
       <w:bCs/>
-      <w:color w:val="17324D"/>
-      <w:sz w:val="18"/>
+      <w:color w:val="0D2538"/>
+      <w:sz w:val="17"/>
     </w:rPr>
   </w:style>
   <w:style w:type="paragraph" w:styleId="Heading4">
@@ -3524,16 +3170,16 @@
       <w:pBdr>
         <w:bottom w:val="single" w:sz="8" w:space="4" w:color="4F81BD" w:themeColor="accent1"/>
       </w:pBdr>
-      <w:spacing w:after="36" w:line="240" w:lineRule="auto" w:before="0"/>
+      <w:spacing w:after="28" w:line="240" w:lineRule="auto" w:before="40"/>
       <w:contextualSpacing/>
     </w:pPr>
     <w:rPr>
       <w:rFonts w:asciiTheme="majorHAnsi" w:eastAsiaTheme="majorEastAsia" w:hAnsiTheme="majorHAnsi" w:cstheme="majorBidi" w:ascii="Microsoft YaHei" w:hAnsi="Microsoft YaHei" w:eastAsia="Microsoft YaHei"/>
       <w:b/>
-      <w:color w:val="17324D"/>
+      <w:color w:val="0D2538"/>
       <w:spacing w:val="5"/>
       <w:kern w:val="28"/>
-      <w:sz w:val="32"/>
+      <w:sz w:val="33"/>
       <w:szCs w:val="52"/>
     </w:rPr>
   </w:style>

</xml_diff>

<commit_message>
Refocus demo on literature and public database evidence
</commit_message>
<xml_diff>
--- a/GOAI_四页提交稿_Math_Structurer.docx
+++ b/GOAI_四页提交稿_Math_Structurer.docx
@@ -153,7 +153,7 @@
                 <w:b w:val="0"/>
                 <w:sz w:val="13"/>
               </w:rPr>
-              <w:t>科研代理能否把自然语言科研目标转换为带定义域、状态空间、约束、特定基算子和验证义务的机器问题，并依据失败反馈改变下一轮行动？</w:t>
+              <w:t>科研代理能否把自然语言反应目标转换为反应物、产物、带来源反应能量、催化剂空间几何及文献记录，并利用空值、冲突和几何缺口改变下一轮检索，而不把候选记录冒充发现？</w:t>
             </w:r>
           </w:p>
         </w:tc>
@@ -210,7 +210,7 @@
                 <w:b w:val="0"/>
                 <w:sz w:val="13"/>
               </w:rPr>
-              <w:t>首版只运行 CO2gas+H2gas -- CH3CH2OHgas @best 与 B(u,v)=eᵘ−Log(v) 调试；不声称发现新催化剂、统一代数、自动 PDE 约化或任意半迭代证明。</w:t>
+              <w:t>首版只运行 CO2gas+H2gas -- CH3CH2OHgas @best 和独立的特定基算子调试；@best 只调用固定排序式。温度、压力、候选范围、观测指标和基线为空时仍允许查询。</w:t>
             </w:r>
           </w:p>
         </w:tc>
@@ -265,7 +265,7 @@
                 <w:b w:val="0"/>
                 <w:sz w:val="13"/>
               </w:rPr>
-              <w:t>交互原型 v0.5；配平、守恒、类型化路由、特定算子调试与固定 Lean 义务通过。科学发现闸门未通过。</w:t>
+              <w:t>交互原型 v0.6；Windows 的单行启动、本地识别、结构检查与浏览器试跑均有通过收据，Linux／macOS 尚未实测。当前无统一口径反应能量、催化性能结论或催化剂发现。</w:t>
             </w:r>
           </w:p>
         </w:tc>
@@ -304,7 +304,7 @@
           <w:b w:val="0"/>
           <w:sz w:val="15"/>
         </w:rPr>
-        <w:t>化学实验与数学研究都可能表现为“固定对象与约束—由有限结构生成候选—以反馈修订”的过程；相似之处是工作流，而非统一代数。CO₂ 加氢制乙醇的候选必须携带组分邻近方式、温压、进料和测量口径。Wang 等组合 Na–Fe@C 与 K–CuZnAl；ACS Figshare 官方记录写明，原位表征与 DFT 计算提示催化界面、组件邻近方式及醛类中间体具有重要作用。这支持按条件组织候选，却不支持脱离条件的全局最佳排名（</w:t>
+        <w:t>化学实验中的一句自然语言目标常把反应、能量口径、催化剂记录、空间结构和排序依据混在一起。以 CO₂ 与 H₂ 生成乙醇为例，Wang 等讨论 Na–Fe@C、K–CuZnAl、界面及组分邻近方式，说明候选必须携带来源和结构上下文，却不支持由题名或元数据直接推出跨论文性能次序（</w:t>
       </w:r>
       <w:hyperlink r:id="rId10" w:history="1">
         <w:r>
@@ -315,6 +315,7 @@
             <w:sz w:val="15"/>
             <w:u w:val="single"/>
           </w:rPr>
+          <w:t>Wang et al., 2021</w:t>
         </w:r>
       </w:hyperlink>
       <w:r>
@@ -325,19 +326,6 @@
         </w:rPr>
         <w:t>）。</w:t>
       </w:r>
-    </w:p>
-    <w:p>
-      <w:pPr>
-        <w:spacing w:after="30"/>
-      </w:pPr>
-      <w:r>
-        <w:rPr>
-          <w:rFonts w:ascii="Microsoft YaHei" w:hAnsi="Microsoft YaHei" w:eastAsia="Microsoft YaHei"/>
-          <w:b w:val="0"/>
-          <w:sz w:val="15"/>
-        </w:rPr>
-        <w:t>半迭代是在指定 X 上寻找 g:X→X 使 g∘g=f。Kozyra 给出有限自映射的函数图判据；Murugan 与 Palanivel 仅在非单调性高度为 1 的连续非分段单调函数类中获得存在性结果，并另行研究 Hyers–Ulam 稳定性；二者均不能外推到任意光滑函数（</w:t>
-      </w:r>
       <w:hyperlink r:id="rId11" w:history="1">
         <w:r>
           <w:rPr>
@@ -347,6 +335,7 @@
             <w:sz w:val="15"/>
             <w:u w:val="single"/>
           </w:rPr>
+          <w:t>Pd₁/Fe₃O₄ 2018</w:t>
         </w:r>
       </w:hyperlink>
       <w:r>
@@ -355,7 +344,7 @@
           <w:b w:val="0"/>
           <w:sz w:val="15"/>
         </w:rPr>
-        <w:t>；</w:t>
+        <w:t xml:space="preserve"> 与 </w:t>
       </w:r>
       <w:hyperlink r:id="rId12" w:history="1">
         <w:r>
@@ -366,6 +355,7 @@
             <w:sz w:val="15"/>
             <w:u w:val="single"/>
           </w:rPr>
+          <w:t>Cu@Na-Beta 2020</w:t>
         </w:r>
       </w:hyperlink>
       <w:r>
@@ -374,64 +364,7 @@
           <w:b w:val="0"/>
           <w:sz w:val="15"/>
         </w:rPr>
-        <w:t>）。Güngör 综述说明 PDE 对称可减少独立变量、ODE 对称可降低阶数；所引两项代表工作分别将李对称用于数据增强和自监督表征，但不解决通用生成元、边界兼容或精确约化（</w:t>
-      </w:r>
-      <w:hyperlink r:id="rId13" w:history="1">
-        <w:r>
-          <w:rPr>
-            <w:rFonts w:ascii="Microsoft YaHei" w:hAnsi="Microsoft YaHei" w:eastAsia="Microsoft YaHei"/>
-            <w:b w:val="0"/>
-            <w:color w:val="245F83"/>
-            <w:sz w:val="15"/>
-            <w:u w:val="single"/>
-          </w:rPr>
-        </w:r>
-      </w:hyperlink>
-      <w:r>
-        <w:rPr>
-          <w:rFonts w:ascii="Microsoft YaHei" w:hAnsi="Microsoft YaHei" w:eastAsia="Microsoft YaHei"/>
-          <w:b w:val="0"/>
-          <w:sz w:val="15"/>
-        </w:rPr>
-        <w:t>；</w:t>
-      </w:r>
-      <w:hyperlink r:id="rId14" w:history="1">
-        <w:r>
-          <w:rPr>
-            <w:rFonts w:ascii="Microsoft YaHei" w:hAnsi="Microsoft YaHei" w:eastAsia="Microsoft YaHei"/>
-            <w:b w:val="0"/>
-            <w:color w:val="245F83"/>
-            <w:sz w:val="15"/>
-            <w:u w:val="single"/>
-          </w:rPr>
-        </w:r>
-      </w:hyperlink>
-      <w:r>
-        <w:rPr>
-          <w:rFonts w:ascii="Microsoft YaHei" w:hAnsi="Microsoft YaHei" w:eastAsia="Microsoft YaHei"/>
-          <w:b w:val="0"/>
-          <w:sz w:val="15"/>
-        </w:rPr>
-        <w:t>；</w:t>
-      </w:r>
-      <w:hyperlink r:id="rId15" w:history="1">
-        <w:r>
-          <w:rPr>
-            <w:rFonts w:ascii="Microsoft YaHei" w:hAnsi="Microsoft YaHei" w:eastAsia="Microsoft YaHei"/>
-            <w:b w:val="0"/>
-            <w:color w:val="245F83"/>
-            <w:sz w:val="15"/>
-            <w:u w:val="single"/>
-          </w:rPr>
-        </w:r>
-      </w:hyperlink>
-      <w:r>
-        <w:rPr>
-          <w:rFonts w:ascii="Microsoft YaHei" w:hAnsi="Microsoft YaHei" w:eastAsia="Microsoft YaHei"/>
-          <w:b w:val="0"/>
-          <w:sz w:val="15"/>
-        </w:rPr>
-        <w:t>）。</w:t>
+        <w:t xml:space="preserve"> 只能先作为可追溯检索候选。</w:t>
       </w:r>
     </w:p>
     <w:p>
@@ -442,9 +375,109 @@
         <w:rPr>
           <w:rFonts w:ascii="Microsoft YaHei" w:hAnsi="Microsoft YaHei" w:eastAsia="Microsoft YaHei"/>
           <w:b w:val="0"/>
-          <w:sz w:val="15"/>
+          <w:sz w:val="14"/>
         </w:rPr>
-        <w:t>本地数论族 fₖ(n)=kP⁺(n)+(P⁺(n) mod k) 可生成轨道并检查素性、最大质因子、同余与闭合；旧 Lean 原型把本应参数化的模数固化为 10，最终命题仍以 sorry 占位，说明生成必须与定义检查和否证器绑定。这些场景都由有限结构生成候选，但缺少经验证的 AI 工具接口；该缺口仍是待检验假设。</w:t>
+        <w:t>数学研究也常呈现“有限结构生成候选—验证器给出反例—下一轮改变表示”。半迭代是在指定 X 上寻找 g:X→X 使 g∘g=f，其存在性依赖函数图或受限连续函数类的内部结构（</w:t>
+      </w:r>
+      <w:hyperlink r:id="rId13" w:history="1">
+        <w:r>
+          <w:rPr>
+            <w:rFonts w:ascii="Microsoft YaHei" w:hAnsi="Microsoft YaHei" w:eastAsia="Microsoft YaHei"/>
+            <w:b w:val="0"/>
+            <w:color w:val="245F83"/>
+            <w:sz w:val="14"/>
+            <w:u w:val="single"/>
+          </w:rPr>
+          <w:t>Kozyra, 2021</w:t>
+        </w:r>
+      </w:hyperlink>
+      <w:r>
+        <w:rPr>
+          <w:rFonts w:ascii="Microsoft YaHei" w:hAnsi="Microsoft YaHei" w:eastAsia="Microsoft YaHei"/>
+          <w:b w:val="0"/>
+          <w:sz w:val="14"/>
+        </w:rPr>
+        <w:t>；</w:t>
+      </w:r>
+      <w:hyperlink r:id="rId14" w:history="1">
+        <w:r>
+          <w:rPr>
+            <w:rFonts w:ascii="Microsoft YaHei" w:hAnsi="Microsoft YaHei" w:eastAsia="Microsoft YaHei"/>
+            <w:b w:val="0"/>
+            <w:color w:val="245F83"/>
+            <w:sz w:val="14"/>
+            <w:u w:val="single"/>
+          </w:rPr>
+          <w:t>Murugan &amp; Palanivel, 2021</w:t>
+        </w:r>
+      </w:hyperlink>
+      <w:r>
+        <w:rPr>
+          <w:rFonts w:ascii="Microsoft YaHei" w:hAnsi="Microsoft YaHei" w:eastAsia="Microsoft YaHei"/>
+          <w:b w:val="0"/>
+          <w:sz w:val="14"/>
+        </w:rPr>
+        <w:t>）。李对称可压缩微分方程变量并支持机器学习表征；本地 MATHs/math 3624 number theory 生成器则产生轨道后检查素性、同余和闭合（</w:t>
+      </w:r>
+      <w:hyperlink r:id="rId15" w:history="1">
+        <w:r>
+          <w:rPr>
+            <w:rFonts w:ascii="Microsoft YaHei" w:hAnsi="Microsoft YaHei" w:eastAsia="Microsoft YaHei"/>
+            <w:b w:val="0"/>
+            <w:color w:val="245F83"/>
+            <w:sz w:val="14"/>
+            <w:u w:val="single"/>
+          </w:rPr>
+          <w:t>Güngör, arXiv:1901.01543v11, 2025</w:t>
+        </w:r>
+      </w:hyperlink>
+      <w:r>
+        <w:rPr>
+          <w:rFonts w:ascii="Microsoft YaHei" w:hAnsi="Microsoft YaHei" w:eastAsia="Microsoft YaHei"/>
+          <w:b w:val="0"/>
+          <w:sz w:val="14"/>
+        </w:rPr>
+        <w:t>；</w:t>
+      </w:r>
+      <w:hyperlink r:id="rId16" w:history="1">
+        <w:r>
+          <w:rPr>
+            <w:rFonts w:ascii="Microsoft YaHei" w:hAnsi="Microsoft YaHei" w:eastAsia="Microsoft YaHei"/>
+            <w:b w:val="0"/>
+            <w:color w:val="245F83"/>
+            <w:sz w:val="14"/>
+            <w:u w:val="single"/>
+          </w:rPr>
+          <w:t>Brandstetter et al., 2022</w:t>
+        </w:r>
+      </w:hyperlink>
+      <w:r>
+        <w:rPr>
+          <w:rFonts w:ascii="Microsoft YaHei" w:hAnsi="Microsoft YaHei" w:eastAsia="Microsoft YaHei"/>
+          <w:b w:val="0"/>
+          <w:sz w:val="14"/>
+        </w:rPr>
+        <w:t>；</w:t>
+      </w:r>
+      <w:hyperlink r:id="rId17" w:history="1">
+        <w:r>
+          <w:rPr>
+            <w:rFonts w:ascii="Microsoft YaHei" w:hAnsi="Microsoft YaHei" w:eastAsia="Microsoft YaHei"/>
+            <w:b w:val="0"/>
+            <w:color w:val="245F83"/>
+            <w:sz w:val="14"/>
+            <w:u w:val="single"/>
+          </w:rPr>
+          <w:t>Mialon et al., 2023（arXiv v2, 2024）</w:t>
+        </w:r>
+      </w:hyperlink>
+      <w:r>
+        <w:rPr>
+          <w:rFonts w:ascii="Microsoft YaHei" w:hAnsi="Microsoft YaHei" w:eastAsia="Microsoft YaHei"/>
+          <w:b w:val="0"/>
+          <w:sz w:val="14"/>
+        </w:rPr>
+        <w:t>）。共同点只是特定基算子＋迭代的工作流，并非已知统一代数。</w:t>
       </w:r>
     </w:p>
     <w:p>
@@ -466,9 +499,22 @@
           <w:b w:val="0"/>
           <w:sz w:val="15"/>
         </w:rPr>
-        <w:t>困难不在万能展开公式，而在不同算子的定义域、陪域和验证义务。首版只统一带类型接口 bᵢ:Xᵢ⇀Xⱼ、zₜ₊₁=bᵢₜ(zₜ)：配平属于整数核 kerℤ(A)，构型属于 R³ⁿ/SE(3)，半迭代属于自映射空间，PDE 约化还需延拓、边界与不变量。Deng、Hani 与 Ma 的硬球—Boltzmann 长时推导用时间分层、累积量、部分展开、分子图和切割算法控制误差（</w:t>
+        <w:t>结构化瓶颈首先是定义不一致：反应能量可能指电子能差、焓变、自由能变、势垒或吸附能；缺少数值、单位、方法、参考态和来源时，任何数字都不可复查。催化剂又可能是分子、团簇、表面、载体或界面，二维连线、三维坐标和对称信息必须交给不同插件，并标明坐标来源与“体相／支撑体／表面／活性位”范围。</w:t>
       </w:r>
-      <w:hyperlink r:id="rId16" w:history="1">
+    </w:p>
+    <w:p>
+      <w:pPr>
+        <w:spacing w:after="30"/>
+      </w:pPr>
+      <w:r>
+        <w:rPr>
+          <w:rFonts w:ascii="Microsoft YaHei" w:hAnsi="Microsoft YaHei" w:eastAsia="Microsoft YaHei"/>
+          <w:b w:val="0"/>
+          <w:sz w:val="15"/>
+        </w:rPr>
+        <w:t>纯数学侧也没有可直接套用的万能函数生成器。Deng、Hani 与 Ma 从硬球动力学长时导出 Boltzmann 方程时，用时间分层、累积量、部分展开、分子图和切割算法控制误差（</w:t>
+      </w:r>
+      <w:hyperlink r:id="rId18" w:history="1">
         <w:r>
           <w:rPr>
             <w:rFonts w:ascii="Microsoft YaHei" w:hAnsi="Microsoft YaHei" w:eastAsia="Microsoft YaHei"/>
@@ -477,6 +523,7 @@
             <w:sz w:val="15"/>
             <w:u w:val="single"/>
           </w:rPr>
+          <w:t>Deng, Hani &amp; Ma, 2025</w:t>
         </w:r>
       </w:hyperlink>
       <w:r>
@@ -485,7 +532,7 @@
           <w:b w:val="0"/>
           <w:sz w:val="15"/>
         </w:rPr>
-        <w:t>，pp. 9–12）。这说明专业参数、结构表示和误差口径必须一起嵌入，公式与三维投影才可复核；该预印本仅作复杂度例证，不证明本工具能完成 PDE 约化、分子模拟或通用函数生成。</w:t>
+        <w:t>，pp. 9–12）。这份 192 页推导只作复杂度例证：专业参数、函数空间、结构表示与误差口径必须一起嵌入，不能由语言模型一次补全。</w:t>
       </w:r>
     </w:p>
     <w:p>
@@ -499,15 +546,35 @@
     </w:p>
     <w:p>
       <w:pPr>
-        <w:spacing w:after="30"/>
+        <w:spacing w:after="10"/>
       </w:pPr>
       <w:r>
         <w:rPr>
           <w:rFonts w:ascii="Microsoft YaHei" w:hAnsi="Microsoft YaHei" w:eastAsia="Microsoft YaHei"/>
           <w:b w:val="0"/>
-          <w:sz w:val="15"/>
+          <w:sz w:val="14"/>
         </w:rPr>
-        <w:t>默认查询先被判为不守恒，再补成下式。由于 θ、候选域和观测表未冻结，arg max J(c;θ) 不可审计；系统只返回未排名文献候选、缺失参数、相连空间和示意构型。这一问题修正而非材料名称，构成首版可检查的负结果。</w:t>
+        <w:t xml:space="preserve">演示只建立可审计的“反应—证据—几何”记录：反应物／产物来自输入，能量为 null，五条候选保留来源；当前三维对象是 </w:t>
+      </w:r>
+      <w:hyperlink r:id="rId19" w:history="1">
+        <w:r>
+          <w:rPr>
+            <w:rFonts w:ascii="Microsoft YaHei" w:hAnsi="Microsoft YaHei" w:eastAsia="Microsoft YaHei"/>
+            <w:b w:val="0"/>
+            <w:color w:val="245F83"/>
+            <w:sz w:val="14"/>
+            <w:u w:val="single"/>
+          </w:rPr>
+          <w:t>Materials Project OPTIMADE</w:t>
+        </w:r>
+      </w:hyperlink>
+      <w:r>
+        <w:rPr>
+          <w:rFonts w:ascii="Microsoft YaHei" w:hAnsi="Microsoft YaHei" w:eastAsia="Microsoft YaHei"/>
+          <w:b w:val="0"/>
+          <w:sz w:val="14"/>
+        </w:rPr>
+        <w:t xml:space="preserve"> 的 mp-19306 Fe₃O₄ 体相支撑体坐标，范围 support-only，不是 Pd 活性位。</w:t>
       </w:r>
     </w:p>
     <w:p>
@@ -520,9 +587,9 @@
           <w:rFonts w:ascii="Cambria Math" w:hAnsi="Cambria Math" w:eastAsia="Cambria Math"/>
           <w:b w:val="0"/>
           <w:color w:val="0D2538"/>
-          <w:sz w:val="18"/>
+          <w:sz w:val="16"/>
         </w:rPr>
-        <w:t>2CO₂(g)+6H₂(g) → C₂H₅OH(g)+3H₂O(g),   ν=(−2,−6,1,3),   Aν=0</w:t>
+        <w:t>S(c)=50mRP+25mabs+15mgeom+10menergy　（四项为 0／1，只作稳定检索排序）</w:t>
       </w:r>
     </w:p>
     <w:p>
@@ -533,7 +600,7 @@
       <w:r>
         <w:drawing>
           <wp:inline xmlns:a="http://schemas.openxmlformats.org/drawingml/2006/main" xmlns:pic="http://schemas.openxmlformats.org/drawingml/2006/picture">
-            <wp:extent cx="6336000" cy="2618819"/>
+            <wp:extent cx="5903999" cy="2262636"/>
             <wp:docPr id="1" name="Picture 1"/>
             <wp:cNvGraphicFramePr>
               <a:graphicFrameLocks noChangeAspect="1"/>
@@ -546,7 +613,7 @@
                     <pic:cNvPicPr/>
                   </pic:nvPicPr>
                   <pic:blipFill>
-                    <a:blip r:embed="rId17"/>
+                    <a:blip r:embed="rId20"/>
                     <a:stretch>
                       <a:fillRect/>
                     </a:stretch>
@@ -554,7 +621,7 @@
                   <pic:spPr>
                     <a:xfrm>
                       <a:off x="0" y="0"/>
-                      <a:ext cx="6336000" cy="2618819"/>
+                      <a:ext cx="5903999" cy="2262636"/>
                     </a:xfrm>
                     <a:prstGeom prst="rect"/>
                   </pic:spPr>
@@ -586,7 +653,7 @@
           <w:color w:val="66727D"/>
           <w:sz w:val="12"/>
         </w:rPr>
-        <w:t>原始目标、配平、Aν、θ、Cθ、目标完备性、拒绝原因。</w:t>
+        <w:t>反应物；产物；能量值／单位／定义／方法／来源／状态；候选记录；固定排序特征；几何来源与对象范围。</w:t>
       </w:r>
       <w:r>
         <w:rPr>
@@ -606,46 +673,7 @@
             <w:sz w:val="12"/>
             <w:u w:val="single"/>
           </w:rPr>
-        </w:r>
-      </w:hyperlink>
-      <w:r>
-        <w:rPr>
-          <w:rFonts w:ascii="Microsoft YaHei" w:hAnsi="Microsoft YaHei" w:eastAsia="Microsoft YaHei"/>
-          <w:b w:val="0"/>
-          <w:color w:val="66727D"/>
-          <w:sz w:val="12"/>
-        </w:rPr>
-        <w:t>；</w:t>
-      </w:r>
-      <w:hyperlink r:id="rId11" w:history="1">
-        <w:r>
-          <w:rPr>
-            <w:rFonts w:ascii="Microsoft YaHei" w:hAnsi="Microsoft YaHei" w:eastAsia="Microsoft YaHei"/>
-            <w:b w:val="0"/>
-            <w:color w:val="245F83"/>
-            <w:sz w:val="12"/>
-            <w:u w:val="single"/>
-          </w:rPr>
-        </w:r>
-      </w:hyperlink>
-      <w:r>
-        <w:rPr>
-          <w:rFonts w:ascii="Microsoft YaHei" w:hAnsi="Microsoft YaHei" w:eastAsia="Microsoft YaHei"/>
-          <w:b w:val="0"/>
-          <w:color w:val="66727D"/>
-          <w:sz w:val="12"/>
-        </w:rPr>
-        <w:t>；</w:t>
-      </w:r>
-      <w:hyperlink r:id="rId12" w:history="1">
-        <w:r>
-          <w:rPr>
-            <w:rFonts w:ascii="Microsoft YaHei" w:hAnsi="Microsoft YaHei" w:eastAsia="Microsoft YaHei"/>
-            <w:b w:val="0"/>
-            <w:color w:val="245F83"/>
-            <w:sz w:val="12"/>
-            <w:u w:val="single"/>
-          </w:rPr>
+          <w:t>Wang 2021</w:t>
         </w:r>
       </w:hyperlink>
       <w:r>
@@ -666,6 +694,7 @@
             <w:sz w:val="12"/>
             <w:u w:val="single"/>
           </w:rPr>
+          <w:t>Kozyra 2021</w:t>
         </w:r>
       </w:hyperlink>
       <w:r>
@@ -686,6 +715,7 @@
             <w:sz w:val="12"/>
             <w:u w:val="single"/>
           </w:rPr>
+          <w:t>Murugan–Palanivel 2021</w:t>
         </w:r>
       </w:hyperlink>
       <w:r>
@@ -706,6 +736,7 @@
             <w:sz w:val="12"/>
             <w:u w:val="single"/>
           </w:rPr>
+          <w:t>Güngör v11 2025</w:t>
         </w:r>
       </w:hyperlink>
       <w:r>
@@ -726,6 +757,70 @@
             <w:sz w:val="12"/>
             <w:u w:val="single"/>
           </w:rPr>
+          <w:t>Brandstetter 2022</w:t>
+        </w:r>
+      </w:hyperlink>
+      <w:r>
+        <w:rPr>
+          <w:rFonts w:ascii="Microsoft YaHei" w:hAnsi="Microsoft YaHei" w:eastAsia="Microsoft YaHei"/>
+          <w:b w:val="0"/>
+          <w:color w:val="66727D"/>
+          <w:sz w:val="12"/>
+        </w:rPr>
+        <w:t>；</w:t>
+      </w:r>
+      <w:hyperlink r:id="rId17" w:history="1">
+        <w:r>
+          <w:rPr>
+            <w:rFonts w:ascii="Microsoft YaHei" w:hAnsi="Microsoft YaHei" w:eastAsia="Microsoft YaHei"/>
+            <w:b w:val="0"/>
+            <w:color w:val="245F83"/>
+            <w:sz w:val="12"/>
+            <w:u w:val="single"/>
+          </w:rPr>
+          <w:t>Mialon 2023／v2 2024</w:t>
+        </w:r>
+      </w:hyperlink>
+      <w:r>
+        <w:rPr>
+          <w:rFonts w:ascii="Microsoft YaHei" w:hAnsi="Microsoft YaHei" w:eastAsia="Microsoft YaHei"/>
+          <w:b w:val="0"/>
+          <w:color w:val="66727D"/>
+          <w:sz w:val="12"/>
+        </w:rPr>
+        <w:t>；</w:t>
+      </w:r>
+      <w:hyperlink r:id="rId18" w:history="1">
+        <w:r>
+          <w:rPr>
+            <w:rFonts w:ascii="Microsoft YaHei" w:hAnsi="Microsoft YaHei" w:eastAsia="Microsoft YaHei"/>
+            <w:b w:val="0"/>
+            <w:color w:val="245F83"/>
+            <w:sz w:val="12"/>
+            <w:u w:val="single"/>
+          </w:rPr>
+          <w:t>Deng–Hani–Ma 2025</w:t>
+        </w:r>
+      </w:hyperlink>
+      <w:r>
+        <w:rPr>
+          <w:rFonts w:ascii="Microsoft YaHei" w:hAnsi="Microsoft YaHei" w:eastAsia="Microsoft YaHei"/>
+          <w:b w:val="0"/>
+          <w:color w:val="66727D"/>
+          <w:sz w:val="12"/>
+        </w:rPr>
+        <w:t>；</w:t>
+      </w:r>
+      <w:hyperlink r:id="rId19" w:history="1">
+        <w:r>
+          <w:rPr>
+            <w:rFonts w:ascii="Microsoft YaHei" w:hAnsi="Microsoft YaHei" w:eastAsia="Microsoft YaHei"/>
+            <w:b w:val="0"/>
+            <w:color w:val="245F83"/>
+            <w:sz w:val="12"/>
+            <w:u w:val="single"/>
+          </w:rPr>
+          <w:t>Materials Project OPTIMADE</w:t>
         </w:r>
       </w:hyperlink>
       <w:r>
@@ -753,7 +848,7 @@
           <w:color w:val="66727D"/>
           <w:sz w:val="12"/>
         </w:rPr>
-        <w:t>演示截图：守恒、欠定目标与相连空间。</w:t>
+        <w:t>v0.6 演示截图：反应物—产物—能量空值—固定排序边界—相连空间。</w:t>
       </w:r>
       <w:r>
         <w:rPr>
@@ -771,7 +866,7 @@
           <w:color w:val="66727D"/>
           <w:sz w:val="12"/>
         </w:rPr>
-        <w:t>候选未写成最优；构型标为示意；共享接口缺口仍是待检验假设。</w:t>
+        <w:t>逐项打开候选链接；未知能量保持空值；mp-19306 未写成 Pd 活性位；排序未写成性能结论。</w:t>
       </w:r>
       <w:r>
         <w:rPr>
@@ -789,7 +884,7 @@
           <w:color w:val="66727D"/>
           <w:sz w:val="12"/>
         </w:rPr>
-        <w:t>约 900 字＋1 图。</w:t>
+        <w:t>约 850–950 字＋1 张实测截图。</w:t>
       </w:r>
     </w:p>
     <w:p>
@@ -817,7 +912,7 @@
     </w:p>
     <w:p>
       <w:pPr>
-        <w:spacing w:after="30"/>
+        <w:spacing w:after="12"/>
       </w:pPr>
       <w:r>
         <w:rPr>
@@ -825,7 +920,7 @@
           <w:b w:val="0"/>
           <w:sz w:val="15"/>
         </w:rPr>
-        <w:t>每次运行先冻结原始目标、物种与相态、条件向量 θ、候选集合 Cθ、指标和允许调用的特定基算子。催化路线固定经过反应解析、元素矩阵、整数核配平、目标完备性、文献检索和几何投影；未经配平不得排名，指标欠定不得补写“最佳”，无来源坐标只能画示意构型，含 sorry 的 Lean 文件不得标为已证明。</w:t>
+        <w:t>环境固定接收原始查询 q，并输出反应物 R、产物 P、能量记录 E、催化剂候选 C、空间几何 G 与来源集合 L。</w:t>
       </w:r>
     </w:p>
     <w:p>
@@ -840,7 +935,7 @@
           <w:color w:val="0D2538"/>
           <w:sz w:val="18"/>
         </w:rPr>
-        <w:t>θlit={T=320 °C, P=5.0 MPa, 进料=(3.25% Ar, 26.5% CO₂, 70.25% H₂), 反应器=内径 6 mm 固定床}</w:t>
+        <w:t>q ↦ (R,P,E,C,G,L),　E=(v,u,ρ,m,s,σ)</w:t>
       </w:r>
     </w:p>
     <w:p>
@@ -853,27 +948,528 @@
           <w:b w:val="0"/>
           <w:sz w:val="15"/>
         </w:rPr>
-        <w:t xml:space="preserve">该参数截面来自 </w:t>
+        <w:t>E 中 v 为数值、u 为单位、ρ 为能量定义、m 为实验或计算方法、s 为来源、σ 为核验状态；任何必要子字段缺失时 v=null，界面显示“—”。候选至少保存名称、记录标识、网址、证据层级和检索时间；几何至少保存节点、边、坐标来源及“体相／支撑体／表面／活性位”范围。</w:t>
       </w:r>
-      <w:hyperlink r:id="rId10" w:history="1">
-        <w:r>
-          <w:rPr>
-            <w:rFonts w:ascii="Microsoft YaHei" w:hAnsi="Microsoft YaHei" w:eastAsia="Microsoft YaHei"/>
-            <w:b w:val="0"/>
-            <w:color w:val="245F83"/>
-            <w:sz w:val="15"/>
-            <w:u w:val="single"/>
-          </w:rPr>
-        </w:r>
-      </w:hyperlink>
+    </w:p>
+    <w:p>
+      <w:pPr>
+        <w:spacing w:after="12"/>
+      </w:pPr>
       <w:r>
         <w:rPr>
           <w:rFonts w:ascii="Microsoft YaHei" w:hAnsi="Microsoft YaHei" w:eastAsia="Microsoft YaHei"/>
           <w:b w:val="0"/>
-          <w:sz w:val="15"/>
+          <w:sz w:val="14"/>
         </w:rPr>
-        <w:t xml:space="preserve"> 的补充材料，只说明专业比较所需的粒度，不自动成为演示环境的条件，也不能与其他论文横向排名。</w:t>
+        <w:t>@best 只调用公开的 50／25／15／10 固定排序式，不新增科学主张。温度、压力、候选范围、观测指标和基线是可选可能性，缺失不阻断检索。各数据源职责固定如下。</w:t>
       </w:r>
+    </w:p>
+    <w:tbl>
+      <w:tblPr>
+        <w:tblStyle w:val="TableGrid"/>
+        <w:tblW w:type="auto" w:w="0"/>
+        <w:jc w:val="center"/>
+        <w:tblLayout w:type="fixed"/>
+        <w:tblLook w:firstColumn="1" w:firstRow="1" w:lastColumn="0" w:lastRow="0" w:noHBand="0" w:noVBand="1" w:val="04A0"/>
+      </w:tblPr>
+      <w:tblGrid>
+        <w:gridCol w:w="3496"/>
+        <w:gridCol w:w="3496"/>
+        <w:gridCol w:w="3496"/>
+      </w:tblGrid>
+      <w:tr>
+        <w:trPr>
+          <w:cantSplit/>
+        </w:trPr>
+        <w:tc>
+          <w:tcPr>
+            <w:tcW w:type="dxa" w:w="2438"/>
+            <w:vAlign w:val="center"/>
+            <w:tcMar>
+              <w:top w:w="32" w:type="dxa"/>
+              <w:start w:w="55" w:type="dxa"/>
+              <w:bottom w:w="32" w:type="dxa"/>
+              <w:end w:w="55" w:type="dxa"/>
+            </w:tcMar>
+            <w:shd w:fill="0D2538"/>
+          </w:tcPr>
+          <w:p>
+            <w:pPr>
+              <w:spacing w:after="0"/>
+            </w:pPr>
+            <w:r>
+              <w:rPr>
+                <w:rFonts w:ascii="Microsoft YaHei" w:hAnsi="Microsoft YaHei" w:eastAsia="Microsoft YaHei"/>
+                <w:b/>
+                <w:color w:val="FFFFFF"/>
+                <w:sz w:val="11"/>
+              </w:rPr>
+              <w:t>数据源</w:t>
+            </w:r>
+          </w:p>
+        </w:tc>
+        <w:tc>
+          <w:tcPr>
+            <w:tcW w:type="dxa" w:w="4082"/>
+            <w:vAlign w:val="center"/>
+            <w:tcMar>
+              <w:top w:w="32" w:type="dxa"/>
+              <w:start w:w="55" w:type="dxa"/>
+              <w:bottom w:w="32" w:type="dxa"/>
+              <w:end w:w="55" w:type="dxa"/>
+            </w:tcMar>
+            <w:shd w:fill="0D2538"/>
+          </w:tcPr>
+          <w:p>
+            <w:pPr>
+              <w:spacing w:after="0"/>
+            </w:pPr>
+            <w:r>
+              <w:rPr>
+                <w:rFonts w:ascii="Microsoft YaHei" w:hAnsi="Microsoft YaHei" w:eastAsia="Microsoft YaHei"/>
+                <w:b/>
+                <w:color w:val="FFFFFF"/>
+                <w:sz w:val="11"/>
+              </w:rPr>
+              <w:t>可读取对象</w:t>
+            </w:r>
+          </w:p>
+        </w:tc>
+        <w:tc>
+          <w:tcPr>
+            <w:tcW w:type="dxa" w:w="3855"/>
+            <w:vAlign w:val="center"/>
+            <w:tcMar>
+              <w:top w:w="32" w:type="dxa"/>
+              <w:start w:w="55" w:type="dxa"/>
+              <w:bottom w:w="32" w:type="dxa"/>
+              <w:end w:w="55" w:type="dxa"/>
+            </w:tcMar>
+            <w:shd w:fill="0D2538"/>
+          </w:tcPr>
+          <w:p>
+            <w:pPr>
+              <w:spacing w:after="0"/>
+            </w:pPr>
+            <w:r>
+              <w:rPr>
+                <w:rFonts w:ascii="Microsoft YaHei" w:hAnsi="Microsoft YaHei" w:eastAsia="Microsoft YaHei"/>
+                <w:b/>
+                <w:color w:val="FFFFFF"/>
+                <w:sz w:val="11"/>
+              </w:rPr>
+              <w:t>硬边界</w:t>
+            </w:r>
+          </w:p>
+        </w:tc>
+      </w:tr>
+      <w:tr>
+        <w:trPr>
+          <w:cantSplit/>
+        </w:trPr>
+        <w:tc>
+          <w:tcPr>
+            <w:tcW w:type="dxa" w:w="2438"/>
+            <w:vAlign w:val="center"/>
+            <w:tcMar>
+              <w:top w:w="32" w:type="dxa"/>
+              <w:start w:w="55" w:type="dxa"/>
+              <w:bottom w:w="32" w:type="dxa"/>
+              <w:end w:w="55" w:type="dxa"/>
+            </w:tcMar>
+          </w:tcPr>
+          <w:p>
+            <w:pPr>
+              <w:spacing w:after="0"/>
+            </w:pPr>
+            <w:hyperlink r:id="rId21" w:history="1">
+              <w:r>
+                <w:rPr>
+                  <w:rFonts w:ascii="Microsoft YaHei" w:hAnsi="Microsoft YaHei" w:eastAsia="Microsoft YaHei"/>
+                  <w:b/>
+                  <w:color w:val="245F83"/>
+                  <w:sz w:val="11"/>
+                  <w:u w:val="single"/>
+                </w:rPr>
+                <w:t>Catalysis-Hub（Winther et al., 2019）</w:t>
+              </w:r>
+            </w:hyperlink>
+          </w:p>
+        </w:tc>
+        <w:tc>
+          <w:tcPr>
+            <w:tcW w:type="dxa" w:w="4082"/>
+            <w:vAlign w:val="center"/>
+            <w:tcMar>
+              <w:top w:w="32" w:type="dxa"/>
+              <w:start w:w="55" w:type="dxa"/>
+              <w:bottom w:w="32" w:type="dxa"/>
+              <w:end w:w="55" w:type="dxa"/>
+            </w:tcMar>
+          </w:tcPr>
+          <w:p>
+            <w:pPr>
+              <w:spacing w:after="0"/>
+            </w:pPr>
+            <w:r>
+              <w:rPr>
+                <w:rFonts w:ascii="Microsoft YaHei" w:hAnsi="Microsoft YaHei" w:eastAsia="Microsoft YaHei"/>
+                <w:b w:val="0"/>
+                <w:sz w:val="11"/>
+              </w:rPr>
+              <w:t>反应物／产物、带类型 DFT 能量、部分原子结构</w:t>
+            </w:r>
+          </w:p>
+        </w:tc>
+        <w:tc>
+          <w:tcPr>
+            <w:tcW w:type="dxa" w:w="3855"/>
+            <w:vAlign w:val="center"/>
+            <w:tcMar>
+              <w:top w:w="32" w:type="dxa"/>
+              <w:start w:w="55" w:type="dxa"/>
+              <w:bottom w:w="32" w:type="dxa"/>
+              <w:end w:w="55" w:type="dxa"/>
+            </w:tcMar>
+          </w:tcPr>
+          <w:p>
+            <w:pPr>
+              <w:spacing w:after="0"/>
+            </w:pPr>
+            <w:r>
+              <w:rPr>
+                <w:rFonts w:ascii="Microsoft YaHei" w:hAnsi="Microsoft YaHei" w:eastAsia="Microsoft YaHei"/>
+                <w:b w:val="0"/>
+                <w:sz w:val="11"/>
+              </w:rPr>
+              <w:t>模式内省实测 200；无密钥记录查询 401；跨论文不可直接排序</w:t>
+            </w:r>
+          </w:p>
+        </w:tc>
+      </w:tr>
+      <w:tr>
+        <w:trPr>
+          <w:cantSplit/>
+        </w:trPr>
+        <w:tc>
+          <w:tcPr>
+            <w:tcW w:type="dxa" w:w="2438"/>
+            <w:vAlign w:val="center"/>
+            <w:tcMar>
+              <w:top w:w="32" w:type="dxa"/>
+              <w:start w:w="55" w:type="dxa"/>
+              <w:bottom w:w="32" w:type="dxa"/>
+              <w:end w:w="55" w:type="dxa"/>
+            </w:tcMar>
+            <w:shd w:fill="F7F8F7"/>
+          </w:tcPr>
+          <w:p>
+            <w:pPr>
+              <w:spacing w:after="0"/>
+            </w:pPr>
+            <w:hyperlink r:id="rId22" w:history="1">
+              <w:r>
+                <w:rPr>
+                  <w:rFonts w:ascii="Microsoft YaHei" w:hAnsi="Microsoft YaHei" w:eastAsia="Microsoft YaHei"/>
+                  <w:b/>
+                  <w:color w:val="245F83"/>
+                  <w:sz w:val="11"/>
+                  <w:u w:val="single"/>
+                </w:rPr>
+                <w:t>OC20（Chanussot et al., 2021）</w:t>
+              </w:r>
+            </w:hyperlink>
+            <w:r>
+              <w:rPr>
+                <w:rFonts w:ascii="Microsoft YaHei" w:hAnsi="Microsoft YaHei" w:eastAsia="Microsoft YaHei"/>
+                <w:b/>
+                <w:sz w:val="11"/>
+              </w:rPr>
+              <w:t>／</w:t>
+            </w:r>
+            <w:hyperlink r:id="rId23" w:history="1">
+              <w:r>
+                <w:rPr>
+                  <w:rFonts w:ascii="Microsoft YaHei" w:hAnsi="Microsoft YaHei" w:eastAsia="Microsoft YaHei"/>
+                  <w:b/>
+                  <w:color w:val="245F83"/>
+                  <w:sz w:val="11"/>
+                  <w:u w:val="single"/>
+                </w:rPr>
+                <w:t>Materials Project API</w:t>
+              </w:r>
+            </w:hyperlink>
+          </w:p>
+        </w:tc>
+        <w:tc>
+          <w:tcPr>
+            <w:tcW w:type="dxa" w:w="4082"/>
+            <w:vAlign w:val="center"/>
+            <w:tcMar>
+              <w:top w:w="32" w:type="dxa"/>
+              <w:start w:w="55" w:type="dxa"/>
+              <w:bottom w:w="32" w:type="dxa"/>
+              <w:end w:w="55" w:type="dxa"/>
+            </w:tcMar>
+            <w:shd w:fill="F7F8F7"/>
+          </w:tcPr>
+          <w:p>
+            <w:pPr>
+              <w:spacing w:after="0"/>
+            </w:pPr>
+            <w:r>
+              <w:rPr>
+                <w:rFonts w:ascii="Microsoft YaHei" w:hAnsi="Microsoft YaHei" w:eastAsia="Microsoft YaHei"/>
+                <w:b w:val="0"/>
+                <w:sz w:val="11"/>
+              </w:rPr>
+              <w:t>初始／弛豫结构、能量与力／最低能体相晶体</w:t>
+            </w:r>
+          </w:p>
+        </w:tc>
+        <w:tc>
+          <w:tcPr>
+            <w:tcW w:type="dxa" w:w="3855"/>
+            <w:vAlign w:val="center"/>
+            <w:tcMar>
+              <w:top w:w="32" w:type="dxa"/>
+              <w:start w:w="55" w:type="dxa"/>
+              <w:bottom w:w="32" w:type="dxa"/>
+              <w:end w:w="55" w:type="dxa"/>
+            </w:tcMar>
+            <w:shd w:fill="F7F8F7"/>
+          </w:tcPr>
+          <w:p>
+            <w:pPr>
+              <w:spacing w:after="0"/>
+            </w:pPr>
+            <w:r>
+              <w:rPr>
+                <w:rFonts w:ascii="Microsoft YaHei" w:hAnsi="Microsoft YaHei" w:eastAsia="Microsoft YaHei"/>
+                <w:b w:val="0"/>
+                <w:sz w:val="11"/>
+              </w:rPr>
+              <w:t>OC20 非完整反应网络；体相结构不是催化界面</w:t>
+            </w:r>
+          </w:p>
+        </w:tc>
+      </w:tr>
+      <w:tr>
+        <w:trPr>
+          <w:cantSplit/>
+        </w:trPr>
+        <w:tc>
+          <w:tcPr>
+            <w:tcW w:type="dxa" w:w="2438"/>
+            <w:vAlign w:val="center"/>
+            <w:tcMar>
+              <w:top w:w="32" w:type="dxa"/>
+              <w:start w:w="55" w:type="dxa"/>
+              <w:bottom w:w="32" w:type="dxa"/>
+              <w:end w:w="55" w:type="dxa"/>
+            </w:tcMar>
+          </w:tcPr>
+          <w:p>
+            <w:pPr>
+              <w:spacing w:after="0"/>
+            </w:pPr>
+            <w:hyperlink r:id="rId24" w:history="1">
+              <w:r>
+                <w:rPr>
+                  <w:rFonts w:ascii="Microsoft YaHei" w:hAnsi="Microsoft YaHei" w:eastAsia="Microsoft YaHei"/>
+                  <w:b/>
+                  <w:color w:val="245F83"/>
+                  <w:sz w:val="11"/>
+                  <w:u w:val="single"/>
+                </w:rPr>
+                <w:t>Crossref REST API</w:t>
+              </w:r>
+            </w:hyperlink>
+            <w:r>
+              <w:rPr>
+                <w:rFonts w:ascii="Microsoft YaHei" w:hAnsi="Microsoft YaHei" w:eastAsia="Microsoft YaHei"/>
+                <w:b/>
+                <w:sz w:val="11"/>
+              </w:rPr>
+              <w:t>／</w:t>
+            </w:r>
+            <w:hyperlink r:id="rId25" w:history="1">
+              <w:r>
+                <w:rPr>
+                  <w:rFonts w:ascii="Microsoft YaHei" w:hAnsi="Microsoft YaHei" w:eastAsia="Microsoft YaHei"/>
+                  <w:b/>
+                  <w:color w:val="245F83"/>
+                  <w:sz w:val="11"/>
+                  <w:u w:val="single"/>
+                </w:rPr>
+                <w:t>OpenAlex Works API</w:t>
+              </w:r>
+            </w:hyperlink>
+          </w:p>
+        </w:tc>
+        <w:tc>
+          <w:tcPr>
+            <w:tcW w:type="dxa" w:w="4082"/>
+            <w:vAlign w:val="center"/>
+            <w:tcMar>
+              <w:top w:w="32" w:type="dxa"/>
+              <w:start w:w="55" w:type="dxa"/>
+              <w:bottom w:w="32" w:type="dxa"/>
+              <w:end w:w="55" w:type="dxa"/>
+            </w:tcMar>
+          </w:tcPr>
+          <w:p>
+            <w:pPr>
+              <w:spacing w:after="0"/>
+            </w:pPr>
+            <w:r>
+              <w:rPr>
+                <w:rFonts w:ascii="Microsoft YaHei" w:hAnsi="Microsoft YaHei" w:eastAsia="Microsoft YaHei"/>
+                <w:b w:val="0"/>
+                <w:sz w:val="11"/>
+              </w:rPr>
+              <w:t>DOI、题名、作者、日期、落地页与开放状态</w:t>
+            </w:r>
+          </w:p>
+        </w:tc>
+        <w:tc>
+          <w:tcPr>
+            <w:tcW w:type="dxa" w:w="3855"/>
+            <w:vAlign w:val="center"/>
+            <w:tcMar>
+              <w:top w:w="32" w:type="dxa"/>
+              <w:start w:w="55" w:type="dxa"/>
+              <w:bottom w:w="32" w:type="dxa"/>
+              <w:end w:w="55" w:type="dxa"/>
+            </w:tcMar>
+          </w:tcPr>
+          <w:p>
+            <w:pPr>
+              <w:spacing w:after="0"/>
+            </w:pPr>
+            <w:r>
+              <w:rPr>
+                <w:rFonts w:ascii="Microsoft YaHei" w:hAnsi="Microsoft YaHei" w:eastAsia="Microsoft YaHei"/>
+                <w:b w:val="0"/>
+                <w:sz w:val="11"/>
+              </w:rPr>
+              <w:t>只作身份核验和跳转，不给反应能或几何</w:t>
+            </w:r>
+          </w:p>
+        </w:tc>
+      </w:tr>
+      <w:tr>
+        <w:trPr>
+          <w:cantSplit/>
+        </w:trPr>
+        <w:tc>
+          <w:tcPr>
+            <w:tcW w:type="dxa" w:w="2438"/>
+            <w:vAlign w:val="center"/>
+            <w:tcMar>
+              <w:top w:w="32" w:type="dxa"/>
+              <w:start w:w="55" w:type="dxa"/>
+              <w:bottom w:w="32" w:type="dxa"/>
+              <w:end w:w="55" w:type="dxa"/>
+            </w:tcMar>
+            <w:shd w:fill="F7F8F7"/>
+          </w:tcPr>
+          <w:p>
+            <w:pPr>
+              <w:spacing w:after="0"/>
+            </w:pPr>
+            <w:hyperlink r:id="rId26" w:history="1">
+              <w:r>
+                <w:rPr>
+                  <w:rFonts w:ascii="Microsoft YaHei" w:hAnsi="Microsoft YaHei" w:eastAsia="Microsoft YaHei"/>
+                  <w:b/>
+                  <w:color w:val="245F83"/>
+                  <w:sz w:val="11"/>
+                  <w:u w:val="single"/>
+                </w:rPr>
+                <w:t>alphaXiv MCP</w:t>
+              </w:r>
+            </w:hyperlink>
+            <w:r>
+              <w:rPr>
+                <w:rFonts w:ascii="Microsoft YaHei" w:hAnsi="Microsoft YaHei" w:eastAsia="Microsoft YaHei"/>
+                <w:b/>
+                <w:sz w:val="11"/>
+              </w:rPr>
+              <w:t>／</w:t>
+            </w:r>
+            <w:hyperlink r:id="rId27" w:history="1">
+              <w:r>
+                <w:rPr>
+                  <w:rFonts w:ascii="Microsoft YaHei" w:hAnsi="Microsoft YaHei" w:eastAsia="Microsoft YaHei"/>
+                  <w:b/>
+                  <w:color w:val="245F83"/>
+                  <w:sz w:val="11"/>
+                  <w:u w:val="single"/>
+                </w:rPr>
+                <w:t>arXiv API</w:t>
+              </w:r>
+            </w:hyperlink>
+          </w:p>
+        </w:tc>
+        <w:tc>
+          <w:tcPr>
+            <w:tcW w:type="dxa" w:w="4082"/>
+            <w:vAlign w:val="center"/>
+            <w:tcMar>
+              <w:top w:w="32" w:type="dxa"/>
+              <w:start w:w="55" w:type="dxa"/>
+              <w:bottom w:w="32" w:type="dxa"/>
+              <w:end w:w="55" w:type="dxa"/>
+            </w:tcMar>
+            <w:shd w:fill="F7F8F7"/>
+          </w:tcPr>
+          <w:p>
+            <w:pPr>
+              <w:spacing w:after="0"/>
+            </w:pPr>
+            <w:r>
+              <w:rPr>
+                <w:rFonts w:ascii="Microsoft YaHei" w:hAnsi="Microsoft YaHei" w:eastAsia="Microsoft YaHei"/>
+                <w:b w:val="0"/>
+                <w:sz w:val="11"/>
+              </w:rPr>
+              <w:t>认证后 AI 阅读或原文抽取／规范元数据回退</w:t>
+            </w:r>
+          </w:p>
+        </w:tc>
+        <w:tc>
+          <w:tcPr>
+            <w:tcW w:type="dxa" w:w="3855"/>
+            <w:vAlign w:val="center"/>
+            <w:tcMar>
+              <w:top w:w="32" w:type="dxa"/>
+              <w:start w:w="55" w:type="dxa"/>
+              <w:bottom w:w="32" w:type="dxa"/>
+              <w:end w:w="55" w:type="dxa"/>
+            </w:tcMar>
+            <w:shd w:fill="F7F8F7"/>
+          </w:tcPr>
+          <w:p>
+            <w:pPr>
+              <w:spacing w:after="0"/>
+            </w:pPr>
+            <w:r>
+              <w:rPr>
+                <w:rFonts w:ascii="Microsoft YaHei" w:hAnsi="Microsoft YaHei" w:eastAsia="Microsoft YaHei"/>
+                <w:b w:val="0"/>
+                <w:sz w:val="11"/>
+              </w:rPr>
+              <w:t>alphaXiv 默认是 AI 中间报告；fullText=true 才请求原文；无认证 401</w:t>
+            </w:r>
+          </w:p>
+        </w:tc>
+      </w:tr>
+    </w:tbl>
+    <w:p>
+      <w:pPr>
+        <w:spacing w:after="0" w:line="20" w:lineRule="exact"/>
+      </w:pPr>
     </w:p>
     <w:p>
       <w:pPr>
@@ -930,7 +1526,7 @@
         </w:tc>
         <w:tc>
           <w:tcPr>
-            <w:tcW w:type="dxa" w:w="4762"/>
+            <w:tcW w:type="dxa" w:w="5046"/>
             <w:vAlign w:val="center"/>
             <w:tcMar>
               <w:top w:w="32" w:type="dxa"/>
@@ -957,7 +1553,7 @@
         </w:tc>
         <w:tc>
           <w:tcPr>
-            <w:tcW w:type="dxa" w:w="4365"/>
+            <w:tcW w:type="dxa" w:w="4082"/>
             <w:vAlign w:val="center"/>
             <w:tcMar>
               <w:top w:w="32" w:type="dxa"/>
@@ -1014,7 +1610,7 @@
         </w:tc>
         <w:tc>
           <w:tcPr>
-            <w:tcW w:type="dxa" w:w="4762"/>
+            <w:tcW w:type="dxa" w:w="5046"/>
             <w:vAlign w:val="center"/>
             <w:tcMar>
               <w:top w:w="32" w:type="dxa"/>
@@ -1033,13 +1629,13 @@
                 <w:b w:val="0"/>
                 <w:sz w:val="13"/>
               </w:rPr>
-              <w:t>原目标、标准数学式、θ 完整度、Cθ、来源层级、相连空间、反例、预算</w:t>
+              <w:t>原查询；R/P；能量六元组；候选网址与证据层级；几何来源；剩余预算</w:t>
             </w:r>
           </w:p>
         </w:tc>
         <w:tc>
           <w:tcPr>
-            <w:tcW w:type="dxa" w:w="4365"/>
+            <w:tcW w:type="dxa" w:w="4082"/>
             <w:vAlign w:val="center"/>
             <w:tcMar>
               <w:top w:w="32" w:type="dxa"/>
@@ -1058,7 +1654,7 @@
                 <w:b w:val="0"/>
                 <w:sz w:val="13"/>
               </w:rPr>
-              <w:t>形成当前可判定问题切片</w:t>
+              <w:t>确定当前可核验字段与空值</w:t>
             </w:r>
           </w:p>
         </w:tc>
@@ -1095,7 +1691,7 @@
         </w:tc>
         <w:tc>
           <w:tcPr>
-            <w:tcW w:type="dxa" w:w="4762"/>
+            <w:tcW w:type="dxa" w:w="5046"/>
             <w:vAlign w:val="center"/>
             <w:tcMar>
               <w:top w:w="32" w:type="dxa"/>
@@ -1115,13 +1711,13 @@
                 <w:b w:val="0"/>
                 <w:sz w:val="13"/>
               </w:rPr>
-              <w:t>配平；补齐/收缩条件域；换候选子集；调用文献、几何、Lean；生成反例；停止</w:t>
+              <w:t>选择 DOI／alphaXiv／公共数据库；改检索式；读摘要或正文；调用能量或几何插件；执行固定排序</w:t>
             </w:r>
           </w:p>
         </w:tc>
         <w:tc>
           <w:tcPr>
-            <w:tcW w:type="dxa" w:w="4365"/>
+            <w:tcW w:type="dxa" w:w="4082"/>
             <w:vAlign w:val="center"/>
             <w:tcMar>
               <w:top w:w="32" w:type="dxa"/>
@@ -1141,7 +1737,7 @@
                 <w:b w:val="0"/>
                 <w:sz w:val="13"/>
               </w:rPr>
-              <w:t>选择下一特定算子或插件</w:t>
+              <w:t>改变下一来源、字段或几何对象范围</w:t>
             </w:r>
           </w:p>
         </w:tc>
@@ -1177,7 +1773,7 @@
         </w:tc>
         <w:tc>
           <w:tcPr>
-            <w:tcW w:type="dxa" w:w="4762"/>
+            <w:tcW w:type="dxa" w:w="5046"/>
             <w:vAlign w:val="center"/>
             <w:tcMar>
               <w:top w:w="32" w:type="dxa"/>
@@ -1196,13 +1792,13 @@
                 <w:b w:val="0"/>
                 <w:sz w:val="13"/>
               </w:rPr>
-              <w:t>通过／否证／未知／证据不足／超时；守恒余量、失败字段、来源位置、轨迹</w:t>
+              <w:t>已核验／仅元数据／缺失／冲突／接口不可用／超时；同时返回原始字段和位置</w:t>
             </w:r>
           </w:p>
         </w:tc>
         <w:tc>
           <w:tcPr>
-            <w:tcW w:type="dxa" w:w="4365"/>
+            <w:tcW w:type="dxa" w:w="4082"/>
             <w:vAlign w:val="center"/>
             <w:tcMar>
               <w:top w:w="32" w:type="dxa"/>
@@ -1221,7 +1817,7 @@
                 <w:b w:val="0"/>
                 <w:sz w:val="13"/>
               </w:rPr>
-              <w:t>不守恒→配平；欠定→索取条件或拒绝排名；仅元数据→读摘要/原文</w:t>
+              <w:t>能量缺失→授权记录接口；support-only→检索活性位；冲突→并列保留</w:t>
             </w:r>
           </w:p>
         </w:tc>
@@ -1231,6 +1827,19 @@
       <w:pPr>
         <w:spacing w:after="0" w:line="20" w:lineRule="exact"/>
       </w:pPr>
+    </w:p>
+    <w:p>
+      <w:pPr>
+        <w:spacing w:after="30"/>
+      </w:pPr>
+      <w:r>
+        <w:rPr>
+          <w:rFonts w:ascii="Microsoft YaHei" w:hAnsi="Microsoft YaHei" w:eastAsia="Microsoft YaHei"/>
+          <w:b w:val="0"/>
+          <w:sz w:val="14"/>
+        </w:rPr>
+        <w:t>下一轮可改变连接器、查询词、目标证据层级或几何对象范围；固定 50／25／15／10 排序式不由 Agent 调权。至少一次反馈必须造成可见改变，模型推测不得写入已核验字段。</w:t>
+      </w:r>
     </w:p>
     <w:p>
       <w:pPr>
@@ -1249,49 +1858,9 @@
         <w:rPr>
           <w:rFonts w:ascii="Microsoft YaHei" w:hAnsi="Microsoft YaHei" w:eastAsia="Microsoft YaHei"/>
           <w:b w:val="0"/>
-          <w:sz w:val="15"/>
+          <w:sz w:val="14"/>
         </w:rPr>
-        <w:t>日志保存目标版本、算子签名、输入输出哈希、反馈、下一动作理由、模型/插件版本、来源链接和失败状态。默认精确内核不调用模型；本地 Qwen3-8B 每次至多用于一次语义解析，输出仍须精确复核。Codex 或 DeepSeek 仅在用户显式选择时二选一、最多一次；文献接口至多八次，几何输出至多一幅二维和一幅三维图，探索至多六轮。后端不可用必须明示，不得静默替换。</w:t>
-      </w:r>
-    </w:p>
-    <w:p>
-      <w:pPr>
-        <w:spacing w:before="14" w:after="20"/>
-        <w:jc w:val="center"/>
-      </w:pPr>
-      <w:r>
-        <w:drawing>
-          <wp:inline xmlns:a="http://schemas.openxmlformats.org/drawingml/2006/main" xmlns:pic="http://schemas.openxmlformats.org/drawingml/2006/picture">
-            <wp:extent cx="6336000" cy="2175724"/>
-            <wp:docPr id="2" name="Picture 2"/>
-            <wp:cNvGraphicFramePr>
-              <a:graphicFrameLocks noChangeAspect="1"/>
-            </wp:cNvGraphicFramePr>
-            <a:graphic>
-              <a:graphicData uri="http://schemas.openxmlformats.org/drawingml/2006/picture">
-                <pic:pic>
-                  <pic:nvPicPr>
-                    <pic:cNvPr id="0" name="page2_environment_interface.png"/>
-                    <pic:cNvPicPr/>
-                  </pic:nvPicPr>
-                  <pic:blipFill>
-                    <a:blip r:embed="rId18"/>
-                    <a:stretch>
-                      <a:fillRect/>
-                    </a:stretch>
-                  </pic:blipFill>
-                  <pic:spPr>
-                    <a:xfrm>
-                      <a:off x="0" y="0"/>
-                      <a:ext cx="6336000" cy="2175724"/>
-                    </a:xfrm>
-                    <a:prstGeom prst="rect"/>
-                  </pic:spPr>
-                </pic:pic>
-              </a:graphicData>
-            </a:graphic>
-          </wp:inline>
-        </w:drawing>
+        <w:t>日志保存查询版本、连接器、记录标识、网址、访问时间、字段原文、能量空值原因、几何来源、固定排序特征、模型／插件版本、反馈与下一动作理由。本机 Qwen3-8B 检查点每次至多用于一次受限识别；Codex 或 DeepSeek 仅在用户显式选择时二选一、最多一次；文献与数据库接口合计八次，二维和三维输出各一幅，探索六轮。后端不可用必须明示。</w:t>
       </w:r>
     </w:p>
     <w:p>
@@ -1315,7 +1884,7 @@
           <w:color w:val="66727D"/>
           <w:sz w:val="12"/>
         </w:rPr>
-        <w:t>固定规则、观察字段、动作枚举、反馈状态、日志与模型/文献/几何/轮数预算。</w:t>
+        <w:t>固定类型；观察字段；动作枚举；反馈状态；空值语义；固定排序式；来源日志；模型、接口、几何与轮数预算。</w:t>
       </w:r>
       <w:r>
         <w:rPr>
@@ -1335,6 +1904,7 @@
             <w:sz w:val="12"/>
             <w:u w:val="single"/>
           </w:rPr>
+          <w:t>Wang 2021</w:t>
         </w:r>
       </w:hyperlink>
       <w:r>
@@ -1344,9 +1914,9 @@
           <w:color w:val="66727D"/>
           <w:sz w:val="12"/>
         </w:rPr>
-        <w:t xml:space="preserve"> 补充材料 pp. 3–4；</w:t>
+        <w:t>；</w:t>
       </w:r>
-      <w:hyperlink r:id="rId16" w:history="1">
+      <w:hyperlink r:id="rId21" w:history="1">
         <w:r>
           <w:rPr>
             <w:rFonts w:ascii="Microsoft YaHei" w:hAnsi="Microsoft YaHei" w:eastAsia="Microsoft YaHei"/>
@@ -1355,6 +1925,7 @@
             <w:sz w:val="12"/>
             <w:u w:val="single"/>
           </w:rPr>
+          <w:t>Catalysis-Hub（Winther et al., 2019）</w:t>
         </w:r>
       </w:hyperlink>
       <w:r>
@@ -1364,7 +1935,133 @@
           <w:color w:val="66727D"/>
           <w:sz w:val="12"/>
         </w:rPr>
-        <w:t xml:space="preserve"> 仅作复杂度参照。</w:t>
+        <w:t>；</w:t>
+      </w:r>
+      <w:hyperlink r:id="rId22" w:history="1">
+        <w:r>
+          <w:rPr>
+            <w:rFonts w:ascii="Microsoft YaHei" w:hAnsi="Microsoft YaHei" w:eastAsia="Microsoft YaHei"/>
+            <w:b w:val="0"/>
+            <w:color w:val="245F83"/>
+            <w:sz w:val="12"/>
+            <w:u w:val="single"/>
+          </w:rPr>
+          <w:t>OC20（Chanussot et al., 2021）</w:t>
+        </w:r>
+      </w:hyperlink>
+      <w:r>
+        <w:rPr>
+          <w:rFonts w:ascii="Microsoft YaHei" w:hAnsi="Microsoft YaHei" w:eastAsia="Microsoft YaHei"/>
+          <w:b w:val="0"/>
+          <w:color w:val="66727D"/>
+          <w:sz w:val="12"/>
+        </w:rPr>
+        <w:t>；</w:t>
+      </w:r>
+      <w:hyperlink r:id="rId23" w:history="1">
+        <w:r>
+          <w:rPr>
+            <w:rFonts w:ascii="Microsoft YaHei" w:hAnsi="Microsoft YaHei" w:eastAsia="Microsoft YaHei"/>
+            <w:b w:val="0"/>
+            <w:color w:val="245F83"/>
+            <w:sz w:val="12"/>
+            <w:u w:val="single"/>
+          </w:rPr>
+          <w:t>Materials Project API</w:t>
+        </w:r>
+      </w:hyperlink>
+      <w:r>
+        <w:rPr>
+          <w:rFonts w:ascii="Microsoft YaHei" w:hAnsi="Microsoft YaHei" w:eastAsia="Microsoft YaHei"/>
+          <w:b w:val="0"/>
+          <w:color w:val="66727D"/>
+          <w:sz w:val="12"/>
+        </w:rPr>
+        <w:t>；</w:t>
+      </w:r>
+      <w:hyperlink r:id="rId24" w:history="1">
+        <w:r>
+          <w:rPr>
+            <w:rFonts w:ascii="Microsoft YaHei" w:hAnsi="Microsoft YaHei" w:eastAsia="Microsoft YaHei"/>
+            <w:b w:val="0"/>
+            <w:color w:val="245F83"/>
+            <w:sz w:val="12"/>
+            <w:u w:val="single"/>
+          </w:rPr>
+          <w:t>Crossref REST API</w:t>
+        </w:r>
+      </w:hyperlink>
+      <w:r>
+        <w:rPr>
+          <w:rFonts w:ascii="Microsoft YaHei" w:hAnsi="Microsoft YaHei" w:eastAsia="Microsoft YaHei"/>
+          <w:b w:val="0"/>
+          <w:color w:val="66727D"/>
+          <w:sz w:val="12"/>
+        </w:rPr>
+        <w:t>；</w:t>
+      </w:r>
+      <w:hyperlink r:id="rId25" w:history="1">
+        <w:r>
+          <w:rPr>
+            <w:rFonts w:ascii="Microsoft YaHei" w:hAnsi="Microsoft YaHei" w:eastAsia="Microsoft YaHei"/>
+            <w:b w:val="0"/>
+            <w:color w:val="245F83"/>
+            <w:sz w:val="12"/>
+            <w:u w:val="single"/>
+          </w:rPr>
+          <w:t>OpenAlex Works API</w:t>
+        </w:r>
+      </w:hyperlink>
+      <w:r>
+        <w:rPr>
+          <w:rFonts w:ascii="Microsoft YaHei" w:hAnsi="Microsoft YaHei" w:eastAsia="Microsoft YaHei"/>
+          <w:b w:val="0"/>
+          <w:color w:val="66727D"/>
+          <w:sz w:val="12"/>
+        </w:rPr>
+        <w:t>；</w:t>
+      </w:r>
+      <w:hyperlink r:id="rId26" w:history="1">
+        <w:r>
+          <w:rPr>
+            <w:rFonts w:ascii="Microsoft YaHei" w:hAnsi="Microsoft YaHei" w:eastAsia="Microsoft YaHei"/>
+            <w:b w:val="0"/>
+            <w:color w:val="245F83"/>
+            <w:sz w:val="12"/>
+            <w:u w:val="single"/>
+          </w:rPr>
+          <w:t>alphaXiv MCP</w:t>
+        </w:r>
+      </w:hyperlink>
+      <w:r>
+        <w:rPr>
+          <w:rFonts w:ascii="Microsoft YaHei" w:hAnsi="Microsoft YaHei" w:eastAsia="Microsoft YaHei"/>
+          <w:b w:val="0"/>
+          <w:color w:val="66727D"/>
+          <w:sz w:val="12"/>
+        </w:rPr>
+        <w:t>；</w:t>
+      </w:r>
+      <w:hyperlink r:id="rId27" w:history="1">
+        <w:r>
+          <w:rPr>
+            <w:rFonts w:ascii="Microsoft YaHei" w:hAnsi="Microsoft YaHei" w:eastAsia="Microsoft YaHei"/>
+            <w:b w:val="0"/>
+            <w:color w:val="245F83"/>
+            <w:sz w:val="12"/>
+            <w:u w:val="single"/>
+          </w:rPr>
+          <w:t>arXiv API</w:t>
+        </w:r>
+      </w:hyperlink>
+      <w:r>
+        <w:rPr>
+          <w:rFonts w:ascii="Microsoft YaHei" w:hAnsi="Microsoft YaHei" w:eastAsia="Microsoft YaHei"/>
+          <w:b w:val="0"/>
+          <w:color w:val="66727D"/>
+          <w:sz w:val="12"/>
+        </w:rPr>
+        <w:t>。</w:t>
       </w:r>
       <w:r>
         <w:rPr>
@@ -1382,7 +2079,7 @@
           <w:color w:val="66727D"/>
           <w:sz w:val="12"/>
         </w:rPr>
-        <w:t>带类型部分映射与反馈闭环。</w:t>
+        <w:t>q→(R,P,E,C,G,L) 的类型接口与观察—行动—反馈表。</w:t>
       </w:r>
       <w:r>
         <w:rPr>
@@ -1400,7 +2097,7 @@
           <w:color w:val="66727D"/>
           <w:sz w:val="12"/>
         </w:rPr>
-        <w:t>专业参数标明来源；Qwen3-8B 不是验证器；Linux/macOS 未宣称实测。</w:t>
+        <w:t>可选字段为空不阻断；模型不是验证器；公共记录与科学结论分层；平台状态如实标注。</w:t>
       </w:r>
       <w:r>
         <w:rPr>
@@ -1418,7 +2115,7 @@
           <w:color w:val="66727D"/>
           <w:sz w:val="12"/>
         </w:rPr>
-        <w:t>约 700 字＋1 表1图。</w:t>
+        <w:t>约 650–750 字＋1 张接口表。</w:t>
       </w:r>
     </w:p>
     <w:p>
@@ -1446,7 +2143,7 @@
     </w:p>
     <w:p>
       <w:pPr>
-        <w:spacing w:after="30"/>
+        <w:spacing w:after="12"/>
       </w:pPr>
       <w:r>
         <w:rPr>
@@ -1454,7 +2151,451 @@
           <w:b w:val="0"/>
           <w:sz w:val="15"/>
         </w:rPr>
-        <w:t>输出一个材料名称不算发现。正向发现必须是条件化、可反驳的结构关系：冻结温压、进料、候选域和指标后，某类组件邻近关系或构型形成稳定可行候选；按预注册方式扰动一个条件，候选集合或可行性发生可解释变化；关系同时通过守恒、来源和专业插件。稳定负结果是同预算下候选均违反同一冻结约束；异常/反例是预期可行候选被守恒、原文或验证器否证；问题修正则是识别 θ、Cθ 与测量表缺失并生成下一次可运行查询。当前演示环境只取得最后一种信号，尚未构成催化发现。</w:t>
+        <w:t>材料名称或排序首位不算发现。发现信号必须在运行前写明，并允许被来源冲突、条件扰动或专业验证器否证。</w:t>
+      </w:r>
+    </w:p>
+    <w:tbl>
+      <w:tblPr>
+        <w:tblStyle w:val="TableGrid"/>
+        <w:tblW w:type="auto" w:w="0"/>
+        <w:jc w:val="center"/>
+        <w:tblLayout w:type="fixed"/>
+        <w:tblLook w:firstColumn="1" w:firstRow="1" w:lastColumn="0" w:lastRow="0" w:noHBand="0" w:noVBand="1" w:val="04A0"/>
+      </w:tblPr>
+      <w:tblGrid>
+        <w:gridCol w:w="3496"/>
+        <w:gridCol w:w="3496"/>
+        <w:gridCol w:w="3496"/>
+      </w:tblGrid>
+      <w:tr>
+        <w:trPr>
+          <w:cantSplit/>
+        </w:trPr>
+        <w:tc>
+          <w:tcPr>
+            <w:tcW w:type="dxa" w:w="1276"/>
+            <w:vAlign w:val="center"/>
+            <w:tcMar>
+              <w:top w:w="32" w:type="dxa"/>
+              <w:start w:w="55" w:type="dxa"/>
+              <w:bottom w:w="32" w:type="dxa"/>
+              <w:end w:w="55" w:type="dxa"/>
+            </w:tcMar>
+            <w:shd w:fill="0D2538"/>
+          </w:tcPr>
+          <w:p>
+            <w:pPr>
+              <w:spacing w:after="0"/>
+            </w:pPr>
+            <w:r>
+              <w:rPr>
+                <w:rFonts w:ascii="Microsoft YaHei" w:hAnsi="Microsoft YaHei" w:eastAsia="Microsoft YaHei"/>
+                <w:b/>
+                <w:color w:val="FFFFFF"/>
+                <w:sz w:val="12"/>
+              </w:rPr>
+              <w:t>信号</w:t>
+            </w:r>
+          </w:p>
+        </w:tc>
+        <w:tc>
+          <w:tcPr>
+            <w:tcW w:type="dxa" w:w="5726"/>
+            <w:vAlign w:val="center"/>
+            <w:tcMar>
+              <w:top w:w="32" w:type="dxa"/>
+              <w:start w:w="55" w:type="dxa"/>
+              <w:bottom w:w="32" w:type="dxa"/>
+              <w:end w:w="55" w:type="dxa"/>
+            </w:tcMar>
+            <w:shd w:fill="0D2538"/>
+          </w:tcPr>
+          <w:p>
+            <w:pPr>
+              <w:spacing w:after="0"/>
+            </w:pPr>
+            <w:r>
+              <w:rPr>
+                <w:rFonts w:ascii="Microsoft YaHei" w:hAnsi="Microsoft YaHei" w:eastAsia="Microsoft YaHei"/>
+                <w:b/>
+                <w:color w:val="FFFFFF"/>
+                <w:sz w:val="12"/>
+              </w:rPr>
+              <w:t>可操作定义</w:t>
+            </w:r>
+          </w:p>
+        </w:tc>
+        <w:tc>
+          <w:tcPr>
+            <w:tcW w:type="dxa" w:w="3373"/>
+            <w:vAlign w:val="center"/>
+            <w:tcMar>
+              <w:top w:w="32" w:type="dxa"/>
+              <w:start w:w="55" w:type="dxa"/>
+              <w:bottom w:w="32" w:type="dxa"/>
+              <w:end w:w="55" w:type="dxa"/>
+            </w:tcMar>
+            <w:shd w:fill="0D2538"/>
+          </w:tcPr>
+          <w:p>
+            <w:pPr>
+              <w:spacing w:after="0"/>
+            </w:pPr>
+            <w:r>
+              <w:rPr>
+                <w:rFonts w:ascii="Microsoft YaHei" w:hAnsi="Microsoft YaHei" w:eastAsia="Microsoft YaHei"/>
+                <w:b/>
+                <w:color w:val="FFFFFF"/>
+                <w:sz w:val="12"/>
+              </w:rPr>
+              <w:t>它改变什么认识</w:t>
+            </w:r>
+          </w:p>
+        </w:tc>
+      </w:tr>
+      <w:tr>
+        <w:trPr>
+          <w:cantSplit/>
+        </w:trPr>
+        <w:tc>
+          <w:tcPr>
+            <w:tcW w:type="dxa" w:w="1276"/>
+            <w:vAlign w:val="center"/>
+            <w:tcMar>
+              <w:top w:w="32" w:type="dxa"/>
+              <w:start w:w="55" w:type="dxa"/>
+              <w:bottom w:w="32" w:type="dxa"/>
+              <w:end w:w="55" w:type="dxa"/>
+            </w:tcMar>
+          </w:tcPr>
+          <w:p>
+            <w:pPr>
+              <w:spacing w:after="0"/>
+            </w:pPr>
+            <w:r>
+              <w:rPr>
+                <w:rFonts w:ascii="Microsoft YaHei" w:hAnsi="Microsoft YaHei" w:eastAsia="Microsoft YaHei"/>
+                <w:b/>
+                <w:sz w:val="12"/>
+              </w:rPr>
+              <w:t>正向发现</w:t>
+            </w:r>
+          </w:p>
+        </w:tc>
+        <w:tc>
+          <w:tcPr>
+            <w:tcW w:type="dxa" w:w="5726"/>
+            <w:vAlign w:val="center"/>
+            <w:tcMar>
+              <w:top w:w="32" w:type="dxa"/>
+              <w:start w:w="55" w:type="dxa"/>
+              <w:bottom w:w="32" w:type="dxa"/>
+              <w:end w:w="55" w:type="dxa"/>
+            </w:tcMar>
+          </w:tcPr>
+          <w:p>
+            <w:pPr>
+              <w:spacing w:after="0"/>
+            </w:pPr>
+            <w:r>
+              <w:rPr>
+                <w:rFonts w:ascii="Microsoft YaHei" w:hAnsi="Microsoft YaHei" w:eastAsia="Microsoft YaHei"/>
+                <w:b w:val="0"/>
+                <w:sz w:val="12"/>
+              </w:rPr>
+              <w:t>同一反应定义与可比能量口径下，至少两个独立来源，或一项原始研究加专业数据库，支持同一几何—能量关系；几何对象范围明确；改预注册检索词后仍出现</w:t>
+            </w:r>
+          </w:p>
+        </w:tc>
+        <w:tc>
+          <w:tcPr>
+            <w:tcW w:type="dxa" w:w="3373"/>
+            <w:vAlign w:val="center"/>
+            <w:tcMar>
+              <w:top w:w="32" w:type="dxa"/>
+              <w:start w:w="55" w:type="dxa"/>
+              <w:bottom w:w="32" w:type="dxa"/>
+              <w:end w:w="55" w:type="dxa"/>
+            </w:tcMar>
+          </w:tcPr>
+          <w:p>
+            <w:pPr>
+              <w:spacing w:after="0"/>
+            </w:pPr>
+            <w:r>
+              <w:rPr>
+                <w:rFonts w:ascii="Microsoft YaHei" w:hAnsi="Microsoft YaHei" w:eastAsia="Microsoft YaHei"/>
+                <w:b w:val="0"/>
+                <w:sz w:val="12"/>
+              </w:rPr>
+              <w:t>得到待专业复核的条件化结构关系；support-only 不算活性位证据</w:t>
+            </w:r>
+          </w:p>
+        </w:tc>
+      </w:tr>
+      <w:tr>
+        <w:trPr>
+          <w:cantSplit/>
+        </w:trPr>
+        <w:tc>
+          <w:tcPr>
+            <w:tcW w:type="dxa" w:w="1276"/>
+            <w:vAlign w:val="center"/>
+            <w:tcMar>
+              <w:top w:w="32" w:type="dxa"/>
+              <w:start w:w="55" w:type="dxa"/>
+              <w:bottom w:w="32" w:type="dxa"/>
+              <w:end w:w="55" w:type="dxa"/>
+            </w:tcMar>
+            <w:shd w:fill="F7F8F7"/>
+          </w:tcPr>
+          <w:p>
+            <w:pPr>
+              <w:spacing w:after="0"/>
+            </w:pPr>
+            <w:r>
+              <w:rPr>
+                <w:rFonts w:ascii="Microsoft YaHei" w:hAnsi="Microsoft YaHei" w:eastAsia="Microsoft YaHei"/>
+                <w:b/>
+                <w:sz w:val="12"/>
+              </w:rPr>
+              <w:t>稳定负结果</w:t>
+            </w:r>
+          </w:p>
+        </w:tc>
+        <w:tc>
+          <w:tcPr>
+            <w:tcW w:type="dxa" w:w="5726"/>
+            <w:vAlign w:val="center"/>
+            <w:tcMar>
+              <w:top w:w="32" w:type="dxa"/>
+              <w:start w:w="55" w:type="dxa"/>
+              <w:bottom w:w="32" w:type="dxa"/>
+              <w:end w:w="55" w:type="dxa"/>
+            </w:tcMar>
+            <w:shd w:fill="F7F8F7"/>
+          </w:tcPr>
+          <w:p>
+            <w:pPr>
+              <w:spacing w:after="0"/>
+            </w:pPr>
+            <w:r>
+              <w:rPr>
+                <w:rFonts w:ascii="Microsoft YaHei" w:hAnsi="Microsoft YaHei" w:eastAsia="Microsoft YaHei"/>
+                <w:b w:val="0"/>
+                <w:sz w:val="12"/>
+              </w:rPr>
+              <w:t>八次预注册接口调用均没有能量—几何联合字段</w:t>
+            </w:r>
+          </w:p>
+        </w:tc>
+        <w:tc>
+          <w:tcPr>
+            <w:tcW w:type="dxa" w:w="3373"/>
+            <w:vAlign w:val="center"/>
+            <w:tcMar>
+              <w:top w:w="32" w:type="dxa"/>
+              <w:start w:w="55" w:type="dxa"/>
+              <w:bottom w:w="32" w:type="dxa"/>
+              <w:end w:w="55" w:type="dxa"/>
+            </w:tcMar>
+            <w:shd w:fill="F7F8F7"/>
+          </w:tcPr>
+          <w:p>
+            <w:pPr>
+              <w:spacing w:after="0"/>
+            </w:pPr>
+            <w:r>
+              <w:rPr>
+                <w:rFonts w:ascii="Microsoft YaHei" w:hAnsi="Microsoft YaHei" w:eastAsia="Microsoft YaHei"/>
+                <w:b w:val="0"/>
+                <w:sz w:val="12"/>
+              </w:rPr>
+              <w:t>只说明当前数据覆盖不足，不说明领域不存在</w:t>
+            </w:r>
+          </w:p>
+        </w:tc>
+      </w:tr>
+      <w:tr>
+        <w:trPr>
+          <w:cantSplit/>
+        </w:trPr>
+        <w:tc>
+          <w:tcPr>
+            <w:tcW w:type="dxa" w:w="1276"/>
+            <w:vAlign w:val="center"/>
+            <w:tcMar>
+              <w:top w:w="32" w:type="dxa"/>
+              <w:start w:w="55" w:type="dxa"/>
+              <w:bottom w:w="32" w:type="dxa"/>
+              <w:end w:w="55" w:type="dxa"/>
+            </w:tcMar>
+          </w:tcPr>
+          <w:p>
+            <w:pPr>
+              <w:spacing w:after="0"/>
+            </w:pPr>
+            <w:r>
+              <w:rPr>
+                <w:rFonts w:ascii="Microsoft YaHei" w:hAnsi="Microsoft YaHei" w:eastAsia="Microsoft YaHei"/>
+                <w:b/>
+                <w:sz w:val="12"/>
+              </w:rPr>
+              <w:t>异常／反例</w:t>
+            </w:r>
+          </w:p>
+        </w:tc>
+        <w:tc>
+          <w:tcPr>
+            <w:tcW w:type="dxa" w:w="5726"/>
+            <w:vAlign w:val="center"/>
+            <w:tcMar>
+              <w:top w:w="32" w:type="dxa"/>
+              <w:start w:w="55" w:type="dxa"/>
+              <w:bottom w:w="32" w:type="dxa"/>
+              <w:end w:w="55" w:type="dxa"/>
+            </w:tcMar>
+          </w:tcPr>
+          <w:p>
+            <w:pPr>
+              <w:spacing w:after="0"/>
+            </w:pPr>
+            <w:r>
+              <w:rPr>
+                <w:rFonts w:ascii="Microsoft YaHei" w:hAnsi="Microsoft YaHei" w:eastAsia="Microsoft YaHei"/>
+                <w:b w:val="0"/>
+                <w:sz w:val="12"/>
+              </w:rPr>
+              <w:t>同一候选的能量符号、单位、定义、参考态或结构标识在来源间冲突</w:t>
+            </w:r>
+          </w:p>
+        </w:tc>
+        <w:tc>
+          <w:tcPr>
+            <w:tcW w:type="dxa" w:w="3373"/>
+            <w:vAlign w:val="center"/>
+            <w:tcMar>
+              <w:top w:w="32" w:type="dxa"/>
+              <w:start w:w="55" w:type="dxa"/>
+              <w:bottom w:w="32" w:type="dxa"/>
+              <w:end w:w="55" w:type="dxa"/>
+            </w:tcMar>
+          </w:tcPr>
+          <w:p>
+            <w:pPr>
+              <w:spacing w:after="0"/>
+            </w:pPr>
+            <w:r>
+              <w:rPr>
+                <w:rFonts w:ascii="Microsoft YaHei" w:hAnsi="Microsoft YaHei" w:eastAsia="Microsoft YaHei"/>
+                <w:b w:val="0"/>
+                <w:sz w:val="12"/>
+              </w:rPr>
+              <w:t>停止合并，保留两侧原文并缩小口径</w:t>
+            </w:r>
+          </w:p>
+        </w:tc>
+      </w:tr>
+      <w:tr>
+        <w:trPr>
+          <w:cantSplit/>
+        </w:trPr>
+        <w:tc>
+          <w:tcPr>
+            <w:tcW w:type="dxa" w:w="1276"/>
+            <w:vAlign w:val="center"/>
+            <w:tcMar>
+              <w:top w:w="32" w:type="dxa"/>
+              <w:start w:w="55" w:type="dxa"/>
+              <w:bottom w:w="32" w:type="dxa"/>
+              <w:end w:w="55" w:type="dxa"/>
+            </w:tcMar>
+            <w:shd w:fill="F7F8F7"/>
+          </w:tcPr>
+          <w:p>
+            <w:pPr>
+              <w:spacing w:after="0"/>
+            </w:pPr>
+            <w:r>
+              <w:rPr>
+                <w:rFonts w:ascii="Microsoft YaHei" w:hAnsi="Microsoft YaHei" w:eastAsia="Microsoft YaHei"/>
+                <w:b/>
+                <w:sz w:val="12"/>
+              </w:rPr>
+              <w:t>问题修正</w:t>
+            </w:r>
+          </w:p>
+        </w:tc>
+        <w:tc>
+          <w:tcPr>
+            <w:tcW w:type="dxa" w:w="5726"/>
+            <w:vAlign w:val="center"/>
+            <w:tcMar>
+              <w:top w:w="32" w:type="dxa"/>
+              <w:start w:w="55" w:type="dxa"/>
+              <w:bottom w:w="32" w:type="dxa"/>
+              <w:end w:w="55" w:type="dxa"/>
+            </w:tcMar>
+            <w:shd w:fill="F7F8F7"/>
+          </w:tcPr>
+          <w:p>
+            <w:pPr>
+              <w:spacing w:after="0"/>
+            </w:pPr>
+            <w:r>
+              <w:rPr>
+                <w:rFonts w:ascii="Microsoft YaHei" w:hAnsi="Microsoft YaHei" w:eastAsia="Microsoft YaHei"/>
+                <w:b w:val="0"/>
+                <w:sz w:val="12"/>
+              </w:rPr>
+              <w:t>把“性能最佳”改为“固定检索分排序”，或先区分自由能、电子能和势垒</w:t>
+            </w:r>
+          </w:p>
+        </w:tc>
+        <w:tc>
+          <w:tcPr>
+            <w:tcW w:type="dxa" w:w="3373"/>
+            <w:vAlign w:val="center"/>
+            <w:tcMar>
+              <w:top w:w="32" w:type="dxa"/>
+              <w:start w:w="55" w:type="dxa"/>
+              <w:bottom w:w="32" w:type="dxa"/>
+              <w:end w:w="55" w:type="dxa"/>
+            </w:tcMar>
+            <w:shd w:fill="F7F8F7"/>
+          </w:tcPr>
+          <w:p>
+            <w:pPr>
+              <w:spacing w:after="0"/>
+            </w:pPr>
+            <w:r>
+              <w:rPr>
+                <w:rFonts w:ascii="Microsoft YaHei" w:hAnsi="Microsoft YaHei" w:eastAsia="Microsoft YaHei"/>
+                <w:b w:val="0"/>
+                <w:sz w:val="12"/>
+              </w:rPr>
+              <w:t>下一轮改连接器、检索词或几何对象范围</w:t>
+            </w:r>
+          </w:p>
+        </w:tc>
+      </w:tr>
+    </w:tbl>
+    <w:p>
+      <w:pPr>
+        <w:spacing w:after="0" w:line="20" w:lineRule="exact"/>
+      </w:pPr>
+    </w:p>
+    <w:p>
+      <w:pPr>
+        <w:spacing w:after="30"/>
+      </w:pPr>
+      <w:r>
+        <w:rPr>
+          <w:rFonts w:ascii="Microsoft YaHei" w:hAnsi="Microsoft YaHei" w:eastAsia="Microsoft YaHei"/>
+          <w:b w:val="0"/>
+          <w:sz w:val="14"/>
+        </w:rPr>
+        <w:t>当前演示最多取得接口、空值、冲突或问题修正信号，尚未构成催化剂发现。</w:t>
       </w:r>
     </w:p>
     <w:p>
@@ -1476,9 +2617,9 @@
           <w:rFonts w:ascii="Cambria Math" w:hAnsi="Cambria Math" w:eastAsia="Cambria Math"/>
           <w:b w:val="0"/>
           <w:color w:val="0D2538"/>
-          <w:sz w:val="18"/>
+          <w:sz w:val="17"/>
         </w:rPr>
-        <w:t>F(θ)={c∈Cθ : Aν=0, hⱼ(c;θ)=0, qᵢ(c;θ)≤0},   c*∈arg max[c∈F(θ)] J(c;θ)</w:t>
+        <w:t>𝒟q={dᵢ : match(dᵢ,R,P)&gt;0 且 source(dᵢ)≠∅},　cᵢ=record(dᵢ)</w:t>
       </w:r>
     </w:p>
     <w:p>
@@ -1489,9 +2630,9 @@
         <w:rPr>
           <w:rFonts w:ascii="Microsoft YaHei" w:hAnsi="Microsoft YaHei" w:eastAsia="Microsoft YaHei"/>
           <w:b w:val="0"/>
-          <w:sz w:val="15"/>
+          <w:sz w:val="14"/>
         </w:rPr>
-        <w:t>解只可能从冻结后的非空可行域出现：F(θ)=∅ 即无可行解；极值集合含多个元素即非唯一。当目标与约束对某个非平凡群作用不变时，唯一性应在等价类商空间中讨论，或在固定规范后讨论代表元的唯一性。验证依次经过类型/单位、守恒、原文、专业求解器、条件扰动或反例、人工复核；有限采样只算检验。</w:t>
+        <w:t>候选之所以出现，是公共记录与反应物／产物语义匹配，而不是系统证明了性能。@best 只对 𝒟q 应用固定 S(c)，不会生成缺失能量或提升证据层级。验证依次检查能量六元组，检查几何记录标识、坐标来源、节点／边与对象范围；mp-19306 只验证 Fe₃O₄ 体相支撑体，不验证 Pd 活性位。文献另分 DOI、元数据、摘要和正文层级。</w:t>
       </w:r>
     </w:p>
     <w:tbl>
@@ -1532,7 +2673,7 @@
                 <w:rFonts w:ascii="Microsoft YaHei" w:hAnsi="Microsoft YaHei" w:eastAsia="Microsoft YaHei"/>
                 <w:b/>
                 <w:color w:val="FFFFFF"/>
-                <w:sz w:val="13"/>
+                <w:sz w:val="12"/>
               </w:rPr>
               <w:t>参照</w:t>
             </w:r>
@@ -1540,7 +2681,7 @@
         </w:tc>
         <w:tc>
           <w:tcPr>
-            <w:tcW w:type="dxa" w:w="4139"/>
+            <w:tcW w:type="dxa" w:w="4706"/>
             <w:vAlign w:val="center"/>
             <w:tcMar>
               <w:top w:w="32" w:type="dxa"/>
@@ -1559,7 +2700,7 @@
                 <w:rFonts w:ascii="Microsoft YaHei" w:hAnsi="Microsoft YaHei" w:eastAsia="Microsoft YaHei"/>
                 <w:b/>
                 <w:color w:val="FFFFFF"/>
-                <w:sz w:val="13"/>
+                <w:sz w:val="12"/>
               </w:rPr>
               <w:t>同预算操作</w:t>
             </w:r>
@@ -1567,7 +2708,7 @@
         </w:tc>
         <w:tc>
           <w:tcPr>
-            <w:tcW w:type="dxa" w:w="4932"/>
+            <w:tcW w:type="dxa" w:w="4365"/>
             <w:vAlign w:val="center"/>
             <w:tcMar>
               <w:top w:w="32" w:type="dxa"/>
@@ -1586,7 +2727,7 @@
                 <w:rFonts w:ascii="Microsoft YaHei" w:hAnsi="Microsoft YaHei" w:eastAsia="Microsoft YaHei"/>
                 <w:b/>
                 <w:color w:val="FFFFFF"/>
-                <w:sz w:val="13"/>
+                <w:sz w:val="12"/>
               </w:rPr>
               <w:t>比较指标</w:t>
             </w:r>
@@ -1616,7 +2757,7 @@
               <w:rPr>
                 <w:rFonts w:ascii="Microsoft YaHei" w:hAnsi="Microsoft YaHei" w:eastAsia="Microsoft YaHei"/>
                 <w:b/>
-                <w:sz w:val="13"/>
+                <w:sz w:val="12"/>
               </w:rPr>
               <w:t>平凡</w:t>
             </w:r>
@@ -1624,7 +2765,7 @@
         </w:tc>
         <w:tc>
           <w:tcPr>
-            <w:tcW w:type="dxa" w:w="4139"/>
+            <w:tcW w:type="dxa" w:w="4706"/>
             <w:vAlign w:val="center"/>
             <w:tcMar>
               <w:top w:w="32" w:type="dxa"/>
@@ -1641,15 +2782,15 @@
               <w:rPr>
                 <w:rFonts w:ascii="Microsoft YaHei" w:hAnsi="Microsoft YaHei" w:eastAsia="Microsoft YaHei"/>
                 <w:b w:val="0"/>
-                <w:sz w:val="13"/>
+                <w:sz w:val="12"/>
               </w:rPr>
-              <w:t>直接让语言模型回答</w:t>
+              <w:t>直接让语言模型给材料名</w:t>
             </w:r>
           </w:p>
         </w:tc>
         <w:tc>
           <w:tcPr>
-            <w:tcW w:type="dxa" w:w="4932"/>
+            <w:tcW w:type="dxa" w:w="4365"/>
             <w:vAlign w:val="center"/>
             <w:tcMar>
               <w:top w:w="32" w:type="dxa"/>
@@ -1666,9 +2807,9 @@
               <w:rPr>
                 <w:rFonts w:ascii="Microsoft YaHei" w:hAnsi="Microsoft YaHei" w:eastAsia="Microsoft YaHei"/>
                 <w:b w:val="0"/>
-                <w:sz w:val="13"/>
+                <w:sz w:val="12"/>
               </w:rPr>
-              <w:t>类型错误、无来源主张</w:t>
+              <w:t>无来源候选数、虚构能量数、边界措辞</w:t>
             </w:r>
           </w:p>
         </w:tc>
@@ -1697,15 +2838,15 @@
               <w:rPr>
                 <w:rFonts w:ascii="Microsoft YaHei" w:hAnsi="Microsoft YaHei" w:eastAsia="Microsoft YaHei"/>
                 <w:b/>
-                <w:sz w:val="13"/>
+                <w:sz w:val="12"/>
               </w:rPr>
-              <w:t>无干预</w:t>
+              <w:t>随机</w:t>
             </w:r>
           </w:p>
         </w:tc>
         <w:tc>
           <w:tcPr>
-            <w:tcW w:type="dxa" w:w="4139"/>
+            <w:tcW w:type="dxa" w:w="4706"/>
             <w:vAlign w:val="center"/>
             <w:tcMar>
               <w:top w:w="32" w:type="dxa"/>
@@ -1723,15 +2864,15 @@
               <w:rPr>
                 <w:rFonts w:ascii="Microsoft YaHei" w:hAnsi="Microsoft YaHei" w:eastAsia="Microsoft YaHei"/>
                 <w:b w:val="0"/>
-                <w:sz w:val="13"/>
+                <w:sz w:val="12"/>
               </w:rPr>
-              <w:t>不修正输入的关键词检索</w:t>
+              <w:t>随机排列同一批公共记录</w:t>
             </w:r>
           </w:p>
         </w:tc>
         <w:tc>
           <w:tcPr>
-            <w:tcW w:type="dxa" w:w="4932"/>
+            <w:tcW w:type="dxa" w:w="4365"/>
             <w:vAlign w:val="center"/>
             <w:tcMar>
               <w:top w:w="32" w:type="dxa"/>
@@ -1749,9 +2890,9 @@
               <w:rPr>
                 <w:rFonts w:ascii="Microsoft YaHei" w:hAnsi="Microsoft YaHei" w:eastAsia="Microsoft YaHei"/>
                 <w:b w:val="0"/>
-                <w:sz w:val="13"/>
+                <w:sz w:val="12"/>
               </w:rPr>
-              <w:t>是否发现欠定并改变行动</w:t>
+              <w:t>与固定 S(c) 的次序和首位证据完整度比较</w:t>
             </w:r>
           </w:p>
         </w:tc>
@@ -1779,15 +2920,15 @@
               <w:rPr>
                 <w:rFonts w:ascii="Microsoft YaHei" w:hAnsi="Microsoft YaHei" w:eastAsia="Microsoft YaHei"/>
                 <w:b/>
-                <w:sz w:val="13"/>
+                <w:sz w:val="12"/>
               </w:rPr>
-              <w:t>随机</w:t>
+              <w:t>无干预</w:t>
             </w:r>
           </w:p>
         </w:tc>
         <w:tc>
           <w:tcPr>
-            <w:tcW w:type="dxa" w:w="4139"/>
+            <w:tcW w:type="dxa" w:w="4706"/>
             <w:vAlign w:val="center"/>
             <w:tcMar>
               <w:top w:w="32" w:type="dxa"/>
@@ -1804,15 +2945,15 @@
               <w:rPr>
                 <w:rFonts w:ascii="Microsoft YaHei" w:hAnsi="Microsoft YaHei" w:eastAsia="Microsoft YaHei"/>
                 <w:b w:val="0"/>
-                <w:sz w:val="13"/>
+                <w:sz w:val="12"/>
               </w:rPr>
-              <w:t>随机选择基算子或候选</w:t>
+              <w:t>单次关键词检索，不读来源层级</w:t>
             </w:r>
           </w:p>
         </w:tc>
         <w:tc>
           <w:tcPr>
-            <w:tcW w:type="dxa" w:w="4932"/>
+            <w:tcW w:type="dxa" w:w="4365"/>
             <w:vAlign w:val="center"/>
             <w:tcMar>
               <w:top w:w="32" w:type="dxa"/>
@@ -1829,9 +2970,9 @@
               <w:rPr>
                 <w:rFonts w:ascii="Microsoft YaHei" w:hAnsi="Microsoft YaHei" w:eastAsia="Microsoft YaHei"/>
                 <w:b w:val="0"/>
-                <w:sz w:val="13"/>
+                <w:sz w:val="12"/>
               </w:rPr>
-              <w:t>有效反例、正确拒答率</w:t>
+              <w:t>可点击来源数、空值是否保留</w:t>
             </w:r>
           </w:p>
         </w:tc>
@@ -1860,7 +3001,7 @@
               <w:rPr>
                 <w:rFonts w:ascii="Microsoft YaHei" w:hAnsi="Microsoft YaHei" w:eastAsia="Microsoft YaHei"/>
                 <w:b/>
-                <w:sz w:val="13"/>
+                <w:sz w:val="12"/>
               </w:rPr>
               <w:t>非平凡</w:t>
             </w:r>
@@ -1868,7 +3009,7 @@
         </w:tc>
         <w:tc>
           <w:tcPr>
-            <w:tcW w:type="dxa" w:w="4139"/>
+            <w:tcW w:type="dxa" w:w="4706"/>
             <w:vAlign w:val="center"/>
             <w:tcMar>
               <w:top w:w="32" w:type="dxa"/>
@@ -1886,15 +3027,15 @@
               <w:rPr>
                 <w:rFonts w:ascii="Microsoft YaHei" w:hAnsi="Microsoft YaHei" w:eastAsia="Microsoft YaHei"/>
                 <w:b w:val="0"/>
-                <w:sz w:val="13"/>
+                <w:sz w:val="12"/>
               </w:rPr>
-              <w:t>确定性配平＋目标完备性＋结构化检索</w:t>
+              <w:t>确定性合并 DOI／公共元数据并应用固定 S(c)</w:t>
             </w:r>
           </w:p>
         </w:tc>
         <w:tc>
           <w:tcPr>
-            <w:tcW w:type="dxa" w:w="4932"/>
+            <w:tcW w:type="dxa" w:w="4365"/>
             <w:vAlign w:val="center"/>
             <w:tcMar>
               <w:top w:w="32" w:type="dxa"/>
@@ -1912,9 +3053,9 @@
               <w:rPr>
                 <w:rFonts w:ascii="Microsoft YaHei" w:hAnsi="Microsoft YaHei" w:eastAsia="Microsoft YaHei"/>
                 <w:b w:val="0"/>
-                <w:sz w:val="13"/>
+                <w:sz w:val="12"/>
               </w:rPr>
-              <w:t>可复查结论与失败轨迹</w:t>
+              <w:t>重复率、来源覆盖、能量与几何可追溯率</w:t>
             </w:r>
           </w:p>
         </w:tc>
@@ -1936,13 +3077,13 @@
     </w:p>
     <w:p>
       <w:pPr>
-        <w:spacing w:after="16"/>
+        <w:spacing w:after="14"/>
       </w:pPr>
       <w:r>
         <w:rPr>
           <w:rFonts w:ascii="Microsoft YaHei" w:hAnsi="Microsoft YaHei" w:eastAsia="Microsoft YaHei"/>
           <w:b/>
-          <w:sz w:val="15"/>
+          <w:sz w:val="14"/>
         </w:rPr>
         <w:t>环境技术通过：</w:t>
       </w:r>
@@ -1950,20 +3091,40 @@
         <w:rPr>
           <w:rFonts w:ascii="Microsoft YaHei" w:hAnsi="Microsoft YaHei" w:eastAsia="Microsoft YaHei"/>
           <w:b w:val="0"/>
-          <w:sz w:val="15"/>
+          <w:sz w:val="14"/>
         </w:rPr>
-        <w:t>alphaXiv＋DOI 接口快速核验完成，并分层记录 DOI 解析、元数据、摘要和实际打开的正文层级；本地无数值验证器对类型、配平与 Aν=0 零错误通过，且不伪造催化数值；人工终审公式、链接、构型标签和结论边界；至少一次反馈确实改变下一查询、候选域或动作。</w:t>
+        <w:t xml:space="preserve">① DOI 经 Crossref／OpenAlex 核验；alphaXiv 只有认证且 fullText=true 才计入原文读取，否则用 </w:t>
+      </w:r>
+      <w:hyperlink r:id="rId27" w:history="1">
+        <w:r>
+          <w:rPr>
+            <w:rFonts w:ascii="Microsoft YaHei" w:hAnsi="Microsoft YaHei" w:eastAsia="Microsoft YaHei"/>
+            <w:b w:val="0"/>
+            <w:color w:val="245F83"/>
+            <w:sz w:val="14"/>
+            <w:u w:val="single"/>
+          </w:rPr>
+          <w:t>arXiv API</w:t>
+        </w:r>
+      </w:hyperlink>
+      <w:r>
+        <w:rPr>
+          <w:rFonts w:ascii="Microsoft YaHei" w:hAnsi="Microsoft YaHei" w:eastAsia="Microsoft YaHei"/>
+          <w:b w:val="0"/>
+          <w:sz w:val="14"/>
+        </w:rPr>
+        <w:t xml:space="preserve"> 回退；② 本地无数值验证器通过反应物／产物、能量 null、固定 50／25／15／10 排序、mp-19306／support-only、日志结构检查，且不生成催化数值；③ 人工终审链接、公式、字段和结论边界。三关全过且反馈改变下一行动。</w:t>
       </w:r>
     </w:p>
     <w:p>
       <w:pPr>
-        <w:spacing w:after="16"/>
+        <w:spacing w:after="14"/>
       </w:pPr>
       <w:r>
         <w:rPr>
           <w:rFonts w:ascii="Microsoft YaHei" w:hAnsi="Microsoft YaHei" w:eastAsia="Microsoft YaHei"/>
           <w:b/>
-          <w:sz w:val="15"/>
+          <w:sz w:val="14"/>
         </w:rPr>
         <w:t>科学发现通过：</w:t>
       </w:r>
@@ -1971,9 +3132,9 @@
         <w:rPr>
           <w:rFonts w:ascii="Microsoft YaHei" w:hAnsi="Microsoft YaHei" w:eastAsia="Microsoft YaHei"/>
           <w:b w:val="0"/>
-          <w:sz w:val="15"/>
+          <w:sz w:val="14"/>
         </w:rPr>
-        <w:t>冻结 θ、Cθ、J 与预算后，得到确定性基线没有给出的、可复现的条件—结构关系或稳定负结果，并通过预注册扰动与专业验证。当前 @best 仅达到问题修正／接口验证，科学发现闸门未通过。</w:t>
+        <w:t>结果须超过非平凡基线，形成可复现的几何—能量关系，或跨预注册查询稳定复现的数据覆盖负结果，并经专业工具或领域专家核验。当前科学闸门未通过。</w:t>
       </w:r>
     </w:p>
     <w:p>
@@ -1984,49 +3145,9 @@
         <w:rPr>
           <w:rFonts w:ascii="Microsoft YaHei" w:hAnsi="Microsoft YaHei" w:eastAsia="Microsoft YaHei"/>
           <w:b w:val="0"/>
-          <w:sz w:val="15"/>
+          <w:sz w:val="14"/>
         </w:rPr>
-        <w:t>任一情形直接失败：无条件排名；元数据冒充实验结论；示意图冒充弛豫结构；有限采样或 sorry 冒充证明；检索失败冒充“不存在”；反馈不改变动作。条件化试跑若仍只得到标题且不优于确定性基线，就应承认切片不成立并缩小问题。</w:t>
-      </w:r>
-    </w:p>
-    <w:p>
-      <w:pPr>
-        <w:spacing w:before="14" w:after="20"/>
-        <w:jc w:val="center"/>
-      </w:pPr>
-      <w:r>
-        <w:drawing>
-          <wp:inline xmlns:a="http://schemas.openxmlformats.org/drawingml/2006/main" xmlns:pic="http://schemas.openxmlformats.org/drawingml/2006/picture">
-            <wp:extent cx="6336000" cy="2580828"/>
-            <wp:docPr id="3" name="Picture 3"/>
-            <wp:cNvGraphicFramePr>
-              <a:graphicFrameLocks noChangeAspect="1"/>
-            </wp:cNvGraphicFramePr>
-            <a:graphic>
-              <a:graphicData uri="http://schemas.openxmlformats.org/drawingml/2006/picture">
-                <pic:pic>
-                  <pic:nvPicPr>
-                    <pic:cNvPr id="0" name="page3_discovery_gates.png"/>
-                    <pic:cNvPicPr/>
-                  </pic:nvPicPr>
-                  <pic:blipFill>
-                    <a:blip r:embed="rId19"/>
-                    <a:stretch>
-                      <a:fillRect/>
-                    </a:stretch>
-                  </pic:blipFill>
-                  <pic:spPr>
-                    <a:xfrm>
-                      <a:off x="0" y="0"/>
-                      <a:ext cx="6336000" cy="2580828"/>
-                    </a:xfrm>
-                    <a:prstGeom prst="rect"/>
-                  </pic:spPr>
-                </pic:pic>
-              </a:graphicData>
-            </a:graphic>
-          </wp:inline>
-        </w:drawing>
+        <w:t>直接失败：空能量写成零；元数据冒充实验／计算结论；首位记录冒充性能最优；数据库候选冒充发现；支撑体坐标冒充活性位；可选条件缺失便停止；接口不可用写成研究不存在；模型无来源输出进入正式字段；反馈不改变行动。若条件化试跑仍不优于确定性基线，应承认当前切片不成立。</w:t>
       </w:r>
     </w:p>
     <w:p>
@@ -2050,7 +3171,7 @@
           <w:color w:val="66727D"/>
           <w:sz w:val="12"/>
         </w:rPr>
-        <w:t>发现类型、预注册条件、可行域、扰动、四类参照、三道闸门、成功/失败判据。</w:t>
+        <w:t>四类发现信号；能量／几何可比条件；四类参照；技术闸门；科学闸门；失败标准。</w:t>
       </w:r>
       <w:r>
         <w:rPr>
@@ -2070,6 +3191,7 @@
             <w:sz w:val="12"/>
             <w:u w:val="single"/>
           </w:rPr>
+          <w:t>Wang 2021</w:t>
         </w:r>
       </w:hyperlink>
       <w:r>
@@ -2079,7 +3201,91 @@
           <w:color w:val="66727D"/>
           <w:sz w:val="12"/>
         </w:rPr>
-        <w:t>；alphaXiv 读取收据；本地精确内核与浏览器收据。</w:t>
+        <w:t>；</w:t>
+      </w:r>
+      <w:hyperlink r:id="rId24" w:history="1">
+        <w:r>
+          <w:rPr>
+            <w:rFonts w:ascii="Microsoft YaHei" w:hAnsi="Microsoft YaHei" w:eastAsia="Microsoft YaHei"/>
+            <w:b w:val="0"/>
+            <w:color w:val="245F83"/>
+            <w:sz w:val="12"/>
+            <w:u w:val="single"/>
+          </w:rPr>
+          <w:t>Crossref REST API</w:t>
+        </w:r>
+      </w:hyperlink>
+      <w:r>
+        <w:rPr>
+          <w:rFonts w:ascii="Microsoft YaHei" w:hAnsi="Microsoft YaHei" w:eastAsia="Microsoft YaHei"/>
+          <w:b w:val="0"/>
+          <w:color w:val="66727D"/>
+          <w:sz w:val="12"/>
+        </w:rPr>
+        <w:t>；</w:t>
+      </w:r>
+      <w:hyperlink r:id="rId25" w:history="1">
+        <w:r>
+          <w:rPr>
+            <w:rFonts w:ascii="Microsoft YaHei" w:hAnsi="Microsoft YaHei" w:eastAsia="Microsoft YaHei"/>
+            <w:b w:val="0"/>
+            <w:color w:val="245F83"/>
+            <w:sz w:val="12"/>
+            <w:u w:val="single"/>
+          </w:rPr>
+          <w:t>OpenAlex Works API</w:t>
+        </w:r>
+      </w:hyperlink>
+      <w:r>
+        <w:rPr>
+          <w:rFonts w:ascii="Microsoft YaHei" w:hAnsi="Microsoft YaHei" w:eastAsia="Microsoft YaHei"/>
+          <w:b w:val="0"/>
+          <w:color w:val="66727D"/>
+          <w:sz w:val="12"/>
+        </w:rPr>
+        <w:t>；</w:t>
+      </w:r>
+      <w:hyperlink r:id="rId26" w:history="1">
+        <w:r>
+          <w:rPr>
+            <w:rFonts w:ascii="Microsoft YaHei" w:hAnsi="Microsoft YaHei" w:eastAsia="Microsoft YaHei"/>
+            <w:b w:val="0"/>
+            <w:color w:val="245F83"/>
+            <w:sz w:val="12"/>
+            <w:u w:val="single"/>
+          </w:rPr>
+          <w:t>alphaXiv MCP</w:t>
+        </w:r>
+      </w:hyperlink>
+      <w:r>
+        <w:rPr>
+          <w:rFonts w:ascii="Microsoft YaHei" w:hAnsi="Microsoft YaHei" w:eastAsia="Microsoft YaHei"/>
+          <w:b w:val="0"/>
+          <w:color w:val="66727D"/>
+          <w:sz w:val="12"/>
+        </w:rPr>
+        <w:t>；</w:t>
+      </w:r>
+      <w:hyperlink r:id="rId27" w:history="1">
+        <w:r>
+          <w:rPr>
+            <w:rFonts w:ascii="Microsoft YaHei" w:hAnsi="Microsoft YaHei" w:eastAsia="Microsoft YaHei"/>
+            <w:b w:val="0"/>
+            <w:color w:val="245F83"/>
+            <w:sz w:val="12"/>
+            <w:u w:val="single"/>
+          </w:rPr>
+          <w:t>arXiv API</w:t>
+        </w:r>
+      </w:hyperlink>
+      <w:r>
+        <w:rPr>
+          <w:rFonts w:ascii="Microsoft YaHei" w:hAnsi="Microsoft YaHei" w:eastAsia="Microsoft YaHei"/>
+          <w:b w:val="0"/>
+          <w:color w:val="66727D"/>
+          <w:sz w:val="12"/>
+        </w:rPr>
+        <w:t>；本地浏览器与结构检查收据。</w:t>
       </w:r>
       <w:r>
         <w:rPr>
@@ -2097,7 +3303,7 @@
           <w:color w:val="66727D"/>
           <w:sz w:val="12"/>
         </w:rPr>
-        <w:t>四类发现信号与三道核验闸门。</w:t>
+        <w:t>四类发现信号表、四类参照表和文献—本地—人工三级闸门。</w:t>
       </w:r>
       <w:r>
         <w:rPr>
@@ -2115,7 +3321,7 @@
           <w:color w:val="66727D"/>
           <w:sz w:val="12"/>
         </w:rPr>
-        <w:t>保留 ACS 主页面 403、无催化数值模拟、当前无催化发现。</w:t>
+        <w:t>ACS 主页面本轮未读；当前无统一能量数值、性能结论或催化发现。</w:t>
       </w:r>
       <w:r>
         <w:rPr>
@@ -2133,7 +3339,7 @@
           <w:color w:val="66727D"/>
           <w:sz w:val="12"/>
         </w:rPr>
-        <w:t>约 800 字＋1 表1图。</w:t>
+        <w:t>约 750–850 字＋2 张紧凑表。</w:t>
       </w:r>
     </w:p>
     <w:p>
@@ -2169,7 +3375,7 @@
           <w:b w:val="0"/>
           <w:sz w:val="15"/>
         </w:rPr>
-        <w:t>解压后在项目根目录执行同一行命令：</w:t>
+        <w:t>解压后在项目根目录只执行一行：</w:t>
       </w:r>
     </w:p>
     <w:p>
@@ -2195,10 +3401,521 @@
         <w:rPr>
           <w:rFonts w:ascii="Microsoft YaHei" w:hAnsi="Microsoft YaHei" w:eastAsia="Microsoft YaHei"/>
           <w:b w:val="0"/>
-          <w:sz w:val="15"/>
+          <w:sz w:val="14"/>
         </w:rPr>
-        <w:t>浏览器打开终端给出的本地地址，保留默认查询并点击一次“运行”。应看到原输入不守恒、配平方程与 Aν=0、目标因条件和测量缺失而欠定、六个相连空间、未排名文献候选及“示意、未经弛豫”的二维/三维构型。离线检查为 python3 run.py --check。默认启动只用相对路径与 Python 标准库；特定算子的符号分支比较才需要 SymPy。Windows 已实测；Linux/macOS 仍须真实复跑。</w:t>
+        <w:t>浏览器打开终端给出的本地地址，保留 CO2gas+H2gas -- CH3CH2OHgas @best 并点击一次“运行”。本次只验五项；离线结构检查为 python3 run.py --check。Windows v0.6 已实测，Linux／macOS 使用同一入口但仍须实机复跑。</w:t>
       </w:r>
+    </w:p>
+    <w:tbl>
+      <w:tblPr>
+        <w:tblStyle w:val="TableGrid"/>
+        <w:tblW w:type="auto" w:w="0"/>
+        <w:jc w:val="center"/>
+        <w:tblLayout w:type="fixed"/>
+        <w:tblLook w:firstColumn="1" w:firstRow="1" w:lastColumn="0" w:lastRow="0" w:noHBand="0" w:noVBand="1" w:val="04A0"/>
+      </w:tblPr>
+      <w:tblGrid>
+        <w:gridCol w:w="3496"/>
+        <w:gridCol w:w="3496"/>
+        <w:gridCol w:w="3496"/>
+      </w:tblGrid>
+      <w:tr>
+        <w:trPr>
+          <w:cantSplit/>
+        </w:trPr>
+        <w:tc>
+          <w:tcPr>
+            <w:tcW w:type="dxa" w:w="1814"/>
+            <w:vAlign w:val="center"/>
+            <w:tcMar>
+              <w:top w:w="32" w:type="dxa"/>
+              <w:start w:w="55" w:type="dxa"/>
+              <w:bottom w:w="32" w:type="dxa"/>
+              <w:end w:w="55" w:type="dxa"/>
+            </w:tcMar>
+            <w:shd w:fill="0D2538"/>
+          </w:tcPr>
+          <w:p>
+            <w:pPr>
+              <w:spacing w:after="0"/>
+            </w:pPr>
+            <w:r>
+              <w:rPr>
+                <w:rFonts w:ascii="Microsoft YaHei" w:hAnsi="Microsoft YaHei" w:eastAsia="Microsoft YaHei"/>
+                <w:b/>
+                <w:color w:val="FFFFFF"/>
+                <w:sz w:val="12"/>
+              </w:rPr>
+              <w:t>一次试跑检查</w:t>
+            </w:r>
+          </w:p>
+        </w:tc>
+        <w:tc>
+          <w:tcPr>
+            <w:tcW w:type="dxa" w:w="4762"/>
+            <w:vAlign w:val="center"/>
+            <w:tcMar>
+              <w:top w:w="32" w:type="dxa"/>
+              <w:start w:w="55" w:type="dxa"/>
+              <w:bottom w:w="32" w:type="dxa"/>
+              <w:end w:w="55" w:type="dxa"/>
+            </w:tcMar>
+            <w:shd w:fill="0D2538"/>
+          </w:tcPr>
+          <w:p>
+            <w:pPr>
+              <w:spacing w:after="0"/>
+            </w:pPr>
+            <w:r>
+              <w:rPr>
+                <w:rFonts w:ascii="Microsoft YaHei" w:hAnsi="Microsoft YaHei" w:eastAsia="Microsoft YaHei"/>
+                <w:b/>
+                <w:color w:val="FFFFFF"/>
+                <w:sz w:val="12"/>
+              </w:rPr>
+              <w:t>通过表现</w:t>
+            </w:r>
+          </w:p>
+        </w:tc>
+        <w:tc>
+          <w:tcPr>
+            <w:tcW w:type="dxa" w:w="3798"/>
+            <w:vAlign w:val="center"/>
+            <w:tcMar>
+              <w:top w:w="32" w:type="dxa"/>
+              <w:start w:w="55" w:type="dxa"/>
+              <w:bottom w:w="32" w:type="dxa"/>
+              <w:end w:w="55" w:type="dxa"/>
+            </w:tcMar>
+            <w:shd w:fill="0D2538"/>
+          </w:tcPr>
+          <w:p>
+            <w:pPr>
+              <w:spacing w:after="0"/>
+            </w:pPr>
+            <w:r>
+              <w:rPr>
+                <w:rFonts w:ascii="Microsoft YaHei" w:hAnsi="Microsoft YaHei" w:eastAsia="Microsoft YaHei"/>
+                <w:b/>
+                <w:color w:val="FFFFFF"/>
+                <w:sz w:val="12"/>
+              </w:rPr>
+              <w:t>失败时保留</w:t>
+            </w:r>
+          </w:p>
+        </w:tc>
+      </w:tr>
+      <w:tr>
+        <w:trPr>
+          <w:cantSplit/>
+        </w:trPr>
+        <w:tc>
+          <w:tcPr>
+            <w:tcW w:type="dxa" w:w="1814"/>
+            <w:vAlign w:val="center"/>
+            <w:tcMar>
+              <w:top w:w="32" w:type="dxa"/>
+              <w:start w:w="55" w:type="dxa"/>
+              <w:bottom w:w="32" w:type="dxa"/>
+              <w:end w:w="55" w:type="dxa"/>
+            </w:tcMar>
+          </w:tcPr>
+          <w:p>
+            <w:pPr>
+              <w:spacing w:after="0"/>
+            </w:pPr>
+            <w:r>
+              <w:rPr>
+                <w:rFonts w:ascii="Microsoft YaHei" w:hAnsi="Microsoft YaHei" w:eastAsia="Microsoft YaHei"/>
+                <w:b/>
+                <w:sz w:val="12"/>
+              </w:rPr>
+              <w:t>反应物／产物</w:t>
+            </w:r>
+          </w:p>
+        </w:tc>
+        <w:tc>
+          <w:tcPr>
+            <w:tcW w:type="dxa" w:w="4762"/>
+            <w:vAlign w:val="center"/>
+            <w:tcMar>
+              <w:top w:w="32" w:type="dxa"/>
+              <w:start w:w="55" w:type="dxa"/>
+              <w:bottom w:w="32" w:type="dxa"/>
+              <w:end w:w="55" w:type="dxa"/>
+            </w:tcMar>
+          </w:tcPr>
+          <w:p>
+            <w:pPr>
+              <w:spacing w:after="0"/>
+            </w:pPr>
+            <w:r>
+              <w:rPr>
+                <w:rFonts w:ascii="Microsoft YaHei" w:hAnsi="Microsoft YaHei" w:eastAsia="Microsoft YaHei"/>
+                <w:b w:val="0"/>
+                <w:sz w:val="12"/>
+              </w:rPr>
+              <w:t>分别显示 CO₂、H₂ 与 C₂H₅OH</w:t>
+            </w:r>
+          </w:p>
+        </w:tc>
+        <w:tc>
+          <w:tcPr>
+            <w:tcW w:type="dxa" w:w="3798"/>
+            <w:vAlign w:val="center"/>
+            <w:tcMar>
+              <w:top w:w="32" w:type="dxa"/>
+              <w:start w:w="55" w:type="dxa"/>
+              <w:bottom w:w="32" w:type="dxa"/>
+              <w:end w:w="55" w:type="dxa"/>
+            </w:tcMar>
+          </w:tcPr>
+          <w:p>
+            <w:pPr>
+              <w:spacing w:after="0"/>
+            </w:pPr>
+            <w:r>
+              <w:rPr>
+                <w:rFonts w:ascii="Microsoft YaHei" w:hAnsi="Microsoft YaHei" w:eastAsia="Microsoft YaHei"/>
+                <w:b w:val="0"/>
+                <w:sz w:val="12"/>
+              </w:rPr>
+              <w:t>原始输入与解析字段</w:t>
+            </w:r>
+          </w:p>
+        </w:tc>
+      </w:tr>
+      <w:tr>
+        <w:trPr>
+          <w:cantSplit/>
+        </w:trPr>
+        <w:tc>
+          <w:tcPr>
+            <w:tcW w:type="dxa" w:w="1814"/>
+            <w:vAlign w:val="center"/>
+            <w:tcMar>
+              <w:top w:w="32" w:type="dxa"/>
+              <w:start w:w="55" w:type="dxa"/>
+              <w:bottom w:w="32" w:type="dxa"/>
+              <w:end w:w="55" w:type="dxa"/>
+            </w:tcMar>
+            <w:shd w:fill="F7F8F7"/>
+          </w:tcPr>
+          <w:p>
+            <w:pPr>
+              <w:spacing w:after="0"/>
+            </w:pPr>
+            <w:r>
+              <w:rPr>
+                <w:rFonts w:ascii="Microsoft YaHei" w:hAnsi="Microsoft YaHei" w:eastAsia="Microsoft YaHei"/>
+                <w:b/>
+                <w:sz w:val="12"/>
+              </w:rPr>
+              <w:t>反应能量</w:t>
+            </w:r>
+          </w:p>
+        </w:tc>
+        <w:tc>
+          <w:tcPr>
+            <w:tcW w:type="dxa" w:w="4762"/>
+            <w:vAlign w:val="center"/>
+            <w:tcMar>
+              <w:top w:w="32" w:type="dxa"/>
+              <w:start w:w="55" w:type="dxa"/>
+              <w:bottom w:w="32" w:type="dxa"/>
+              <w:end w:w="55" w:type="dxa"/>
+            </w:tcMar>
+            <w:shd w:fill="F7F8F7"/>
+          </w:tcPr>
+          <w:p>
+            <w:pPr>
+              <w:spacing w:after="0"/>
+            </w:pPr>
+            <w:r>
+              <w:rPr>
+                <w:rFonts w:ascii="Microsoft YaHei" w:hAnsi="Microsoft YaHei" w:eastAsia="Microsoft YaHei"/>
+                <w:b w:val="0"/>
+                <w:sz w:val="12"/>
+              </w:rPr>
+              <w:t>未知时显示“—”，内部 v=null</w:t>
+            </w:r>
+          </w:p>
+        </w:tc>
+        <w:tc>
+          <w:tcPr>
+            <w:tcW w:type="dxa" w:w="3798"/>
+            <w:vAlign w:val="center"/>
+            <w:tcMar>
+              <w:top w:w="32" w:type="dxa"/>
+              <w:start w:w="55" w:type="dxa"/>
+              <w:bottom w:w="32" w:type="dxa"/>
+              <w:end w:w="55" w:type="dxa"/>
+            </w:tcMar>
+            <w:shd w:fill="F7F8F7"/>
+          </w:tcPr>
+          <w:p>
+            <w:pPr>
+              <w:spacing w:after="0"/>
+            </w:pPr>
+            <w:r>
+              <w:rPr>
+                <w:rFonts w:ascii="Microsoft YaHei" w:hAnsi="Microsoft YaHei" w:eastAsia="Microsoft YaHei"/>
+                <w:b w:val="0"/>
+                <w:sz w:val="12"/>
+              </w:rPr>
+              <w:t>空值原因</w:t>
+            </w:r>
+          </w:p>
+        </w:tc>
+      </w:tr>
+      <w:tr>
+        <w:trPr>
+          <w:cantSplit/>
+        </w:trPr>
+        <w:tc>
+          <w:tcPr>
+            <w:tcW w:type="dxa" w:w="1814"/>
+            <w:vAlign w:val="center"/>
+            <w:tcMar>
+              <w:top w:w="32" w:type="dxa"/>
+              <w:start w:w="55" w:type="dxa"/>
+              <w:bottom w:w="32" w:type="dxa"/>
+              <w:end w:w="55" w:type="dxa"/>
+            </w:tcMar>
+          </w:tcPr>
+          <w:p>
+            <w:pPr>
+              <w:spacing w:after="0"/>
+            </w:pPr>
+            <w:r>
+              <w:rPr>
+                <w:rFonts w:ascii="Microsoft YaHei" w:hAnsi="Microsoft YaHei" w:eastAsia="Microsoft YaHei"/>
+                <w:b/>
+                <w:sz w:val="12"/>
+              </w:rPr>
+              <w:t>候选来源</w:t>
+            </w:r>
+          </w:p>
+        </w:tc>
+        <w:tc>
+          <w:tcPr>
+            <w:tcW w:type="dxa" w:w="4762"/>
+            <w:vAlign w:val="center"/>
+            <w:tcMar>
+              <w:top w:w="32" w:type="dxa"/>
+              <w:start w:w="55" w:type="dxa"/>
+              <w:bottom w:w="32" w:type="dxa"/>
+              <w:end w:w="55" w:type="dxa"/>
+            </w:tcMar>
+          </w:tcPr>
+          <w:p>
+            <w:pPr>
+              <w:spacing w:after="0"/>
+            </w:pPr>
+            <w:r>
+              <w:rPr>
+                <w:rFonts w:ascii="Microsoft YaHei" w:hAnsi="Microsoft YaHei" w:eastAsia="Microsoft YaHei"/>
+                <w:b w:val="0"/>
+                <w:sz w:val="12"/>
+              </w:rPr>
+              <w:t>五条可点击记录及证据层级</w:t>
+            </w:r>
+          </w:p>
+        </w:tc>
+        <w:tc>
+          <w:tcPr>
+            <w:tcW w:type="dxa" w:w="3798"/>
+            <w:vAlign w:val="center"/>
+            <w:tcMar>
+              <w:top w:w="32" w:type="dxa"/>
+              <w:start w:w="55" w:type="dxa"/>
+              <w:bottom w:w="32" w:type="dxa"/>
+              <w:end w:w="55" w:type="dxa"/>
+            </w:tcMar>
+          </w:tcPr>
+          <w:p>
+            <w:pPr>
+              <w:spacing w:after="0"/>
+            </w:pPr>
+            <w:r>
+              <w:rPr>
+                <w:rFonts w:ascii="Microsoft YaHei" w:hAnsi="Microsoft YaHei" w:eastAsia="Microsoft YaHei"/>
+                <w:b w:val="0"/>
+                <w:sz w:val="12"/>
+              </w:rPr>
+              <w:t>接口状态与原字段</w:t>
+            </w:r>
+          </w:p>
+        </w:tc>
+      </w:tr>
+      <w:tr>
+        <w:trPr>
+          <w:cantSplit/>
+        </w:trPr>
+        <w:tc>
+          <w:tcPr>
+            <w:tcW w:type="dxa" w:w="1814"/>
+            <w:vAlign w:val="center"/>
+            <w:tcMar>
+              <w:top w:w="32" w:type="dxa"/>
+              <w:start w:w="55" w:type="dxa"/>
+              <w:bottom w:w="32" w:type="dxa"/>
+              <w:end w:w="55" w:type="dxa"/>
+            </w:tcMar>
+            <w:shd w:fill="F7F8F7"/>
+          </w:tcPr>
+          <w:p>
+            <w:pPr>
+              <w:spacing w:after="0"/>
+            </w:pPr>
+            <w:r>
+              <w:rPr>
+                <w:rFonts w:ascii="Microsoft YaHei" w:hAnsi="Microsoft YaHei" w:eastAsia="Microsoft YaHei"/>
+                <w:b/>
+                <w:sz w:val="12"/>
+              </w:rPr>
+              <w:t>@best</w:t>
+            </w:r>
+          </w:p>
+        </w:tc>
+        <w:tc>
+          <w:tcPr>
+            <w:tcW w:type="dxa" w:w="4762"/>
+            <w:vAlign w:val="center"/>
+            <w:tcMar>
+              <w:top w:w="32" w:type="dxa"/>
+              <w:start w:w="55" w:type="dxa"/>
+              <w:bottom w:w="32" w:type="dxa"/>
+              <w:end w:w="55" w:type="dxa"/>
+            </w:tcMar>
+            <w:shd w:fill="F7F8F7"/>
+          </w:tcPr>
+          <w:p>
+            <w:pPr>
+              <w:spacing w:after="0"/>
+            </w:pPr>
+            <w:r>
+              <w:rPr>
+                <w:rFonts w:ascii="Microsoft YaHei" w:hAnsi="Microsoft YaHei" w:eastAsia="Microsoft YaHei"/>
+                <w:b w:val="0"/>
+                <w:sz w:val="12"/>
+              </w:rPr>
+              <w:t>严格按 50／25／15／10 固定分只改变次序</w:t>
+            </w:r>
+          </w:p>
+        </w:tc>
+        <w:tc>
+          <w:tcPr>
+            <w:tcW w:type="dxa" w:w="3798"/>
+            <w:vAlign w:val="center"/>
+            <w:tcMar>
+              <w:top w:w="32" w:type="dxa"/>
+              <w:start w:w="55" w:type="dxa"/>
+              <w:bottom w:w="32" w:type="dxa"/>
+              <w:end w:w="55" w:type="dxa"/>
+            </w:tcMar>
+            <w:shd w:fill="F7F8F7"/>
+          </w:tcPr>
+          <w:p>
+            <w:pPr>
+              <w:spacing w:after="0"/>
+            </w:pPr>
+            <w:r>
+              <w:rPr>
+                <w:rFonts w:ascii="Microsoft YaHei" w:hAnsi="Microsoft YaHei" w:eastAsia="Microsoft YaHei"/>
+                <w:b w:val="0"/>
+                <w:sz w:val="12"/>
+              </w:rPr>
+              <w:t>四项特征与并列记录</w:t>
+            </w:r>
+          </w:p>
+        </w:tc>
+      </w:tr>
+      <w:tr>
+        <w:trPr>
+          <w:cantSplit/>
+        </w:trPr>
+        <w:tc>
+          <w:tcPr>
+            <w:tcW w:type="dxa" w:w="1814"/>
+            <w:vAlign w:val="center"/>
+            <w:tcMar>
+              <w:top w:w="32" w:type="dxa"/>
+              <w:start w:w="55" w:type="dxa"/>
+              <w:bottom w:w="32" w:type="dxa"/>
+              <w:end w:w="55" w:type="dxa"/>
+            </w:tcMar>
+          </w:tcPr>
+          <w:p>
+            <w:pPr>
+              <w:spacing w:after="0"/>
+            </w:pPr>
+            <w:r>
+              <w:rPr>
+                <w:rFonts w:ascii="Microsoft YaHei" w:hAnsi="Microsoft YaHei" w:eastAsia="Microsoft YaHei"/>
+                <w:b/>
+                <w:sz w:val="12"/>
+              </w:rPr>
+              <w:t>二维／三维</w:t>
+            </w:r>
+          </w:p>
+        </w:tc>
+        <w:tc>
+          <w:tcPr>
+            <w:tcW w:type="dxa" w:w="4762"/>
+            <w:vAlign w:val="center"/>
+            <w:tcMar>
+              <w:top w:w="32" w:type="dxa"/>
+              <w:start w:w="55" w:type="dxa"/>
+              <w:bottom w:w="32" w:type="dxa"/>
+              <w:end w:w="55" w:type="dxa"/>
+            </w:tcMar>
+          </w:tcPr>
+          <w:p>
+            <w:pPr>
+              <w:spacing w:after="0"/>
+            </w:pPr>
+            <w:r>
+              <w:rPr>
+                <w:rFonts w:ascii="Microsoft YaHei" w:hAnsi="Microsoft YaHei" w:eastAsia="Microsoft YaHei"/>
+                <w:b w:val="0"/>
+                <w:sz w:val="12"/>
+              </w:rPr>
+              <w:t>mp-19306 Fe₃O₄；support-only</w:t>
+            </w:r>
+          </w:p>
+        </w:tc>
+        <w:tc>
+          <w:tcPr>
+            <w:tcW w:type="dxa" w:w="3798"/>
+            <w:vAlign w:val="center"/>
+            <w:tcMar>
+              <w:top w:w="32" w:type="dxa"/>
+              <w:start w:w="55" w:type="dxa"/>
+              <w:bottom w:w="32" w:type="dxa"/>
+              <w:end w:w="55" w:type="dxa"/>
+            </w:tcMar>
+          </w:tcPr>
+          <w:p>
+            <w:pPr>
+              <w:spacing w:after="0"/>
+            </w:pPr>
+            <w:r>
+              <w:rPr>
+                <w:rFonts w:ascii="Microsoft YaHei" w:hAnsi="Microsoft YaHei" w:eastAsia="Microsoft YaHei"/>
+                <w:b w:val="0"/>
+                <w:sz w:val="12"/>
+              </w:rPr>
+              <w:t>不得改写为 Pd 活性位</w:t>
+            </w:r>
+          </w:p>
+        </w:tc>
+      </w:tr>
+    </w:tbl>
+    <w:p>
+      <w:pPr>
+        <w:spacing w:after="0" w:line="20" w:lineRule="exact"/>
+      </w:pPr>
     </w:p>
     <w:p>
       <w:pPr>
@@ -2217,9 +3934,50 @@
         <w:rPr>
           <w:rFonts w:ascii="Microsoft YaHei" w:hAnsi="Microsoft YaHei" w:eastAsia="Microsoft YaHei"/>
           <w:b w:val="0"/>
-          <w:sz w:val="15"/>
+          <w:sz w:val="14"/>
         </w:rPr>
-        <w:t>核心风险不是报错，而是失败后仍生成可信语气。系统实行“拒绝冒充性失败”：配平失败不排名；条件欠定不输出最佳；仅有元数据不推断实验性能；无坐标只画示意；数值一致不声称形式证明；含占位符只返回部分形式化。本地参数化记录使用 p mod k，旧 Lean 原型却固定为 p mod 10 且最终命题仍含 sorry；因此，对 k≠10 的整齐输出也不能支持原问题。模型超时、接口受限、文献矛盾和几何失败均须保存触发字段、原始状态与下一修复动作。</w:t>
+        <w:t>首要风险是用可信语气覆盖空值或对象范围。能量缺定义或来源时只显示“—”；元数据不生成活性或机理；首位记录不改写成性能最佳；mp-19306 只显示为 Fe₃O₄ 体相支撑体，不补画 Pd 活性位；接口超时与来源矛盾保留原状态。模型生成的 DOI、数值或结构标识，未打开原始页面前一律待核验。</w:t>
+      </w:r>
+    </w:p>
+    <w:p>
+      <w:pPr>
+        <w:spacing w:after="30"/>
+      </w:pPr>
+      <w:r>
+        <w:rPr>
+          <w:rFonts w:ascii="Microsoft YaHei" w:hAnsi="Microsoft YaHei" w:eastAsia="Microsoft YaHei"/>
+          <w:b w:val="0"/>
+          <w:sz w:val="14"/>
+        </w:rPr>
+        <w:t>数学面板独立调试特定基算子与迭代；数值点上一致不等于函数恒等，含 sorry 或额外公理的 Lean 文件不等于完成证明。该算子不处理反应能量或催化剂坐标，也不代表统一代数。</w:t>
+      </w:r>
+    </w:p>
+    <w:p>
+      <w:pPr>
+        <w:spacing w:before="16" w:after="28"/>
+        <w:jc w:val="center"/>
+      </w:pPr>
+      <w:r>
+        <w:rPr>
+          <w:rFonts w:ascii="Cambria Math" w:hAnsi="Cambria Math" w:eastAsia="Cambria Math"/>
+          <w:b w:val="0"/>
+          <w:color w:val="0D2538"/>
+          <w:sz w:val="17"/>
+        </w:rPr>
+        <w:t>B: ℂ×ℂ^×→ℂ,　B(u,v)=eᵘ−Log(v),　E(x)=B(1,B(B(1,x),1))</w:t>
+      </w:r>
+    </w:p>
+    <w:p>
+      <w:pPr>
+        <w:spacing w:after="30"/>
+      </w:pPr>
+      <w:r>
+        <w:rPr>
+          <w:rFonts w:ascii="Microsoft YaHei" w:hAnsi="Microsoft YaHei" w:eastAsia="Microsoft YaHei"/>
+          <w:b w:val="0"/>
+          <w:sz w:val="14"/>
+        </w:rPr>
+        <w:t>约定主值复对数且每个 B 节点的第二参数非零；若测试点给出反例，界面保留“不匹配”，不得改写为成功。</w:t>
       </w:r>
     </w:p>
     <w:p>
@@ -2239,37 +3997,9 @@
         <w:rPr>
           <w:rFonts w:ascii="Microsoft YaHei" w:hAnsi="Microsoft YaHei" w:eastAsia="Microsoft YaHei"/>
           <w:b w:val="0"/>
-          <w:sz w:val="15"/>
-        </w:rPr>
-        <w:t>开源包包含单行入口、冻结查询、特定基算子签名、结果 JSON、事件日志、测试收据、来源链接和源码哈希，不收录论文 PDF。复现截图须显示 Aν=0、J(c;θ) 在 θ/Cθ/测量表冻结前未定义、Gₙ=R³ⁿ/SE(3)，以及六个空间之间的带类型映射。发布前在 Ubuntu 与 macOS 各运行 python3 run.py --check；未实测的平台继续标为未验证。</w:t>
-      </w:r>
-    </w:p>
-    <w:p>
-      <w:pPr>
-        <w:spacing w:before="16" w:after="28"/>
-        <w:jc w:val="center"/>
-      </w:pPr>
-      <w:r>
-        <w:rPr>
-          <w:rFonts w:ascii="Cambria Math" w:hAnsi="Cambria Math" w:eastAsia="Cambria Math"/>
-          <w:b w:val="0"/>
-          <w:color w:val="0D2538"/>
-          <w:sz w:val="17"/>
-        </w:rPr>
-        <w:t>B: ℂ×ℂ^×→ℂ,  B(u,v)=eᵘ−Log(v),  E(x)=B(1, B(B(1,x),1))</w:t>
-      </w:r>
-    </w:p>
-    <w:p>
-      <w:pPr>
-        <w:spacing w:after="20"/>
-      </w:pPr>
-      <w:r>
-        <w:rPr>
-          <w:rFonts w:ascii="Microsoft YaHei" w:hAnsi="Microsoft YaHei" w:eastAsia="Microsoft YaHei"/>
-          <w:b w:val="0"/>
           <w:sz w:val="14"/>
         </w:rPr>
-        <w:t>每个 B 节点都检查第二参数非零，并约定 Arg(v)∈(−π,π]、逐点采用主值复对数。测试 x=−1 时，E(−1)=−iπ 而 Log(−1)=+iπ，故 E(−1)−Log(−1)=−2πi；该反例保留为“不匹配”。这只是特定基算子复合表达树，不代表统一代数。</w:t>
+        <w:t>开源包保存冻结查询、R/P JSON、能量六元组与空值原因、候选标识、固定排序特征、mp-19306 来源及 support-only 范围、事件日志、链接、测试收据和源码哈希，不收录论文 PDF。复现画面必须显示 q↦(R,P,E,C,G,L)、函数空间 B:ℂ×ℂ^×→ℂ、复合树、反例和 Lean 状态。发布前在 Ubuntu 与 macOS 运行 python3 run.py --check；未通过的平台继续标为“未验证”。</w:t>
       </w:r>
     </w:p>
     <w:p>
@@ -2280,8 +4010,8 @@
       <w:r>
         <w:drawing>
           <wp:inline xmlns:a="http://schemas.openxmlformats.org/drawingml/2006/main" xmlns:pic="http://schemas.openxmlformats.org/drawingml/2006/picture">
-            <wp:extent cx="5400000" cy="4991250"/>
-            <wp:docPr id="4" name="Picture 4"/>
+            <wp:extent cx="3311999" cy="3061299"/>
+            <wp:docPr id="2" name="Picture 2"/>
             <wp:cNvGraphicFramePr>
               <a:graphicFrameLocks noChangeAspect="1"/>
             </wp:cNvGraphicFramePr>
@@ -2293,7 +4023,7 @@
                     <pic:cNvPicPr/>
                   </pic:nvPicPr>
                   <pic:blipFill>
-                    <a:blip r:embed="rId20"/>
+                    <a:blip r:embed="rId28"/>
                     <a:stretch>
                       <a:fillRect/>
                     </a:stretch>
@@ -2301,7 +4031,7 @@
                   <pic:spPr>
                     <a:xfrm>
                       <a:off x="0" y="0"/>
-                      <a:ext cx="5400000" cy="4991250"/>
+                      <a:ext cx="3311999" cy="3061299"/>
                     </a:xfrm>
                     <a:prstGeom prst="rect"/>
                   </pic:spPr>
@@ -2333,7 +4063,7 @@
           <w:color w:val="66727D"/>
           <w:sz w:val="12"/>
         </w:rPr>
-        <w:t>单行命令、冻结输入、预期输出、拒绝冒充规则、平台状态、源码/日志哈希、开源边界。</w:t>
+        <w:t>单行命令；冻结输入；五项输出；空值与风险状态；平台状态；源码／日志哈希；开源边界。</w:t>
       </w:r>
       <w:r>
         <w:rPr>
@@ -2344,7 +4074,7 @@
         </w:rPr>
         <w:t xml:space="preserve">  文献依据：</w:t>
       </w:r>
-      <w:hyperlink r:id="rId11" w:history="1">
+      <w:hyperlink r:id="rId10" w:history="1">
         <w:r>
           <w:rPr>
             <w:rFonts w:ascii="Microsoft YaHei" w:hAnsi="Microsoft YaHei" w:eastAsia="Microsoft YaHei"/>
@@ -2353,6 +4083,7 @@
             <w:sz w:val="12"/>
             <w:u w:val="single"/>
           </w:rPr>
+          <w:t>Wang 2021</w:t>
         </w:r>
       </w:hyperlink>
       <w:r>
@@ -2362,7 +4093,28 @@
           <w:color w:val="66727D"/>
           <w:sz w:val="12"/>
         </w:rPr>
-        <w:t>；本地数论生成—否证记录；测试、浏览器与 Lean 收据。</w:t>
+        <w:t>；</w:t>
+      </w:r>
+      <w:hyperlink r:id="rId13" w:history="1">
+        <w:r>
+          <w:rPr>
+            <w:rFonts w:ascii="Microsoft YaHei" w:hAnsi="Microsoft YaHei" w:eastAsia="Microsoft YaHei"/>
+            <w:b w:val="0"/>
+            <w:color w:val="245F83"/>
+            <w:sz w:val="12"/>
+            <w:u w:val="single"/>
+          </w:rPr>
+          <w:t>Kozyra 2021</w:t>
+        </w:r>
+      </w:hyperlink>
+      <w:r>
+        <w:rPr>
+          <w:rFonts w:ascii="Microsoft YaHei" w:hAnsi="Microsoft YaHei" w:eastAsia="Microsoft YaHei"/>
+          <w:b w:val="0"/>
+          <w:color w:val="66727D"/>
+          <w:sz w:val="12"/>
+        </w:rPr>
+        <w:t>；本轮 DOI／alphaXiv、浏览器、结构检查与 Lean 收据。</w:t>
       </w:r>
       <w:r>
         <w:rPr>
@@ -2380,7 +4132,7 @@
           <w:color w:val="66727D"/>
           <w:sz w:val="12"/>
         </w:rPr>
-        <w:t>含 B:ℂ×ℂ^×→ℂ、E(x)=B(1,B(B(1,x),1))、反例和 Lean 状态的工作台截图。</w:t>
+        <w:t>v0.6 实测截图：函数空间、特定基算子复合树、反例与 Lean 状态；化学截图另示 support-only 边界。</w:t>
       </w:r>
       <w:r>
         <w:rPr>
@@ -2398,7 +4150,7 @@
           <w:color w:val="66727D"/>
           <w:sz w:val="12"/>
         </w:rPr>
-        <w:t>核对命令、平台记录、来源跳转、示意标签与提交哈希；不把设计适配写成跨平台实测。</w:t>
+        <w:t>逐项打开来源；核对能量空值、固定排序式与 mp-19306 对象范围；不把设计适配写成跨平台实测。</w:t>
       </w:r>
       <w:r>
         <w:rPr>
@@ -2416,7 +4168,7 @@
           <w:color w:val="66727D"/>
           <w:sz w:val="12"/>
         </w:rPr>
-        <w:t>约 650 字＋1 行命令1图。</w:t>
+        <w:t>约 600–700 字＋1 行命令＋1 表＋1 张实测截图。</w:t>
       </w:r>
     </w:p>
     <w:sectPr>

</xml_diff>

<commit_message>
Validate authenticated research connectors
</commit_message>
<xml_diff>
--- a/GOAI_四页提交稿_Math_Structurer.docx
+++ b/GOAI_四页提交稿_Math_Structurer.docx
@@ -265,7 +265,7 @@
                 <w:b w:val="0"/>
                 <w:sz w:val="13"/>
               </w:rPr>
-              <w:t>交互原型 v0.6；Windows 的单行启动、本地识别、结构检查与浏览器试跑均有通过收据，Linux／macOS 尚未实测。当前无统一口径反应能量、催化性能结论或催化剂发现。</w:t>
+              <w:t>交互原型 v0.6；Windows 启动、浏览器与本地识别通过。2026-08-18 又完成 Materials Project 认证查询和 alphaXiv fullText 抽取；Linux／macOS 未实测。当前无可比反应能量、活性位几何、性能结论或催化发现。</w:t>
             </w:r>
           </w:p>
         </w:tc>
@@ -1223,7 +1223,7 @@
                 <w:b w:val="0"/>
                 <w:sz w:val="11"/>
               </w:rPr>
-              <w:t>初始／弛豫结构、能量与力／最低能体相晶体</w:t>
+              <w:t>初始／弛豫结构／认证体相查询</w:t>
             </w:r>
           </w:p>
         </w:tc>
@@ -1249,7 +1249,7 @@
                 <w:b w:val="0"/>
                 <w:sz w:val="11"/>
               </w:rPr>
-              <w:t>OC20 非完整反应网络；体相结构不是催化界面</w:t>
+              <w:t>MP 实测 200；mp-19306 解析为 mp-aaaabcoo；体相不是活性位</w:t>
             </w:r>
           </w:p>
         </w:tc>
@@ -1434,7 +1434,7 @@
                 <w:b w:val="0"/>
                 <w:sz w:val="11"/>
               </w:rPr>
-              <w:t>认证后 AI 阅读或原文抽取／规范元数据回退</w:t>
+              <w:t>认证原文抽取／规范元数据回退</w:t>
             </w:r>
           </w:p>
         </w:tc>
@@ -1460,7 +1460,7 @@
                 <w:b w:val="0"/>
                 <w:sz w:val="11"/>
               </w:rPr>
-              <w:t>alphaXiv 默认是 AI 中间报告；fullText=true 才请求原文；无认证 401</w:t>
+              <w:t>无认证 401；MCP 与 fullText=true 实测 200；默认 AI 报告仍非原文</w:t>
             </w:r>
           </w:p>
         </w:tc>
@@ -3093,27 +3093,7 @@
           <w:b w:val="0"/>
           <w:sz w:val="14"/>
         </w:rPr>
-        <w:t xml:space="preserve">① DOI 经 Crossref／OpenAlex 核验；alphaXiv 只有认证且 fullText=true 才计入原文读取，否则用 </w:t>
-      </w:r>
-      <w:hyperlink r:id="rId27" w:history="1">
-        <w:r>
-          <w:rPr>
-            <w:rFonts w:ascii="Microsoft YaHei" w:hAnsi="Microsoft YaHei" w:eastAsia="Microsoft YaHei"/>
-            <w:b w:val="0"/>
-            <w:color w:val="245F83"/>
-            <w:sz w:val="14"/>
-            <w:u w:val="single"/>
-          </w:rPr>
-          <w:t>arXiv API</w:t>
-        </w:r>
-      </w:hyperlink>
-      <w:r>
-        <w:rPr>
-          <w:rFonts w:ascii="Microsoft YaHei" w:hAnsi="Microsoft YaHei" w:eastAsia="Microsoft YaHei"/>
-          <w:b w:val="0"/>
-          <w:sz w:val="14"/>
-        </w:rPr>
-        <w:t xml:space="preserve"> 回退；② 本地无数值验证器通过反应物／产物、能量 null、固定 50／25／15／10 排序、mp-19306／support-only、日志结构检查，且不生成催化数值；③ 人工终审链接、公式、字段和结论边界。三关全过且反馈改变下一行动。</w:t>
+        <w:t>① DOI 经 Crossref／OpenAlex 核验，alphaXiv 已在认证且 fullText=true 下完成 arXiv:2408.07818 抽取，只保存长度和哈希；② 本地验证器通过反应物／产物、能量 null、固定 50／25／15／10 排序和 mp-19306／support-only；③ 人工终审链接、公式、字段和结论边界。认证通过不等于科学发现。</w:t>
       </w:r>
     </w:p>
     <w:p>

</xml_diff>